<commit_message>
Add class-diagrams, update doc tools & README
Add a large set of class-diagram mermaid/svg/png assets and supporting documentation, including many new files under docs/02-architecture/diagrams/class-diagrams and related svg/png bundles. Introduce scripts/diagrams/generate_package_family_class_diagrams.py and add README stubs under src/bioetl to improve project navigation. Update docs/00-project/ai agents pandoc helpers: py-doc-bot-2.py now rewrites image links to absolute PNG URIs for DOCX compatibility, uses a temporary markdown file for rendering, and centralizes link-rewrite logic; py-doc-bot-3.py adjusts prefer-svg behavior and improves image rewrite handling and subprocess error formatting. Add a Repository Structure section to the top-level README to document the top-level layout and recommended scope for structural changes.
</commit_message>
<xml_diff>
--- a/docs/02-architecture/diagrams/bundles/architecture.bundle.docx
+++ b/docs/02-architecture/diagrams/bundles/architecture.bundle.docx
@@ -2,7 +2,7 @@
 <file path=word/document.xml><?xml version="1.0" encoding="utf-8"?>
 <w:document xmlns:w="http://schemas.openxmlformats.org/wordprocessingml/2006/main" xmlns:m="http://schemas.openxmlformats.org/officeDocument/2006/math" xmlns:r="http://schemas.openxmlformats.org/officeDocument/2006/relationships" xmlns:o="urn:schemas-microsoft-com:office:office" xmlns:v="urn:schemas-microsoft-com:vml" xmlns:w10="urn:schemas-microsoft-com:office:word" xmlns:a="http://schemas.openxmlformats.org/drawingml/2006/main" xmlns:pic="http://schemas.openxmlformats.org/drawingml/2006/picture" xmlns:wp="http://schemas.openxmlformats.org/drawingml/2006/wordprocessingDrawing">
   <w:body>
-    <w:bookmarkStart w:id="322" w:name="bioetl-architecture-diagrams-bundle"/>
+    <w:bookmarkStart w:id="270" w:name="bioetl-architecture-diagrams-bundle"/>
     <w:p>
       <w:pPr>
         <w:pStyle w:val="Heading1"/>
@@ -20,7 +20,7 @@
         </w:numPr>
       </w:pPr>
       <w:r>
-        <w:t xml:space="preserve">Generated: 2026-03-19T11:24:10</w:t>
+        <w:t xml:space="preserve">Generated: 2026-03-23T10:52:06</w:t>
       </w:r>
     </w:p>
     <w:p>
@@ -35,7 +35,7 @@
         <w:t xml:space="preserve">Diagram count: 52</w:t>
       </w:r>
     </w:p>
-    <w:bookmarkStart w:id="9" w:name="table-of-contents"/>
+    <w:bookmarkStart w:id="269" w:name="table-of-contents"/>
     <w:p>
       <w:pPr>
         <w:pStyle w:val="Heading2"/>
@@ -933,14 +933,15 @@
         <w:br w:type="page"/>
       </w:r>
     </w:p>
-    <w:bookmarkEnd w:id="9"/>
-    <w:bookmarkStart w:id="15" w:name="X21772f0982c6ac87243e50e399b5b19bb1a9534"/>
-    <w:p>
-      <w:pPr>
-        <w:pStyle w:val="Heading2"/>
-      </w:pPr>
-      <w:r>
-        <w:t xml:space="preserve">01-high-level-hexagonal — High-Level Hexagonal Architecture</w:t>
+    <w:p>
+      <w:pPr>
+        <w:pStyle w:val="FirstParagraph"/>
+      </w:pPr>
+      <w:r>
+        <w:t xml:space="preserve"> </w:t>
+      </w:r>
+      <w:r>
+        <w:t xml:space="preserve">## 01-high-level-hexagonal — High-Level Hexagonal Architecture</w:t>
       </w:r>
     </w:p>
     <w:p>
@@ -952,18 +953,18 @@
           <wp:inline>
             <wp:extent cx="5334000" cy="1810799"/>
             <wp:effectExtent b="0" l="0" r="0" t="0"/>
-            <wp:docPr descr="01-high-level-hexagonal" title="" id="11" name="Picture"/>
+            <wp:docPr descr="01-high-level-hexagonal" title="" id="10" name="Picture"/>
             <a:graphic>
               <a:graphicData uri="http://schemas.openxmlformats.org/drawingml/2006/picture">
                 <pic:pic>
                   <pic:nvPicPr>
-                    <pic:cNvPr descr="../architecture/png/01-high-level-hexagonal.png" id="12" name="Picture"/>
+                    <pic:cNvPr descr="file:///E:/g-drive/05_AI/github/BioactivityDataAcquisition2/docs/02-architecture/diagrams/architecture/png/01-high-level-hexagonal.png" id="11" name="Picture"/>
                     <pic:cNvPicPr>
                       <a:picLocks noChangeArrowheads="1" noChangeAspect="1"/>
                     </pic:cNvPicPr>
                   </pic:nvPicPr>
                   <pic:blipFill>
-                    <a:blip r:embed="rId10"/>
+                    <a:blip r:embed="rId9"/>
                     <a:stretch>
                       <a:fillRect/>
                     </a:stretch>
@@ -998,7 +999,7 @@
         <w:t xml:space="preserve">01-high-level-hexagonal</w:t>
       </w:r>
     </w:p>
-    <w:bookmarkStart w:id="13" w:name="описание"/>
+    <w:bookmarkStart w:id="12" w:name="описание"/>
     <w:p>
       <w:pPr>
         <w:pStyle w:val="Heading3"/>
@@ -1012,11 +1013,11 @@
         <w:pStyle w:val="FirstParagraph"/>
       </w:pPr>
       <w:r>
-        <w:t xml:space="preserve">Диаграмма «High-Level Hexagonal Architecture» из architecture-набора детализирует конкретный архитектурный компонент или подсистему BioETL. Она представлена в формате блок-схема потоков (flowchart) и служит ориентиром на уровне детализации «System / Component». В комментариях исходника зафиксирован фокус диаграммы: the Ports &amp; Adapters (Hexagonal) pattern across all layers.. На схеме отражено примерно 46 узлов и 29 связей, поэтому её удобно использовать для проверки влияния изменений, согласования интерфейсов и подготовки рефакторинга. Ключевые блоки/подграфы: External Systems, External APIs, interfaces layer, composition layer, application layer, domain layer (pure, no I/O). Показательные узлы для быстрого чтения: ChEMBL, PubMed, UniProt, PubChem, CrossRef, OpenAlex. Примечание: Decomposed into 01a, 01b, 01c sub-diagrams.</w:t>
-      </w:r>
-    </w:p>
-    <w:bookmarkEnd w:id="13"/>
-    <w:bookmarkStart w:id="14" w:name="метаданные"/>
+        <w:t xml:space="preserve">Диаграмма «High-Level Hexagonal Architecture» из architecture-набора детализирует конкретный архитектурный компонент или подсистему BioETL. Она представлена в формате блок-схема потоков (flowchart) и служит ориентиром на уровне детализации «System / Component». В комментариях исходника зафиксирован фокус диаграммы: the Ports &amp; Adapters (Hexagonal) pattern across all layers.. Схема имеет плотность порядка 46 узлов и 29 связей; её удобно использовать как обзорный архитектурный срез для проверки влияния изменений, согласования интерфейсов и подготовки рефакторинга, но не как исчерпывающий каталог текущей кодовой поверхности. Ключевые блоки/подграфы: External Systems, External APIs, interfaces layer, composition layer, application layer, domain layer (pure, no I/O). Показательные узлы для быстрого чтения: ChEMBL, PubMed, UniProt, PubChem, CrossRef, OpenAlex. Примечание: Decomposed into 01a, 01b, 01c sub-diagrams.</w:t>
+      </w:r>
+    </w:p>
+    <w:bookmarkEnd w:id="12"/>
+    <w:bookmarkStart w:id="16" w:name="метаданные"/>
     <w:p>
       <w:pPr>
         <w:pStyle w:val="Heading3"/>
@@ -1114,15 +1115,15 @@
         <w:br w:type="page"/>
       </w:r>
     </w:p>
-    <w:bookmarkEnd w:id="14"/>
-    <w:bookmarkEnd w:id="15"/>
-    <w:bookmarkStart w:id="21" w:name="a-hexagonal-overview-hexagonal-overview"/>
-    <w:p>
-      <w:pPr>
-        <w:pStyle w:val="Heading2"/>
-      </w:pPr>
-      <w:r>
-        <w:t xml:space="preserve">01a-hexagonal-overview — Hexagonal Overview</w:t>
+    <w:p>
+      <w:pPr>
+        <w:pStyle w:val="FirstParagraph"/>
+      </w:pPr>
+      <w:r>
+        <w:t xml:space="preserve"> </w:t>
+      </w:r>
+      <w:r>
+        <w:t xml:space="preserve">## 01a-hexagonal-overview — Hexagonal Overview</w:t>
       </w:r>
     </w:p>
     <w:p>
@@ -1134,18 +1135,18 @@
           <wp:inline>
             <wp:extent cx="5334000" cy="2934464"/>
             <wp:effectExtent b="0" l="0" r="0" t="0"/>
-            <wp:docPr descr="01a-hexagonal-overview" title="" id="17" name="Picture"/>
+            <wp:docPr descr="01a-hexagonal-overview" title="" id="14" name="Picture"/>
             <a:graphic>
               <a:graphicData uri="http://schemas.openxmlformats.org/drawingml/2006/picture">
                 <pic:pic>
                   <pic:nvPicPr>
-                    <pic:cNvPr descr="../architecture/png/01a-hexagonal-overview.png" id="18" name="Picture"/>
+                    <pic:cNvPr descr="file:///E:/g-drive/05_AI/github/BioactivityDataAcquisition2/docs/02-architecture/diagrams/architecture/png/01a-hexagonal-overview.png" id="15" name="Picture"/>
                     <pic:cNvPicPr>
                       <a:picLocks noChangeArrowheads="1" noChangeAspect="1"/>
                     </pic:cNvPicPr>
                   </pic:nvPicPr>
                   <pic:blipFill>
-                    <a:blip r:embed="rId16"/>
+                    <a:blip r:embed="rId13"/>
                     <a:stretch>
                       <a:fillRect/>
                     </a:stretch>
@@ -1180,7 +1181,8 @@
         <w:t xml:space="preserve">01a-hexagonal-overview</w:t>
       </w:r>
     </w:p>
-    <w:bookmarkStart w:id="19" w:name="описание-1"/>
+    <w:bookmarkEnd w:id="16"/>
+    <w:bookmarkStart w:id="17" w:name="описание-1"/>
     <w:p>
       <w:pPr>
         <w:pStyle w:val="Heading3"/>
@@ -1194,11 +1196,11 @@
         <w:pStyle w:val="FirstParagraph"/>
       </w:pPr>
       <w:r>
-        <w:t xml:space="preserve">Диаграмма «Hexagonal Overview» из architecture-набора детализирует конкретный архитектурный компонент или подсистему BioETL. Она представлена в формате блок-схема потоков (flowchart) и служит ориентиром на уровне детализации «System / Component». В комментариях исходника зафиксирован фокус диаграммы: Covers 5 architectural layers, external systems, and main dependency directions.. На схеме отражено примерно 11 узлов и 14 связей, поэтому её удобно использовать для проверки влияния изменений, согласования интерфейсов и подготовки рефакторинга. Ключевые блоки/подграфы: Interfaces Layer, Composition Layer, Application Layer, Domain Layer, Infrastructure Layer. Показательные узлы для быстрого чтения: CLI Commands (Click), Orchestration, Bootstrap / Assembly, Application Core, Port Protocols, Provider Adapters.</w:t>
-      </w:r>
-    </w:p>
-    <w:bookmarkEnd w:id="19"/>
-    <w:bookmarkStart w:id="20" w:name="метаданные-1"/>
+        <w:t xml:space="preserve">Диаграмма «Hexagonal Overview» из architecture-набора детализирует конкретный архитектурный компонент или подсистему BioETL. Она представлена в формате блок-схема потоков (flowchart) и служит ориентиром на уровне детализации «System / Component». В комментариях исходника зафиксирован фокус диаграммы: Covers 5 architectural layers, external systems, and main dependency directions.. Схема имеет плотность порядка 11 узлов и 14 связей; её удобно использовать как обзорный архитектурный срез для проверки влияния изменений, согласования интерфейсов и подготовки рефакторинга, но не как исчерпывающий каталог текущей кодовой поверхности. Ключевые блоки/подграфы: Interfaces Layer, Composition Layer, Application Layer, Domain Layer, Infrastructure Layer. Показательные узлы для быстрого чтения: CLI Commands (Click), Orchestration, Bootstrap / Assembly, Application Core, Port Protocols, Provider Adapters.</w:t>
+      </w:r>
+    </w:p>
+    <w:bookmarkEnd w:id="17"/>
+    <w:bookmarkStart w:id="21" w:name="метаданные-1"/>
     <w:p>
       <w:pPr>
         <w:pStyle w:val="Heading3"/>
@@ -1296,15 +1298,15 @@
         <w:br w:type="page"/>
       </w:r>
     </w:p>
-    <w:bookmarkEnd w:id="20"/>
-    <w:bookmarkEnd w:id="21"/>
-    <w:bookmarkStart w:id="27" w:name="Xe7b6fb5563d31bf7f01dfc80b4a0a6420d26401"/>
-    <w:p>
-      <w:pPr>
-        <w:pStyle w:val="Heading2"/>
-      </w:pPr>
-      <w:r>
-        <w:t xml:space="preserve">01b-hexagonal-domain-app — Hexagonal Domain and Application</w:t>
+    <w:p>
+      <w:pPr>
+        <w:pStyle w:val="FirstParagraph"/>
+      </w:pPr>
+      <w:r>
+        <w:t xml:space="preserve"> </w:t>
+      </w:r>
+      <w:r>
+        <w:t xml:space="preserve">## 01b-hexagonal-domain-app — Hexagonal Domain and Application</w:t>
       </w:r>
     </w:p>
     <w:p>
@@ -1316,18 +1318,18 @@
           <wp:inline>
             <wp:extent cx="5334000" cy="973247"/>
             <wp:effectExtent b="0" l="0" r="0" t="0"/>
-            <wp:docPr descr="01b-hexagonal-domain-app" title="" id="23" name="Picture"/>
+            <wp:docPr descr="01b-hexagonal-domain-app" title="" id="19" name="Picture"/>
             <a:graphic>
               <a:graphicData uri="http://schemas.openxmlformats.org/drawingml/2006/picture">
                 <pic:pic>
                   <pic:nvPicPr>
-                    <pic:cNvPr descr="../architecture/png/01b-hexagonal-domain-app.png" id="24" name="Picture"/>
+                    <pic:cNvPr descr="file:///E:/g-drive/05_AI/github/BioactivityDataAcquisition2/docs/02-architecture/diagrams/architecture/png/01b-hexagonal-domain-app.png" id="20" name="Picture"/>
                     <pic:cNvPicPr>
                       <a:picLocks noChangeArrowheads="1" noChangeAspect="1"/>
                     </pic:cNvPicPr>
                   </pic:nvPicPr>
                   <pic:blipFill>
-                    <a:blip r:embed="rId22"/>
+                    <a:blip r:embed="rId18"/>
                     <a:stretch>
                       <a:fillRect/>
                     </a:stretch>
@@ -1362,7 +1364,8 @@
         <w:t xml:space="preserve">01b-hexagonal-domain-app</w:t>
       </w:r>
     </w:p>
-    <w:bookmarkStart w:id="25" w:name="описание-2"/>
+    <w:bookmarkEnd w:id="21"/>
+    <w:bookmarkStart w:id="22" w:name="описание-2"/>
     <w:p>
       <w:pPr>
         <w:pStyle w:val="Heading3"/>
@@ -1376,10 +1379,10 @@
         <w:pStyle w:val="FirstParagraph"/>
       </w:pPr>
       <w:r>
-        <w:t xml:space="preserve">Диаграмма «Hexagonal Domain and Application» из architecture-набора детализирует конкретный архитектурный компонент или подсистему BioETL. Она представлена в формате блок-схема потоков (flowchart) и служит ориентиром на уровне детализации «System / Component». В комментариях исходника зафиксирован фокус диаграммы: Covers domain contracts and core application services that depend on them.. На схеме отражено примерно 13 узлов и 7 связей, поэтому её удобно использовать для проверки влияния изменений, согласования интерфейсов и подготовки рефакторинга. Ключевые блоки/подграфы: Application Layer, Domain Layer. Показательные узлы для быстрого чтения: Core (Runner, Executor, Transformer, Writer), Services (DQ, Export, Health, Lifecycle), Composite Pipeline (Coordinator, Merger, FSM), Pipeline Transformers (per provider), PipelineObserver, Port Protocols.</w:t>
-      </w:r>
-    </w:p>
-    <w:bookmarkEnd w:id="25"/>
+        <w:t xml:space="preserve">Диаграмма «Hexagonal Domain and Application» из architecture-набора детализирует конкретный архитектурный компонент или подсистему BioETL. Она представлена в формате блок-схема потоков (flowchart) и служит ориентиром на уровне детализации «System / Component». В комментариях исходника зафиксирован фокус диаграммы: Covers domain contracts and core application services that depend on them.. Схема имеет плотность порядка 13 узлов и 7 связей; её удобно использовать как обзорный архитектурный срез для проверки влияния изменений, согласования интерфейсов и подготовки рефакторинга, но не как исчерпывающий каталог текущей кодовой поверхности. Ключевые блоки/подграфы: Application Layer, Domain Layer. Показательные узлы для быстрого чтения: Core (Runner, Executor, Transformer, Writer), Services (DQ, Export, Health, Lifecycle), Composite Pipeline (Coordinator, Merger, FSM), Pipeline Transformers (per provider), PipelineObserver, Port Protocols.</w:t>
+      </w:r>
+    </w:p>
+    <w:bookmarkEnd w:id="22"/>
     <w:bookmarkStart w:id="26" w:name="метаданные-2"/>
     <w:p>
       <w:pPr>
@@ -1478,15 +1481,15 @@
         <w:br w:type="page"/>
       </w:r>
     </w:p>
-    <w:bookmarkEnd w:id="26"/>
-    <w:bookmarkEnd w:id="27"/>
-    <w:bookmarkStart w:id="33" w:name="X168f95584158179a4aff9e9c3fe1d98fdef7bce"/>
-    <w:p>
-      <w:pPr>
-        <w:pStyle w:val="Heading2"/>
-      </w:pPr>
-      <w:r>
-        <w:t xml:space="preserve">01c-hexagonal-infra-comp — Hexagonal Infrastructure and Composition</w:t>
+    <w:p>
+      <w:pPr>
+        <w:pStyle w:val="FirstParagraph"/>
+      </w:pPr>
+      <w:r>
+        <w:t xml:space="preserve"> </w:t>
+      </w:r>
+      <w:r>
+        <w:t xml:space="preserve">## 01c-hexagonal-infra-comp — Hexagonal Infrastructure and Composition</w:t>
       </w:r>
     </w:p>
     <w:p>
@@ -1498,18 +1501,18 @@
           <wp:inline>
             <wp:extent cx="5334000" cy="1449739"/>
             <wp:effectExtent b="0" l="0" r="0" t="0"/>
-            <wp:docPr descr="01c-hexagonal-infra-comp" title="" id="29" name="Picture"/>
+            <wp:docPr descr="01c-hexagonal-infra-comp" title="" id="24" name="Picture"/>
             <a:graphic>
               <a:graphicData uri="http://schemas.openxmlformats.org/drawingml/2006/picture">
                 <pic:pic>
                   <pic:nvPicPr>
-                    <pic:cNvPr descr="../architecture/png/01c-hexagonal-infra-comp.png" id="30" name="Picture"/>
+                    <pic:cNvPr descr="file:///E:/g-drive/05_AI/github/BioactivityDataAcquisition2/docs/02-architecture/diagrams/architecture/png/01c-hexagonal-infra-comp.png" id="25" name="Picture"/>
                     <pic:cNvPicPr>
                       <a:picLocks noChangeArrowheads="1" noChangeAspect="1"/>
                     </pic:cNvPicPr>
                   </pic:nvPicPr>
                   <pic:blipFill>
-                    <a:blip r:embed="rId28"/>
+                    <a:blip r:embed="rId23"/>
                     <a:stretch>
                       <a:fillRect/>
                     </a:stretch>
@@ -1544,7 +1547,8 @@
         <w:t xml:space="preserve">01c-hexagonal-infra-comp</w:t>
       </w:r>
     </w:p>
-    <w:bookmarkStart w:id="31" w:name="описание-3"/>
+    <w:bookmarkEnd w:id="26"/>
+    <w:bookmarkStart w:id="27" w:name="описание-3"/>
     <w:p>
       <w:pPr>
         <w:pStyle w:val="Heading3"/>
@@ -1558,11 +1562,11 @@
         <w:pStyle w:val="FirstParagraph"/>
       </w:pPr>
       <w:r>
-        <w:t xml:space="preserve">Диаграмма «Hexagonal Infrastructure and Composition» из architecture-набора детализирует конкретный архитектурный компонент или подсистему BioETL. Она представлена в формате блок-схема потоков (flowchart) и служит ориентиром на уровне детализации «System / Component». В комментариях исходника зафиксирован фокус диаграммы: Covers infrastructure adapters and composition-root wiring points.. На схеме отражено примерно 14 узлов и 11 связей, поэтому её удобно использовать для проверки влияния изменений, согласования интерфейсов и подготовки рефакторинга. Ключевые блоки/подграфы: Composition Layer, Infrastructure Layer, Domain Layer. Показательные узлы для быстрого чтения: Bootstrap / Assembly, Factories, Provider Registry, Runtime Builders, HTTP Adapters, Storage.</w:t>
-      </w:r>
-    </w:p>
-    <w:bookmarkEnd w:id="31"/>
-    <w:bookmarkStart w:id="32" w:name="метаданные-3"/>
+        <w:t xml:space="preserve">Диаграмма «Hexagonal Infrastructure and Composition» из architecture-набора детализирует конкретный архитектурный компонент или подсистему BioETL. Она представлена в формате блок-схема потоков (flowchart) и служит ориентиром на уровне детализации «System / Component». В комментариях исходника зафиксирован фокус диаграммы: Covers infrastructure adapters and composition-root wiring points.. Схема имеет плотность порядка 14 узлов и 11 связей; её удобно использовать как обзорный архитектурный срез для проверки влияния изменений, согласования интерфейсов и подготовки рефакторинга, но не как исчерпывающий каталог текущей кодовой поверхности. Ключевые блоки/подграфы: Composition Layer, Infrastructure Layer, Domain Layer. Показательные узлы для быстрого чтения: Bootstrap / Assembly, Factories, Provider Registry, Runtime Builders, HTTP Adapters, Storage.</w:t>
+      </w:r>
+    </w:p>
+    <w:bookmarkEnd w:id="27"/>
+    <w:bookmarkStart w:id="31" w:name="метаданные-3"/>
     <w:p>
       <w:pPr>
         <w:pStyle w:val="Heading3"/>
@@ -1660,15 +1664,15 @@
         <w:br w:type="page"/>
       </w:r>
     </w:p>
-    <w:bookmarkEnd w:id="32"/>
-    <w:bookmarkEnd w:id="33"/>
-    <w:bookmarkStart w:id="39" w:name="X4b432e8487b9c681ffff3b44c6f83ebdc8d8fbf"/>
-    <w:p>
-      <w:pPr>
-        <w:pStyle w:val="Heading2"/>
-      </w:pPr>
-      <w:r>
-        <w:t xml:space="preserve">01d-hexagonal-overview-rounded — Hexagonal Overview (Rounded Nodes)</w:t>
+    <w:p>
+      <w:pPr>
+        <w:pStyle w:val="FirstParagraph"/>
+      </w:pPr>
+      <w:r>
+        <w:t xml:space="preserve"> </w:t>
+      </w:r>
+      <w:r>
+        <w:t xml:space="preserve">## 01d-hexagonal-overview-rounded — Hexagonal Overview (Rounded Nodes)</w:t>
       </w:r>
     </w:p>
     <w:p>
@@ -1680,18 +1684,18 @@
           <wp:inline>
             <wp:extent cx="5334000" cy="2934464"/>
             <wp:effectExtent b="0" l="0" r="0" t="0"/>
-            <wp:docPr descr="01d-hexagonal-overview-rounded" title="" id="35" name="Picture"/>
+            <wp:docPr descr="01d-hexagonal-overview-rounded" title="" id="29" name="Picture"/>
             <a:graphic>
               <a:graphicData uri="http://schemas.openxmlformats.org/drawingml/2006/picture">
                 <pic:pic>
                   <pic:nvPicPr>
-                    <pic:cNvPr descr="../architecture/png/01d-hexagonal-overview-rounded.png" id="36" name="Picture"/>
+                    <pic:cNvPr descr="file:///E:/g-drive/05_AI/github/BioactivityDataAcquisition2/docs/02-architecture/diagrams/architecture/png/01d-hexagonal-overview-rounded.png" id="30" name="Picture"/>
                     <pic:cNvPicPr>
                       <a:picLocks noChangeArrowheads="1" noChangeAspect="1"/>
                     </pic:cNvPicPr>
                   </pic:nvPicPr>
                   <pic:blipFill>
-                    <a:blip r:embed="rId34"/>
+                    <a:blip r:embed="rId28"/>
                     <a:stretch>
                       <a:fillRect/>
                     </a:stretch>
@@ -1726,7 +1730,8 @@
         <w:t xml:space="preserve">01d-hexagonal-overview-rounded</w:t>
       </w:r>
     </w:p>
-    <w:bookmarkStart w:id="37" w:name="описание-4"/>
+    <w:bookmarkEnd w:id="31"/>
+    <w:bookmarkStart w:id="32" w:name="описание-4"/>
     <w:p>
       <w:pPr>
         <w:pStyle w:val="Heading3"/>
@@ -1740,11 +1745,11 @@
         <w:pStyle w:val="FirstParagraph"/>
       </w:pPr>
       <w:r>
-        <w:t xml:space="preserve">Диаграмма «Hexagonal Overview (Rounded Nodes)» из architecture-набора детализирует конкретный архитектурный компонент или подсистему BioETL. Она представлена в формате блок-схема потоков (flowchart) и служит ориентиром на уровне детализации «System / Component». В комментариях исходника зафиксирован фокус диаграммы: Covers 5 architectural layers, external systems, and main dependency directions.. На схеме отражено примерно 11 узлов и 14 связей, поэтому её удобно использовать для проверки влияния изменений, согласования интерфейсов и подготовки рефакторинга. Ключевые блоки/подграфы: Interfaces Layer, Composition Layer, Application Layer, Domain Layer, Infrastructure Layer. Показательные узлы для быстрого чтения: CLI Commands (Click), Orchestration, Bootstrap / Assembly, Application Core, Port Protocols, Provider Adapters.</w:t>
-      </w:r>
-    </w:p>
-    <w:bookmarkEnd w:id="37"/>
-    <w:bookmarkStart w:id="38" w:name="метаданные-4"/>
+        <w:t xml:space="preserve">Диаграмма «Hexagonal Overview (Rounded Nodes)» из architecture-набора детализирует конкретный архитектурный компонент или подсистему BioETL. Она представлена в формате блок-схема потоков (flowchart) и служит ориентиром на уровне детализации «System / Component». В комментариях исходника зафиксирован фокус диаграммы: Covers 5 architectural layers, external systems, and main dependency directions.. Схема имеет плотность порядка 11 узлов и 14 связей; её удобно использовать как обзорный архитектурный срез для проверки влияния изменений, согласования интерфейсов и подготовки рефакторинга, но не как исчерпывающий каталог текущей кодовой поверхности. Ключевые блоки/подграфы: Interfaces Layer, Composition Layer, Application Layer, Domain Layer, Infrastructure Layer. Показательные узлы для быстрого чтения: CLI Commands (Click), Orchestration, Bootstrap / Assembly, Application Core, Port Protocols, Provider Adapters.</w:t>
+      </w:r>
+    </w:p>
+    <w:bookmarkEnd w:id="32"/>
+    <w:bookmarkStart w:id="36" w:name="метаданные-4"/>
     <w:p>
       <w:pPr>
         <w:pStyle w:val="Heading3"/>
@@ -1842,15 +1847,15 @@
         <w:br w:type="page"/>
       </w:r>
     </w:p>
-    <w:bookmarkEnd w:id="38"/>
-    <w:bookmarkEnd w:id="39"/>
-    <w:bookmarkStart w:id="45" w:name="Xd1ffc2acae83c294b2320079ffbd816f0b84c74"/>
-    <w:p>
-      <w:pPr>
-        <w:pStyle w:val="Heading2"/>
-      </w:pPr>
-      <w:r>
-        <w:t xml:space="preserve">02-layer-dependency-matrix — Layer Dependency Matrix (ARCH-001)</w:t>
+    <w:p>
+      <w:pPr>
+        <w:pStyle w:val="FirstParagraph"/>
+      </w:pPr>
+      <w:r>
+        <w:t xml:space="preserve"> </w:t>
+      </w:r>
+      <w:r>
+        <w:t xml:space="preserve">## 02-layer-dependency-matrix — Layer Dependency Matrix (ARCH-001)</w:t>
       </w:r>
     </w:p>
     <w:p>
@@ -1862,18 +1867,18 @@
           <wp:inline>
             <wp:extent cx="5334000" cy="7871218"/>
             <wp:effectExtent b="0" l="0" r="0" t="0"/>
-            <wp:docPr descr="02-layer-dependency-matrix" title="" id="41" name="Picture"/>
+            <wp:docPr descr="02-layer-dependency-matrix" title="" id="34" name="Picture"/>
             <a:graphic>
               <a:graphicData uri="http://schemas.openxmlformats.org/drawingml/2006/picture">
                 <pic:pic>
                   <pic:nvPicPr>
-                    <pic:cNvPr descr="../architecture/png/02-layer-dependency-matrix.png" id="42" name="Picture"/>
+                    <pic:cNvPr descr="file:///E:/g-drive/05_AI/github/BioactivityDataAcquisition2/docs/02-architecture/diagrams/architecture/png/02-layer-dependency-matrix.png" id="35" name="Picture"/>
                     <pic:cNvPicPr>
                       <a:picLocks noChangeArrowheads="1" noChangeAspect="1"/>
                     </pic:cNvPicPr>
                   </pic:nvPicPr>
                   <pic:blipFill>
-                    <a:blip r:embed="rId40"/>
+                    <a:blip r:embed="rId33"/>
                     <a:stretch>
                       <a:fillRect/>
                     </a:stretch>
@@ -1908,7 +1913,8 @@
         <w:t xml:space="preserve">02-layer-dependency-matrix</w:t>
       </w:r>
     </w:p>
-    <w:bookmarkStart w:id="43" w:name="описание-5"/>
+    <w:bookmarkEnd w:id="36"/>
+    <w:bookmarkStart w:id="37" w:name="описание-5"/>
     <w:p>
       <w:pPr>
         <w:pStyle w:val="Heading3"/>
@@ -1922,11 +1928,11 @@
         <w:pStyle w:val="FirstParagraph"/>
       </w:pPr>
       <w:r>
-        <w:t xml:space="preserve">Диаграмма «Layer Dependency Matrix (ARCH-001)» из architecture-набора детализирует конкретный архитектурный компонент или подсистему BioETL. Она представлена в формате блок-схема потоков (flowchart) и служит ориентиром на уровне детализации «System / Component». В комментариях исходника зафиксирован фокус диаграммы: Enforced import boundaries between architectural layers.. На схеме отражено примерно 5 узлов и 14 связей, поэтому её удобно использовать для проверки влияния изменений, согласования интерфейсов и подготовки рефакторинга. Ключевые блоки/подграфы: Legend, Architectural Layers. Показательные узлы для быстрого чтения: ✅ Allowed, ❌ Forbidden, domain (pure business logic, no I/O, no frameworks), application (use cases, orchestration, transformers), infrastructure (adapters, storage, observability), composition (DI wiring, factories, bootstrap).</w:t>
-      </w:r>
-    </w:p>
-    <w:bookmarkEnd w:id="43"/>
-    <w:bookmarkStart w:id="44" w:name="метаданные-5"/>
+        <w:t xml:space="preserve">Диаграмма «Layer Dependency Matrix (ARCH-001)» из architecture-набора детализирует конкретный архитектурный компонент или подсистему BioETL. Она представлена в формате блок-схема потоков (flowchart) и служит ориентиром на уровне детализации «System / Component». В комментариях исходника зафиксирован фокус диаграммы: Enforced import boundaries between architectural layers.. Схема имеет плотность порядка 5 узлов и 14 связей; её удобно использовать как обзорный архитектурный срез для проверки влияния изменений, согласования интерфейсов и подготовки рефакторинга, но не как исчерпывающий каталог текущей кодовой поверхности. Ключевые блоки/подграфы: Legend, Architectural Layers. Показательные узлы для быстрого чтения: ✅ Allowed, ❌ Forbidden, domain (pure business logic, no I/O, no frameworks), application (use cases, orchestration, transformers), infrastructure (adapters, storage, observability), composition (DI wiring, factories, bootstrap).</w:t>
+      </w:r>
+    </w:p>
+    <w:bookmarkEnd w:id="37"/>
+    <w:bookmarkStart w:id="41" w:name="метаданные-5"/>
     <w:p>
       <w:pPr>
         <w:pStyle w:val="Heading3"/>
@@ -2024,15 +2030,15 @@
         <w:br w:type="page"/>
       </w:r>
     </w:p>
-    <w:bookmarkEnd w:id="44"/>
-    <w:bookmarkEnd w:id="45"/>
-    <w:bookmarkStart w:id="51" w:name="X36c6a5c4f1fe3bee11bfb97db2e23880458e0f5"/>
-    <w:p>
-      <w:pPr>
-        <w:pStyle w:val="Heading2"/>
-      </w:pPr>
-      <w:r>
-        <w:t xml:space="preserve">03-medallion-data-flow — Medallion Architecture Data Flow (Bronze → Silver → Gold)</w:t>
+    <w:p>
+      <w:pPr>
+        <w:pStyle w:val="FirstParagraph"/>
+      </w:pPr>
+      <w:r>
+        <w:t xml:space="preserve"> </w:t>
+      </w:r>
+      <w:r>
+        <w:t xml:space="preserve">## 03-medallion-data-flow — Medallion Architecture Data Flow (Bronze → Silver → Gold)</w:t>
       </w:r>
     </w:p>
     <w:p>
@@ -2044,18 +2050,18 @@
           <wp:inline>
             <wp:extent cx="5334000" cy="856051"/>
             <wp:effectExtent b="0" l="0" r="0" t="0"/>
-            <wp:docPr descr="03-medallion-data-flow" title="" id="47" name="Picture"/>
+            <wp:docPr descr="03-medallion-data-flow" title="" id="39" name="Picture"/>
             <a:graphic>
               <a:graphicData uri="http://schemas.openxmlformats.org/drawingml/2006/picture">
                 <pic:pic>
                   <pic:nvPicPr>
-                    <pic:cNvPr descr="../architecture/png/03-medallion-data-flow.png" id="48" name="Picture"/>
+                    <pic:cNvPr descr="file:///E:/g-drive/05_AI/github/BioactivityDataAcquisition2/docs/02-architecture/diagrams/architecture/png/03-medallion-data-flow.png" id="40" name="Picture"/>
                     <pic:cNvPicPr>
                       <a:picLocks noChangeArrowheads="1" noChangeAspect="1"/>
                     </pic:cNvPicPr>
                   </pic:nvPicPr>
                   <pic:blipFill>
-                    <a:blip r:embed="rId46"/>
+                    <a:blip r:embed="rId38"/>
                     <a:stretch>
                       <a:fillRect/>
                     </a:stretch>
@@ -2090,7 +2096,8 @@
         <w:t xml:space="preserve">03-medallion-data-flow</w:t>
       </w:r>
     </w:p>
-    <w:bookmarkStart w:id="49" w:name="описание-6"/>
+    <w:bookmarkEnd w:id="41"/>
+    <w:bookmarkStart w:id="42" w:name="описание-6"/>
     <w:p>
       <w:pPr>
         <w:pStyle w:val="Heading3"/>
@@ -2104,11 +2111,11 @@
         <w:pStyle w:val="FirstParagraph"/>
       </w:pPr>
       <w:r>
-        <w:t xml:space="preserve">Диаграмма «Medallion Architecture Data Flow (Bronze → Silver → Gold)» из architecture-набора детализирует конкретный архитектурный компонент или подсистему BioETL. Она представлена в формате блок-схема потоков (flowchart) и служит ориентиром на уровне детализации «System / Component». В комментариях исходника зафиксирован фокус диаграммы: how data flows through the three medallion layers.. На схеме отражено примерно 36 узлов и 31 связей, поэтому её удобно использовать для проверки влияния изменений, согласования интерфейсов и подготовки рефакторинга. Ключевые блоки/подграфы: External Data Sources, Data Ingestion, Bronze Layer (Raw), Transformation, Silver Layer (Normalized), Gold Transformation. Показательные узлы для быстрого чтения: Semantic Scholar API, DataSourcePort fetch() / fetch_filtered(), RateLimiter (TokenBucket), CircuitBreaker, Retry Logic, BronzeWriter. Примечание: Canonical medallion flow — at threshold boundary.</w:t>
-      </w:r>
-    </w:p>
-    <w:bookmarkEnd w:id="49"/>
-    <w:bookmarkStart w:id="50" w:name="метаданные-6"/>
+        <w:t xml:space="preserve">Диаграмма «Medallion Architecture Data Flow (Bronze → Silver → Gold)» из architecture-набора детализирует конкретный архитектурный компонент или подсистему BioETL. Она представлена в формате блок-схема потоков (flowchart) и служит ориентиром на уровне детализации «System / Component». В комментариях исходника зафиксирован фокус диаграммы: how data flows through the three medallion layers.. Схема имеет плотность порядка 36 узлов и 31 связей; её удобно использовать как обзорный архитектурный срез для проверки влияния изменений, согласования интерфейсов и подготовки рефакторинга, но не как исчерпывающий каталог текущей кодовой поверхности. Ключевые блоки/подграфы: External Data Sources, Data Ingestion, Bronze Layer (Raw), Transformation, Silver Layer (Normalized), Gold Transformation. Показательные узлы для быстрого чтения: Semantic Scholar API, DataSourcePort fetch() / fetch_filtered(), RateLimiter (TokenBucket), CircuitBreaker, Retry Logic, BronzeWriter. Примечание: Canonical medallion flow — at threshold boundary.</w:t>
+      </w:r>
+    </w:p>
+    <w:bookmarkEnd w:id="42"/>
+    <w:bookmarkStart w:id="46" w:name="метаданные-6"/>
     <w:p>
       <w:pPr>
         <w:pStyle w:val="Heading3"/>
@@ -2206,15 +2213,15 @@
         <w:br w:type="page"/>
       </w:r>
     </w:p>
-    <w:bookmarkEnd w:id="50"/>
-    <w:bookmarkEnd w:id="51"/>
-    <w:bookmarkStart w:id="57" w:name="Xa59ffd18eb11d9d4d3a9d89cdf6f3d15a24379b"/>
-    <w:p>
-      <w:pPr>
-        <w:pStyle w:val="Heading2"/>
-      </w:pPr>
-      <w:r>
-        <w:t xml:space="preserve">03a-medallion-layers-overview — Medallion Layers Overview</w:t>
+    <w:p>
+      <w:pPr>
+        <w:pStyle w:val="FirstParagraph"/>
+      </w:pPr>
+      <w:r>
+        <w:t xml:space="preserve"> </w:t>
+      </w:r>
+      <w:r>
+        <w:t xml:space="preserve">## 03a-medallion-layers-overview — Medallion Layers Overview</w:t>
       </w:r>
     </w:p>
     <w:p>
@@ -2226,18 +2233,18 @@
           <wp:inline>
             <wp:extent cx="5334000" cy="454741"/>
             <wp:effectExtent b="0" l="0" r="0" t="0"/>
-            <wp:docPr descr="03a-medallion-layers-overview" title="" id="53" name="Picture"/>
+            <wp:docPr descr="03a-medallion-layers-overview" title="" id="44" name="Picture"/>
             <a:graphic>
               <a:graphicData uri="http://schemas.openxmlformats.org/drawingml/2006/picture">
                 <pic:pic>
                   <pic:nvPicPr>
-                    <pic:cNvPr descr="../architecture/png/03a-medallion-layers-overview.png" id="54" name="Picture"/>
+                    <pic:cNvPr descr="file:///E:/g-drive/05_AI/github/BioactivityDataAcquisition2/docs/02-architecture/diagrams/architecture/png/03a-medallion-layers-overview.png" id="45" name="Picture"/>
                     <pic:cNvPicPr>
                       <a:picLocks noChangeArrowheads="1" noChangeAspect="1"/>
                     </pic:cNvPicPr>
                   </pic:nvPicPr>
                   <pic:blipFill>
-                    <a:blip r:embed="rId52"/>
+                    <a:blip r:embed="rId43"/>
                     <a:stretch>
                       <a:fillRect/>
                     </a:stretch>
@@ -2272,7 +2279,8 @@
         <w:t xml:space="preserve">03a-medallion-layers-overview</w:t>
       </w:r>
     </w:p>
-    <w:bookmarkStart w:id="55" w:name="описание-7"/>
+    <w:bookmarkEnd w:id="46"/>
+    <w:bookmarkStart w:id="47" w:name="описание-7"/>
     <w:p>
       <w:pPr>
         <w:pStyle w:val="Heading3"/>
@@ -2286,7 +2294,7 @@
         <w:pStyle w:val="FirstParagraph"/>
       </w:pPr>
       <w:r>
-        <w:t xml:space="preserve">Диаграмма «Medallion Layers Overview» из architecture-набора детализирует конкретный архитектурный компонент или подсистему BioETL. Она представлена в формате блок-схема потоков (flowchart) и служит ориентиром на уровне детализации «System / Component». В комментариях исходника зафиксирован фокус диаграммы: Compact decomposition view for 03-medallion-data-flow.mmd (layer-level semantics). На схеме отражено примерно 12 узлов и 9 связей, поэтому её удобно использовать для проверки влияния изменений, согласования интерфейсов и подготовки рефакторинга. Ключевые блоки/подграфы: Ingestion, Processing, Serving. Показательные узлы для быстрого чтения: Provider APIs, Bronze Layer</w:t>
+        <w:t xml:space="preserve">Диаграмма «Medallion Layers Overview» из architecture-набора детализирует конкретный архитектурный компонент или подсистему BioETL. Она представлена в формате блок-схема потоков (flowchart) и служит ориентиром на уровне детализации «System / Component». В комментариях исходника зафиксирован фокус диаграммы: Compact decomposition view for 03-medallion-data-flow.mmd (layer-level semantics). Схема имеет плотность порядка 12 узлов и 9 связей; её удобно использовать как обзорный архитектурный срез для проверки влияния изменений, согласования интерфейсов и подготовки рефакторинга, но не как исчерпывающий каталог текущей кодовой поверхности. Ключевые блоки/подграфы: Ingestion, Processing, Serving. Показательные узлы для быстрого чтения: Provider APIs, Bronze Layer</w:t>
       </w:r>
       <w:r>
         <w:t xml:space="preserve">JSON, Normalize + Validate, Silver Layer</w:t>
@@ -2295,8 +2303,8 @@
         <w:t xml:space="preserve">Tables, DQ Checks, Quarantine. Связанный ADR: ADR-002, ADR-040.</w:t>
       </w:r>
     </w:p>
-    <w:bookmarkEnd w:id="55"/>
-    <w:bookmarkStart w:id="56" w:name="метаданные-7"/>
+    <w:bookmarkEnd w:id="47"/>
+    <w:bookmarkStart w:id="51" w:name="метаданные-7"/>
     <w:p>
       <w:pPr>
         <w:pStyle w:val="Heading3"/>
@@ -2415,15 +2423,15 @@
         <w:br w:type="page"/>
       </w:r>
     </w:p>
-    <w:bookmarkEnd w:id="56"/>
-    <w:bookmarkEnd w:id="57"/>
-    <w:bookmarkStart w:id="63" w:name="X12b3524459bd4bf1ff1448d608baea17bbcfcb5"/>
-    <w:p>
-      <w:pPr>
-        <w:pStyle w:val="Heading2"/>
-      </w:pPr>
-      <w:r>
-        <w:t xml:space="preserve">04-pipeline-execution-flow — Pipeline Execution Lifecycle</w:t>
+    <w:p>
+      <w:pPr>
+        <w:pStyle w:val="FirstParagraph"/>
+      </w:pPr>
+      <w:r>
+        <w:t xml:space="preserve"> </w:t>
+      </w:r>
+      <w:r>
+        <w:t xml:space="preserve">## 04-pipeline-execution-flow — Pipeline Execution Lifecycle</w:t>
       </w:r>
     </w:p>
     <w:p>
@@ -2435,18 +2443,18 @@
           <wp:inline>
             <wp:extent cx="5334000" cy="4756202"/>
             <wp:effectExtent b="0" l="0" r="0" t="0"/>
-            <wp:docPr descr="04-pipeline-execution-flow" title="" id="59" name="Picture"/>
+            <wp:docPr descr="04-pipeline-execution-flow" title="" id="49" name="Picture"/>
             <a:graphic>
               <a:graphicData uri="http://schemas.openxmlformats.org/drawingml/2006/picture">
                 <pic:pic>
                   <pic:nvPicPr>
-                    <pic:cNvPr descr="../architecture/png/04-pipeline-execution-flow.png" id="60" name="Picture"/>
+                    <pic:cNvPr descr="file:///E:/g-drive/05_AI/github/BioactivityDataAcquisition2/docs/02-architecture/diagrams/architecture/png/04-pipeline-execution-flow.png" id="50" name="Picture"/>
                     <pic:cNvPicPr>
                       <a:picLocks noChangeArrowheads="1" noChangeAspect="1"/>
                     </pic:cNvPicPr>
                   </pic:nvPicPr>
                   <pic:blipFill>
-                    <a:blip r:embed="rId58"/>
+                    <a:blip r:embed="rId48"/>
                     <a:stretch>
                       <a:fillRect/>
                     </a:stretch>
@@ -2481,7 +2489,8 @@
         <w:t xml:space="preserve">04-pipeline-execution-flow</w:t>
       </w:r>
     </w:p>
-    <w:bookmarkStart w:id="61" w:name="описание-8"/>
+    <w:bookmarkEnd w:id="51"/>
+    <w:bookmarkStart w:id="52" w:name="описание-8"/>
     <w:p>
       <w:pPr>
         <w:pStyle w:val="Heading3"/>
@@ -2495,11 +2504,11 @@
         <w:pStyle w:val="FirstParagraph"/>
       </w:pPr>
       <w:r>
-        <w:t xml:space="preserve">Диаграмма «Pipeline Execution Lifecycle» из architecture-набора детализирует конкретный архитектурный компонент или подсистему BioETL. Она представлена в формате диаграмма последовательности (sequence) и служит ориентиром на уровне детализации «System / Component». В комментариях исходника зафиксирован фокус диаграммы: Sequence of phases in a single pipeline run.. На схеме отражено примерно 12 узлов и 9 связей, поэтому её удобно использовать для проверки влияния изменений, согласования интерфейсов и подготовки рефакторинга.</w:t>
-      </w:r>
-    </w:p>
-    <w:bookmarkEnd w:id="61"/>
-    <w:bookmarkStart w:id="62" w:name="метаданные-8"/>
+        <w:t xml:space="preserve">Диаграмма «Pipeline Execution Lifecycle» из architecture-набора детализирует конкретный архитектурный компонент или подсистему BioETL. Она представлена в формате диаграмма последовательности (sequence) и служит ориентиром на уровне детализации «System / Component». В комментариях исходника зафиксирован фокус диаграммы: Sequence of phases in a single pipeline run.. Схема имеет плотность порядка 12 узлов и 9 связей; её удобно использовать как обзорный архитектурный срез для проверки влияния изменений, согласования интерфейсов и подготовки рефакторинга, но не как исчерпывающий каталог текущей кодовой поверхности.</w:t>
+      </w:r>
+    </w:p>
+    <w:bookmarkEnd w:id="52"/>
+    <w:bookmarkStart w:id="56" w:name="метаданные-8"/>
     <w:p>
       <w:pPr>
         <w:pStyle w:val="Heading3"/>
@@ -2597,15 +2606,15 @@
         <w:br w:type="page"/>
       </w:r>
     </w:p>
-    <w:bookmarkEnd w:id="62"/>
-    <w:bookmarkEnd w:id="63"/>
-    <w:bookmarkStart w:id="69" w:name="Xbe4115ef87d54ec01fc2dfb20f4d96ddef5c484"/>
-    <w:p>
-      <w:pPr>
-        <w:pStyle w:val="Heading2"/>
-      </w:pPr>
-      <w:r>
-        <w:t xml:space="preserve">05-provider-adapter-hierarchy — Provider Adapter Hierarchy</w:t>
+    <w:p>
+      <w:pPr>
+        <w:pStyle w:val="FirstParagraph"/>
+      </w:pPr>
+      <w:r>
+        <w:t xml:space="preserve"> </w:t>
+      </w:r>
+      <w:r>
+        <w:t xml:space="preserve">## 05-provider-adapter-hierarchy — Provider Adapter Hierarchy</w:t>
       </w:r>
     </w:p>
     <w:p>
@@ -2617,18 +2626,18 @@
           <wp:inline>
             <wp:extent cx="5334000" cy="1241956"/>
             <wp:effectExtent b="0" l="0" r="0" t="0"/>
-            <wp:docPr descr="05-provider-adapter-hierarchy" title="" id="65" name="Picture"/>
+            <wp:docPr descr="05-provider-adapter-hierarchy" title="" id="54" name="Picture"/>
             <a:graphic>
               <a:graphicData uri="http://schemas.openxmlformats.org/drawingml/2006/picture">
                 <pic:pic>
                   <pic:nvPicPr>
-                    <pic:cNvPr descr="../architecture/png/05-provider-adapter-hierarchy.png" id="66" name="Picture"/>
+                    <pic:cNvPr descr="file:///E:/g-drive/05_AI/github/BioactivityDataAcquisition2/docs/02-architecture/diagrams/architecture/png/05-provider-adapter-hierarchy.png" id="55" name="Picture"/>
                     <pic:cNvPicPr>
                       <a:picLocks noChangeArrowheads="1" noChangeAspect="1"/>
                     </pic:cNvPicPr>
                   </pic:nvPicPr>
                   <pic:blipFill>
-                    <a:blip r:embed="rId64"/>
+                    <a:blip r:embed="rId53"/>
                     <a:stretch>
                       <a:fillRect/>
                     </a:stretch>
@@ -2663,7 +2672,8 @@
         <w:t xml:space="preserve">05-provider-adapter-hierarchy</w:t>
       </w:r>
     </w:p>
-    <w:bookmarkStart w:id="67" w:name="описание-9"/>
+    <w:bookmarkEnd w:id="56"/>
+    <w:bookmarkStart w:id="57" w:name="описание-9"/>
     <w:p>
       <w:pPr>
         <w:pStyle w:val="Heading3"/>
@@ -2677,11 +2687,11 @@
         <w:pStyle w:val="FirstParagraph"/>
       </w:pPr>
       <w:r>
-        <w:t xml:space="preserve">Диаграмма «Provider Adapter Hierarchy» из architecture-набора детализирует конкретный архитектурный компонент или подсистему BioETL. Она представлена в формате блок-схема потоков (flowchart) и служит ориентиром на уровне детализации «System / Component». В комментариях исходника зафиксирован фокус диаграммы: how each provider adapter inherits from base classes and implements DataSourcePort.. На схеме отражено примерно 27 узлов и 24 связей, поэтому её удобно использовать для проверки влияния изменений, согласования интерфейсов и подготовки рефакторинга. Ключевые блоки/подграфы: Domain Ports, Mixins, Base Adapters, ChEMBL, PubMed, UniProt. Показательные узлы для быстрого чтения: DataSourcePort (Protocol), HealthCheckPort (Protocol), HealthCheckMixin, HealthCheckProviderMixin, NotSupportedMultiFilterMixin, DelegatingFallbackMixin. Примечание: Decomposed into 05a, 05b sub-diagrams.</w:t>
-      </w:r>
-    </w:p>
-    <w:bookmarkEnd w:id="67"/>
-    <w:bookmarkStart w:id="68" w:name="метаданные-9"/>
+        <w:t xml:space="preserve">Диаграмма «Provider Adapter Hierarchy» из architecture-набора детализирует конкретный архитектурный компонент или подсистему BioETL. Она представлена в формате блок-схема потоков (flowchart) и служит ориентиром на уровне детализации «System / Component». В комментариях исходника зафиксирован фокус диаграммы: how each provider adapter inherits from base classes and implements DataSourcePort.. Схема имеет плотность порядка 27 узлов и 24 связей; её удобно использовать как обзорный архитектурный срез для проверки влияния изменений, согласования интерфейсов и подготовки рефакторинга, но не как исчерпывающий каталог текущей кодовой поверхности. Ключевые блоки/подграфы: Domain Ports, Mixins, Base Adapters, ChEMBL, PubMed, UniProt. Показательные узлы для быстрого чтения: DataSourcePort (Protocol), HealthCheckPort (Protocol), HealthCheckMixin, HealthCheckProviderMixin, NotSupportedMultiFilterMixin, DelegatingFallbackMixin. Примечание: Decomposed into 05a, 05b sub-diagrams.</w:t>
+      </w:r>
+    </w:p>
+    <w:bookmarkEnd w:id="57"/>
+    <w:bookmarkStart w:id="61" w:name="метаданные-9"/>
     <w:p>
       <w:pPr>
         <w:pStyle w:val="Heading3"/>
@@ -2779,15 +2789,15 @@
         <w:br w:type="page"/>
       </w:r>
     </w:p>
-    <w:bookmarkEnd w:id="68"/>
-    <w:bookmarkEnd w:id="69"/>
-    <w:bookmarkStart w:id="75" w:name="X7a5deb21135357cdae0639d103f46b17707e5c3"/>
-    <w:p>
-      <w:pPr>
-        <w:pStyle w:val="Heading2"/>
-      </w:pPr>
-      <w:r>
-        <w:t xml:space="preserve">05a-adapter-hierarchy-base — Adapter Hierarchy: Base Types</w:t>
+    <w:p>
+      <w:pPr>
+        <w:pStyle w:val="FirstParagraph"/>
+      </w:pPr>
+      <w:r>
+        <w:t xml:space="preserve"> </w:t>
+      </w:r>
+      <w:r>
+        <w:t xml:space="preserve">## 05a-adapter-hierarchy-base — Adapter Hierarchy: Base Types</w:t>
       </w:r>
     </w:p>
     <w:p>
@@ -2799,18 +2809,18 @@
           <wp:inline>
             <wp:extent cx="5334000" cy="1369200"/>
             <wp:effectExtent b="0" l="0" r="0" t="0"/>
-            <wp:docPr descr="05a-adapter-hierarchy-base" title="" id="71" name="Picture"/>
+            <wp:docPr descr="05a-adapter-hierarchy-base" title="" id="59" name="Picture"/>
             <a:graphic>
               <a:graphicData uri="http://schemas.openxmlformats.org/drawingml/2006/picture">
                 <pic:pic>
                   <pic:nvPicPr>
-                    <pic:cNvPr descr="../architecture/png/05a-adapter-hierarchy-base.png" id="72" name="Picture"/>
+                    <pic:cNvPr descr="file:///E:/g-drive/05_AI/github/BioactivityDataAcquisition2/docs/02-architecture/diagrams/architecture/png/05a-adapter-hierarchy-base.png" id="60" name="Picture"/>
                     <pic:cNvPicPr>
                       <a:picLocks noChangeArrowheads="1" noChangeAspect="1"/>
                     </pic:cNvPicPr>
                   </pic:nvPicPr>
                   <pic:blipFill>
-                    <a:blip r:embed="rId70"/>
+                    <a:blip r:embed="rId58"/>
                     <a:stretch>
                       <a:fillRect/>
                     </a:stretch>
@@ -2845,7 +2855,8 @@
         <w:t xml:space="preserve">05a-adapter-hierarchy-base</w:t>
       </w:r>
     </w:p>
-    <w:bookmarkStart w:id="73" w:name="описание-10"/>
+    <w:bookmarkEnd w:id="61"/>
+    <w:bookmarkStart w:id="62" w:name="описание-10"/>
     <w:p>
       <w:pPr>
         <w:pStyle w:val="Heading3"/>
@@ -2859,11 +2870,11 @@
         <w:pStyle w:val="FirstParagraph"/>
       </w:pPr>
       <w:r>
-        <w:t xml:space="preserve">Диаграмма «Adapter Hierarchy: Base Types» из architecture-набора детализирует конкретный архитектурный компонент или подсистему BioETL. Она представлена в формате блок-схема потоков (flowchart) и служит ориентиром на уровне детализации «System / Component». В комментариях исходника зафиксирован фокус диаграммы: Covers core ports, base adapters, reusable mixins, and adapter decorators.. На схеме отражено примерно 12 узлов и 8 связей, поэтому её удобно использовать для проверки влияния изменений, согласования интерфейсов и подготовки рефакторинга. Ключевые блоки/подграфы: Domain Layer, Infrastructure Layer. Показательные узлы для быстрого чтения: DataSourcePort, HealthCheckPort, HealthCheckProviderMixin, NotSupportedMultiFilterMixin, FilterableStubMixin, PaginatedFetcherMixin.</w:t>
-      </w:r>
-    </w:p>
-    <w:bookmarkEnd w:id="73"/>
-    <w:bookmarkStart w:id="74" w:name="метаданные-10"/>
+        <w:t xml:space="preserve">Диаграмма «Adapter Hierarchy: Base Types» из architecture-набора детализирует конкретный архитектурный компонент или подсистему BioETL. Она представлена в формате блок-схема потоков (flowchart) и служит ориентиром на уровне детализации «System / Component». В комментариях исходника зафиксирован фокус диаграммы: Covers core ports, base adapters, reusable mixins, and adapter decorators.. Схема имеет плотность порядка 12 узлов и 8 связей; её удобно использовать как обзорный архитектурный срез для проверки влияния изменений, согласования интерфейсов и подготовки рефакторинга, но не как исчерпывающий каталог текущей кодовой поверхности. Ключевые блоки/подграфы: Domain Layer, Infrastructure Layer. Показательные узлы для быстрого чтения: DataSourcePort, HealthCheckPort, HealthCheckProviderMixin, NotSupportedMultiFilterMixin, FilterableStubMixin, PaginatedFetcherMixin.</w:t>
+      </w:r>
+    </w:p>
+    <w:bookmarkEnd w:id="62"/>
+    <w:bookmarkStart w:id="66" w:name="метаданные-10"/>
     <w:p>
       <w:pPr>
         <w:pStyle w:val="Heading3"/>
@@ -2961,15 +2972,15 @@
         <w:br w:type="page"/>
       </w:r>
     </w:p>
-    <w:bookmarkEnd w:id="74"/>
-    <w:bookmarkEnd w:id="75"/>
-    <w:bookmarkStart w:id="81" w:name="Xab4882b35f2862ff47b813216c279accc8e369a"/>
-    <w:p>
-      <w:pPr>
-        <w:pStyle w:val="Heading2"/>
-      </w:pPr>
-      <w:r>
-        <w:t xml:space="preserve">05b-adapter-hierarchy-providers — Adapter Hierarchy: Provider Implementations</w:t>
+    <w:p>
+      <w:pPr>
+        <w:pStyle w:val="FirstParagraph"/>
+      </w:pPr>
+      <w:r>
+        <w:t xml:space="preserve"> </w:t>
+      </w:r>
+      <w:r>
+        <w:t xml:space="preserve">## 05b-adapter-hierarchy-providers — Adapter Hierarchy: Provider Implementations</w:t>
       </w:r>
     </w:p>
     <w:p>
@@ -2981,18 +2992,18 @@
           <wp:inline>
             <wp:extent cx="5334000" cy="600845"/>
             <wp:effectExtent b="0" l="0" r="0" t="0"/>
-            <wp:docPr descr="05b-adapter-hierarchy-providers" title="" id="77" name="Picture"/>
+            <wp:docPr descr="05b-adapter-hierarchy-providers" title="" id="64" name="Picture"/>
             <a:graphic>
               <a:graphicData uri="http://schemas.openxmlformats.org/drawingml/2006/picture">
                 <pic:pic>
                   <pic:nvPicPr>
-                    <pic:cNvPr descr="../architecture/png/05b-adapter-hierarchy-providers.png" id="78" name="Picture"/>
+                    <pic:cNvPr descr="file:///E:/g-drive/05_AI/github/BioactivityDataAcquisition2/docs/02-architecture/diagrams/architecture/png/05b-adapter-hierarchy-providers.png" id="65" name="Picture"/>
                     <pic:cNvPicPr>
                       <a:picLocks noChangeArrowheads="1" noChangeAspect="1"/>
                     </pic:cNvPicPr>
                   </pic:nvPicPr>
                   <pic:blipFill>
-                    <a:blip r:embed="rId76"/>
+                    <a:blip r:embed="rId63"/>
                     <a:stretch>
                       <a:fillRect/>
                     </a:stretch>
@@ -3027,7 +3038,8 @@
         <w:t xml:space="preserve">05b-adapter-hierarchy-providers</w:t>
       </w:r>
     </w:p>
-    <w:bookmarkStart w:id="79" w:name="описание-11"/>
+    <w:bookmarkEnd w:id="66"/>
+    <w:bookmarkStart w:id="67" w:name="описание-11"/>
     <w:p>
       <w:pPr>
         <w:pStyle w:val="Heading3"/>
@@ -3041,11 +3053,11 @@
         <w:pStyle w:val="FirstParagraph"/>
       </w:pPr>
       <w:r>
-        <w:t xml:space="preserve">Диаграмма «Adapter Hierarchy: Provider Implementations» из architecture-набора детализирует конкретный архитектурный компонент или подсистему BioETL. Она представлена в формате блок-схема потоков (flowchart) и служит ориентиром на уровне детализации «System / Component». В комментариях исходника зафиксирован фокус диаграммы: Covers concrete provider adapters and provider-specific mixins.. На схеме отражено примерно 15 узлов и 12 связей, поэтому её удобно использовать для проверки влияния изменений, согласования интерфейсов и подготовки рефакторинга. Ключевые блоки/подграфы: Infrastructure Layer. Показательные узлы для быстрого чтения: BaseHttpAdapter, BaseSyncAdapter, ChemblAdapter, PubMedAdapter, UniProtAdapter, CrossRefAdapter.</w:t>
-      </w:r>
-    </w:p>
-    <w:bookmarkEnd w:id="79"/>
-    <w:bookmarkStart w:id="80" w:name="метаданные-11"/>
+        <w:t xml:space="preserve">Диаграмма «Adapter Hierarchy: Provider Implementations» из architecture-набора детализирует конкретный архитектурный компонент или подсистему BioETL. Она представлена в формате блок-схема потоков (flowchart) и служит ориентиром на уровне детализации «System / Component». В комментариях исходника зафиксирован фокус диаграммы: Covers concrete provider adapters and provider-specific mixins.. Схема имеет плотность порядка 15 узлов и 12 связей; её удобно использовать как обзорный архитектурный срез для проверки влияния изменений, согласования интерфейсов и подготовки рефакторинга, но не как исчерпывающий каталог текущей кодовой поверхности. Ключевые блоки/подграфы: Infrastructure Layer. Показательные узлы для быстрого чтения: BaseHttpAdapter, BaseSyncAdapter, ChemblAdapter, PubMedAdapter, UniProtAdapter, CrossRefAdapter.</w:t>
+      </w:r>
+    </w:p>
+    <w:bookmarkEnd w:id="67"/>
+    <w:bookmarkStart w:id="71" w:name="метаданные-11"/>
     <w:p>
       <w:pPr>
         <w:pStyle w:val="Heading3"/>
@@ -3143,15 +3155,15 @@
         <w:br w:type="page"/>
       </w:r>
     </w:p>
-    <w:bookmarkEnd w:id="80"/>
-    <w:bookmarkEnd w:id="81"/>
-    <w:bookmarkStart w:id="87" w:name="storage-layer-storage-layer-components"/>
-    <w:p>
-      <w:pPr>
-        <w:pStyle w:val="Heading2"/>
-      </w:pPr>
-      <w:r>
-        <w:t xml:space="preserve">06-storage-layer — Storage Layer Components</w:t>
+    <w:p>
+      <w:pPr>
+        <w:pStyle w:val="FirstParagraph"/>
+      </w:pPr>
+      <w:r>
+        <w:t xml:space="preserve"> </w:t>
+      </w:r>
+      <w:r>
+        <w:t xml:space="preserve">## 06-storage-layer — Storage Layer Components</w:t>
       </w:r>
     </w:p>
     <w:p>
@@ -3163,18 +3175,18 @@
           <wp:inline>
             <wp:extent cx="5334000" cy="4724982"/>
             <wp:effectExtent b="0" l="0" r="0" t="0"/>
-            <wp:docPr descr="06-storage-layer" title="" id="83" name="Picture"/>
+            <wp:docPr descr="06-storage-layer" title="" id="69" name="Picture"/>
             <a:graphic>
               <a:graphicData uri="http://schemas.openxmlformats.org/drawingml/2006/picture">
                 <pic:pic>
                   <pic:nvPicPr>
-                    <pic:cNvPr descr="../architecture/png/06-storage-layer.png" id="84" name="Picture"/>
+                    <pic:cNvPr descr="file:///E:/g-drive/05_AI/github/BioactivityDataAcquisition2/docs/02-architecture/diagrams/architecture/png/06-storage-layer.png" id="70" name="Picture"/>
                     <pic:cNvPicPr>
                       <a:picLocks noChangeArrowheads="1" noChangeAspect="1"/>
                     </pic:cNvPicPr>
                   </pic:nvPicPr>
                   <pic:blipFill>
-                    <a:blip r:embed="rId82"/>
+                    <a:blip r:embed="rId68"/>
                     <a:stretch>
                       <a:fillRect/>
                     </a:stretch>
@@ -3209,7 +3221,8 @@
         <w:t xml:space="preserve">06-storage-layer</w:t>
       </w:r>
     </w:p>
-    <w:bookmarkStart w:id="85" w:name="описание-12"/>
+    <w:bookmarkEnd w:id="71"/>
+    <w:bookmarkStart w:id="72" w:name="описание-12"/>
     <w:p>
       <w:pPr>
         <w:pStyle w:val="Heading3"/>
@@ -3223,11 +3236,11 @@
         <w:pStyle w:val="FirstParagraph"/>
       </w:pPr>
       <w:r>
-        <w:t xml:space="preserve">Диаграмма «Storage Layer Components» из architecture-набора детализирует конкретный архитектурный компонент или подсистему BioETL. Она представлена в формате блок-схема потоков (flowchart) и служит ориентиром на уровне детализации «System / Component». В комментариях исходника зафиксирован фокус диаграммы: Bronze/Silver/Gold writers, metadata sidecar zones, Delta Lake, and validation.. На схеме отражено примерно 23 узлов и 27 связей, поэтому её удобно использовать для проверки влияния изменений, согласования интерфейсов и подготовки рефакторинга. Ключевые блоки/подграфы: Domain Port, Storage Writers, Bronze Storage, Silver Storage, Gold Storage, Delta Reader. Показательные узлы для быстрого чтения: StoragePort (Protocol), AtomicWriteGroup ━━━━━━━━━━━━━━━━━ Atomic multi-file writes with rollback, ArrowDataConverter (records → PyArrow), RetentionPolicy (vacuum/retention), MetadataWriter write_bronze / write_silver / write_gold, CsvExporter (Delta → CSV export). Примечание: Decomposed into 06a-storage-writers, 06b-storage-support.</w:t>
-      </w:r>
-    </w:p>
-    <w:bookmarkEnd w:id="85"/>
-    <w:bookmarkStart w:id="86" w:name="метаданные-12"/>
+        <w:t xml:space="preserve">Диаграмма «Storage Layer Components» из architecture-набора детализирует конкретный архитектурный компонент или подсистему BioETL. Она представлена в формате блок-схема потоков (flowchart) и служит ориентиром на уровне детализации «System / Component». В комментариях исходника зафиксирован фокус диаграммы: Bronze/Silver/Gold writers, metadata sidecar zones, Delta Lake, and validation.. Схема имеет плотность порядка 23 узлов и 27 связей; её удобно использовать как обзорный архитектурный срез для проверки влияния изменений, согласования интерфейсов и подготовки рефакторинга, но не как исчерпывающий каталог текущей кодовой поверхности. Ключевые блоки/подграфы: Domain Port, Storage Writers, Bronze Storage, Silver Storage, Gold Storage, Delta Reader. Показательные узлы для быстрого чтения: StoragePort (Protocol), AtomicWriteGroup ━━━━━━━━━━━━━━━━━ Atomic multi-file writes with rollback, ArrowDataConverter (records → PyArrow), RetentionPolicy (vacuum/retention), MetadataWriter write_bronze / write_silver / write_gold, CsvExporter (Delta → CSV export). Примечание: Decomposed into 06a-storage-writers, 06b-storage-support.</w:t>
+      </w:r>
+    </w:p>
+    <w:bookmarkEnd w:id="72"/>
+    <w:bookmarkStart w:id="76" w:name="метаданные-12"/>
     <w:p>
       <w:pPr>
         <w:pStyle w:val="Heading3"/>
@@ -3325,15 +3338,15 @@
         <w:br w:type="page"/>
       </w:r>
     </w:p>
-    <w:bookmarkEnd w:id="86"/>
-    <w:bookmarkEnd w:id="87"/>
-    <w:bookmarkStart w:id="93" w:name="a-storage-writers-storage-writers"/>
-    <w:p>
-      <w:pPr>
-        <w:pStyle w:val="Heading2"/>
-      </w:pPr>
-      <w:r>
-        <w:t xml:space="preserve">06a-storage-writers — Storage Writers</w:t>
+    <w:p>
+      <w:pPr>
+        <w:pStyle w:val="FirstParagraph"/>
+      </w:pPr>
+      <w:r>
+        <w:t xml:space="preserve"> </w:t>
+      </w:r>
+      <w:r>
+        <w:t xml:space="preserve">## 06a-storage-writers — Storage Writers</w:t>
       </w:r>
     </w:p>
     <w:p>
@@ -3345,18 +3358,18 @@
           <wp:inline>
             <wp:extent cx="5334000" cy="5572306"/>
             <wp:effectExtent b="0" l="0" r="0" t="0"/>
-            <wp:docPr descr="06a-storage-writers" title="" id="89" name="Picture"/>
+            <wp:docPr descr="06a-storage-writers" title="" id="74" name="Picture"/>
             <a:graphic>
               <a:graphicData uri="http://schemas.openxmlformats.org/drawingml/2006/picture">
                 <pic:pic>
                   <pic:nvPicPr>
-                    <pic:cNvPr descr="../architecture/png/06a-storage-writers.png" id="90" name="Picture"/>
+                    <pic:cNvPr descr="file:///E:/g-drive/05_AI/github/BioactivityDataAcquisition2/docs/02-architecture/diagrams/architecture/png/06a-storage-writers.png" id="75" name="Picture"/>
                     <pic:cNvPicPr>
                       <a:picLocks noChangeArrowheads="1" noChangeAspect="1"/>
                     </pic:cNvPicPr>
                   </pic:nvPicPr>
                   <pic:blipFill>
-                    <a:blip r:embed="rId88"/>
+                    <a:blip r:embed="rId73"/>
                     <a:stretch>
                       <a:fillRect/>
                     </a:stretch>
@@ -3391,7 +3404,8 @@
         <w:t xml:space="preserve">06a-storage-writers</w:t>
       </w:r>
     </w:p>
-    <w:bookmarkStart w:id="91" w:name="описание-13"/>
+    <w:bookmarkEnd w:id="76"/>
+    <w:bookmarkStart w:id="77" w:name="описание-13"/>
     <w:p>
       <w:pPr>
         <w:pStyle w:val="Heading3"/>
@@ -3405,11 +3419,11 @@
         <w:pStyle w:val="FirstParagraph"/>
       </w:pPr>
       <w:r>
-        <w:t xml:space="preserve">Диаграмма «Storage Writers» из architecture-набора детализирует конкретный архитектурный компонент или подсистему BioETL. Она представлена в формате блок-схема потоков (flowchart) и служит ориентиром на уровне детализации «System / Component». В комментариях исходника зафиксирован фокус диаграммы: Bronze/Silver/Gold writers with Delta Lake base class, port contract, and file system layout.. На схеме отражено примерно 10 узлов и 10 связей, поэтому её удобно использовать для проверки влияния изменений, согласования интерфейсов и подготовки рефакторинга. Ключевые блоки/подграфы: Domain Port, Bronze Storage, Silver Storage, Gold Storage, Delta Reader, File System Layout. Показательные узлы для быстрого чтения: StoragePort (Protocol), BronzeWriter write_bronze() / aclose(), AtomicWriteGroup atomic multi-file writes, BaseDeltaWriter get_table_path() / clear(), SilverWriter write_silver() / merge_silver(), GoldWriter write_gold() / clear_gold().</w:t>
-      </w:r>
-    </w:p>
-    <w:bookmarkEnd w:id="91"/>
-    <w:bookmarkStart w:id="92" w:name="метаданные-13"/>
+        <w:t xml:space="preserve">Диаграмма «Storage Writers» из architecture-набора детализирует конкретный архитектурный компонент или подсистему BioETL. Она представлена в формате блок-схема потоков (flowchart) и служит ориентиром на уровне детализации «System / Component». В комментариях исходника зафиксирован фокус диаграммы: Bronze/Silver/Gold writers with Delta Lake base class, port contract, and file system layout.. Схема имеет плотность порядка 10 узлов и 10 связей; её удобно использовать как обзорный архитектурный срез для проверки влияния изменений, согласования интерфейсов и подготовки рефакторинга, но не как исчерпывающий каталог текущей кодовой поверхности. Ключевые блоки/подграфы: Domain Port, Bronze Storage, Silver Storage, Gold Storage, Delta Reader, File System Layout. Показательные узлы для быстрого чтения: StoragePort (Protocol), BronzeWriter write_bronze() / aclose(), AtomicWriteGroup atomic multi-file writes, BaseDeltaWriter get_table_path() / clear(), SilverWriter write_silver() / merge_silver(), GoldWriter write_gold() / clear_gold().</w:t>
+      </w:r>
+    </w:p>
+    <w:bookmarkEnd w:id="77"/>
+    <w:bookmarkStart w:id="81" w:name="метаданные-13"/>
     <w:p>
       <w:pPr>
         <w:pStyle w:val="Heading3"/>
@@ -3507,15 +3521,15 @@
         <w:br w:type="page"/>
       </w:r>
     </w:p>
-    <w:bookmarkEnd w:id="92"/>
-    <w:bookmarkEnd w:id="93"/>
-    <w:bookmarkStart w:id="99" w:name="X73c76fd90dd0235cdaba4c3d22f6007b2023371"/>
-    <w:p>
-      <w:pPr>
-        <w:pStyle w:val="Heading2"/>
-      </w:pPr>
-      <w:r>
-        <w:t xml:space="preserve">06b-storage-support — Storage Support Components</w:t>
+    <w:p>
+      <w:pPr>
+        <w:pStyle w:val="FirstParagraph"/>
+      </w:pPr>
+      <w:r>
+        <w:t xml:space="preserve"> </w:t>
+      </w:r>
+      <w:r>
+        <w:t xml:space="preserve">## 06b-storage-support — Storage Support Components</w:t>
       </w:r>
     </w:p>
     <w:p>
@@ -3527,18 +3541,18 @@
           <wp:inline>
             <wp:extent cx="5334000" cy="497260"/>
             <wp:effectExtent b="0" l="0" r="0" t="0"/>
-            <wp:docPr descr="06b-storage-support" title="" id="95" name="Picture"/>
+            <wp:docPr descr="06b-storage-support" title="" id="79" name="Picture"/>
             <a:graphic>
               <a:graphicData uri="http://schemas.openxmlformats.org/drawingml/2006/picture">
                 <pic:pic>
                   <pic:nvPicPr>
-                    <pic:cNvPr descr="../architecture/png/06b-storage-support.png" id="96" name="Picture"/>
+                    <pic:cNvPr descr="file:///E:/g-drive/05_AI/github/BioactivityDataAcquisition2/docs/02-architecture/diagrams/architecture/png/06b-storage-support.png" id="80" name="Picture"/>
                     <pic:cNvPicPr>
                       <a:picLocks noChangeArrowheads="1" noChangeAspect="1"/>
                     </pic:cNvPicPr>
                   </pic:nvPicPr>
                   <pic:blipFill>
-                    <a:blip r:embed="rId94"/>
+                    <a:blip r:embed="rId78"/>
                     <a:stretch>
                       <a:fillRect/>
                     </a:stretch>
@@ -3573,7 +3587,8 @@
         <w:t xml:space="preserve">06b-storage-support</w:t>
       </w:r>
     </w:p>
-    <w:bookmarkStart w:id="97" w:name="описание-14"/>
+    <w:bookmarkEnd w:id="81"/>
+    <w:bookmarkStart w:id="82" w:name="описание-14"/>
     <w:p>
       <w:pPr>
         <w:pStyle w:val="Heading3"/>
@@ -3587,11 +3602,11 @@
         <w:pStyle w:val="FirstParagraph"/>
       </w:pPr>
       <w:r>
-        <w:t xml:space="preserve">Диаграмма «Storage Support Components» из architecture-набора детализирует конкретный архитектурный компонент или подсистему BioETL. Она представлена в формате блок-схема потоков (flowchart) и служит ориентиром на уровне детализации «System / Component». В комментариях исходника зафиксирован фокус диаграммы: Support utilities, metadata write-preparation zones, validators, and metadata builders for the storage layer.. На схеме отражено примерно 14 узлов и 11 связей, поэтому её удобно использовать для проверки влияния изменений, согласования интерфейсов и подготовки рефакторинга. Ключевые блоки/подграфы: Support Components, Validation, Metadata Builders. Показательные узлы для быстрого чтения: ArrowDataConverter records → PyArrow, RetentionPolicy vacuum / retention, MetadataWriter layer-specific metadata writes, metadata_writer_operations target + YAML + retry telemetry, CsvExporter Delta → CSV export, DQReportWriter DQ reports JSON.</w:t>
-      </w:r>
-    </w:p>
-    <w:bookmarkEnd w:id="97"/>
-    <w:bookmarkStart w:id="98" w:name="метаданные-14"/>
+        <w:t xml:space="preserve">Диаграмма «Storage Support Components» из architecture-набора детализирует конкретный архитектурный компонент или подсистему BioETL. Она представлена в формате блок-схема потоков (flowchart) и служит ориентиром на уровне детализации «System / Component». В комментариях исходника зафиксирован фокус диаграммы: Support utilities, metadata write-preparation zones, validators, and metadata builders for the storage layer.. Схема имеет плотность порядка 14 узлов и 11 связей; её удобно использовать как обзорный архитектурный срез для проверки влияния изменений, согласования интерфейсов и подготовки рефакторинга, но не как исчерпывающий каталог текущей кодовой поверхности. Ключевые блоки/подграфы: Support Components, Validation, Metadata Builders. Показательные узлы для быстрого чтения: ArrowDataConverter records → PyArrow, RetentionPolicy vacuum / retention, MetadataWriter layer-specific metadata writes, metadata_writer_operations target + YAML + retry telemetry, CsvExporter Delta → CSV export, DQReportWriter DQ reports JSON.</w:t>
+      </w:r>
+    </w:p>
+    <w:bookmarkEnd w:id="82"/>
+    <w:bookmarkStart w:id="86" w:name="метаданные-14"/>
     <w:p>
       <w:pPr>
         <w:pStyle w:val="Heading3"/>
@@ -3689,15 +3704,15 @@
         <w:br w:type="page"/>
       </w:r>
     </w:p>
-    <w:bookmarkEnd w:id="98"/>
-    <w:bookmarkEnd w:id="99"/>
-    <w:bookmarkStart w:id="105" w:name="dq-system-data-quality-dq-system"/>
-    <w:p>
-      <w:pPr>
-        <w:pStyle w:val="Heading2"/>
-      </w:pPr>
-      <w:r>
-        <w:t xml:space="preserve">07-dq-system — Data Quality (DQ) System</w:t>
+    <w:p>
+      <w:pPr>
+        <w:pStyle w:val="FirstParagraph"/>
+      </w:pPr>
+      <w:r>
+        <w:t xml:space="preserve"> </w:t>
+      </w:r>
+      <w:r>
+        <w:t xml:space="preserve">## 07-dq-system — Data Quality (DQ) System</w:t>
       </w:r>
     </w:p>
     <w:p>
@@ -3709,18 +3724,18 @@
           <wp:inline>
             <wp:extent cx="5334000" cy="2588471"/>
             <wp:effectExtent b="0" l="0" r="0" t="0"/>
-            <wp:docPr descr="07-dq-system" title="" id="101" name="Picture"/>
+            <wp:docPr descr="07-dq-system" title="" id="84" name="Picture"/>
             <a:graphic>
               <a:graphicData uri="http://schemas.openxmlformats.org/drawingml/2006/picture">
                 <pic:pic>
                   <pic:nvPicPr>
-                    <pic:cNvPr descr="../architecture/png/07-dq-system.png" id="102" name="Picture"/>
+                    <pic:cNvPr descr="file:///E:/g-drive/05_AI/github/BioactivityDataAcquisition2/docs/02-architecture/diagrams/architecture/png/07-dq-system.png" id="85" name="Picture"/>
                     <pic:cNvPicPr>
                       <a:picLocks noChangeArrowheads="1" noChangeAspect="1"/>
                     </pic:cNvPicPr>
                   </pic:nvPicPr>
                   <pic:blipFill>
-                    <a:blip r:embed="rId100"/>
+                    <a:blip r:embed="rId83"/>
                     <a:stretch>
                       <a:fillRect/>
                     </a:stretch>
@@ -3755,7 +3770,8 @@
         <w:t xml:space="preserve">07-dq-system</w:t>
       </w:r>
     </w:p>
-    <w:bookmarkStart w:id="103" w:name="описание-15"/>
+    <w:bookmarkEnd w:id="86"/>
+    <w:bookmarkStart w:id="87" w:name="описание-15"/>
     <w:p>
       <w:pPr>
         <w:pStyle w:val="Heading3"/>
@@ -3769,11 +3785,11 @@
         <w:pStyle w:val="FirstParagraph"/>
       </w:pPr>
       <w:r>
-        <w:t xml:space="preserve">Диаграмма «Data Quality (DQ) System» из architecture-набора детализирует конкретный архитектурный компонент или подсистему BioETL. Она представлена в формате блок-схема потоков (flowchart) и служит ориентиром на уровне детализации «System / Component». В комментариях исходника зафиксирован фокус диаграммы: DQ monitoring, analysis, and reporting across all medallion layers.. На схеме отражено примерно 22 узлов и 24 связей, поэтому её удобно использовать для проверки влияния изменений, согласования интерфейсов и подготовки рефакторинга. Ключевые блоки/подграфы: Domain Ports, Application Services, Application DQ Analysis, Pipeline Integration, Domain Value Objects, Infrastructure Implementations. Показательные узлы для быстрого чтения: DQMonitorPort, BronzeDQAnalyzerPort, SilverDQAnalyzerPort, GoldDQAnalyzerPort, DQReportWriterPort, DataQualityService ——– + evaluate(context, executor). Примечание: Decomposed into 07a-dq-analysis, 07b-dq-pipeline.</w:t>
-      </w:r>
-    </w:p>
-    <w:bookmarkEnd w:id="103"/>
-    <w:bookmarkStart w:id="104" w:name="метаданные-15"/>
+        <w:t xml:space="preserve">Диаграмма «Data Quality (DQ) System» из architecture-набора детализирует конкретный архитектурный компонент или подсистему BioETL. Она представлена в формате блок-схема потоков (flowchart) и служит ориентиром на уровне детализации «System / Component». В комментариях исходника зафиксирован фокус диаграммы: DQ monitoring, analysis, and reporting across all medallion layers.. Схема имеет плотность порядка 22 узлов и 24 связей; её удобно использовать как обзорный архитектурный срез для проверки влияния изменений, согласования интерфейсов и подготовки рефакторинга, но не как исчерпывающий каталог текущей кодовой поверхности. Ключевые блоки/подграфы: Domain Ports, Application Services, Application DQ Analysis, Pipeline Integration, Domain Value Objects, Infrastructure Implementations. Показательные узлы для быстрого чтения: DQMonitorPort, BronzeDQAnalyzerPort, SilverDQAnalyzerPort, GoldDQAnalyzerPort, DQReportWriterPort, DataQualityService ——– + evaluate(context, executor). Примечание: Decomposed into 07a-dq-analysis, 07b-dq-pipeline.</w:t>
+      </w:r>
+    </w:p>
+    <w:bookmarkEnd w:id="87"/>
+    <w:bookmarkStart w:id="91" w:name="метаданные-15"/>
     <w:p>
       <w:pPr>
         <w:pStyle w:val="Heading3"/>
@@ -3871,15 +3887,15 @@
         <w:br w:type="page"/>
       </w:r>
     </w:p>
-    <w:bookmarkEnd w:id="104"/>
-    <w:bookmarkEnd w:id="105"/>
-    <w:bookmarkStart w:id="111" w:name="a-dq-analysis-dq-analysis-services"/>
-    <w:p>
-      <w:pPr>
-        <w:pStyle w:val="Heading2"/>
-      </w:pPr>
-      <w:r>
-        <w:t xml:space="preserve">07a-dq-analysis — DQ Analysis Services</w:t>
+    <w:p>
+      <w:pPr>
+        <w:pStyle w:val="FirstParagraph"/>
+      </w:pPr>
+      <w:r>
+        <w:t xml:space="preserve"> </w:t>
+      </w:r>
+      <w:r>
+        <w:t xml:space="preserve">## 07a-dq-analysis — DQ Analysis Services</w:t>
       </w:r>
     </w:p>
     <w:p>
@@ -3891,18 +3907,18 @@
           <wp:inline>
             <wp:extent cx="5334000" cy="2953026"/>
             <wp:effectExtent b="0" l="0" r="0" t="0"/>
-            <wp:docPr descr="07a-dq-analysis" title="" id="107" name="Picture"/>
+            <wp:docPr descr="07a-dq-analysis" title="" id="89" name="Picture"/>
             <a:graphic>
               <a:graphicData uri="http://schemas.openxmlformats.org/drawingml/2006/picture">
                 <pic:pic>
                   <pic:nvPicPr>
-                    <pic:cNvPr descr="../architecture/png/07a-dq-analysis.png" id="108" name="Picture"/>
+                    <pic:cNvPr descr="file:///E:/g-drive/05_AI/github/BioactivityDataAcquisition2/docs/02-architecture/diagrams/architecture/png/07a-dq-analysis.png" id="90" name="Picture"/>
                     <pic:cNvPicPr>
                       <a:picLocks noChangeArrowheads="1" noChangeAspect="1"/>
                     </pic:cNvPicPr>
                   </pic:nvPicPr>
                   <pic:blipFill>
-                    <a:blip r:embed="rId106"/>
+                    <a:blip r:embed="rId88"/>
                     <a:stretch>
                       <a:fillRect/>
                     </a:stretch>
@@ -3937,7 +3953,8 @@
         <w:t xml:space="preserve">07a-dq-analysis</w:t>
       </w:r>
     </w:p>
-    <w:bookmarkStart w:id="109" w:name="описание-16"/>
+    <w:bookmarkEnd w:id="91"/>
+    <w:bookmarkStart w:id="92" w:name="описание-16"/>
     <w:p>
       <w:pPr>
         <w:pStyle w:val="Heading3"/>
@@ -3951,11 +3968,11 @@
         <w:pStyle w:val="FirstParagraph"/>
       </w:pPr>
       <w:r>
-        <w:t xml:space="preserve">Диаграмма «DQ Analysis Services» из architecture-набора детализирует конкретный архитектурный компонент или подсистему BioETL. Она представлена в формате блок-схема потоков (flowchart) и служит ориентиром на уровне детализации «System / Component». В комментариях исходника зафиксирован фокус диаграммы: Domain ports, application services, analyzers, and anomaly detection for Data Quality.. На схеме отражено примерно 12 узлов и 11 связей, поэтому её удобно использовать для проверки влияния изменений, согласования интерфейсов и подготовки рефакторинга. Ключевые блоки/подграфы: Domain Ports, Application Services, DQ Analyzers, Anomaly Detection. Показательные узлы для быстрого чтения: DQMonitorPort, BronzeDQAnalyzerPort, SilverDQAnalyzerPort, GoldDQAnalyzerPort, DQReportWriterPort, DataQualityService evaluate(context, executor).</w:t>
-      </w:r>
-    </w:p>
-    <w:bookmarkEnd w:id="109"/>
-    <w:bookmarkStart w:id="110" w:name="метаданные-16"/>
+        <w:t xml:space="preserve">Диаграмма «DQ Analysis Services» из architecture-набора детализирует конкретный архитектурный компонент или подсистему BioETL. Она представлена в формате блок-схема потоков (flowchart) и служит ориентиром на уровне детализации «System / Component». В комментариях исходника зафиксирован фокус диаграммы: Domain ports, application services, analyzers, and anomaly detection for Data Quality.. Схема имеет плотность порядка 12 узлов и 11 связей; её удобно использовать как обзорный архитектурный срез для проверки влияния изменений, согласования интерфейсов и подготовки рефакторинга, но не как исчерпывающий каталог текущей кодовой поверхности. Ключевые блоки/подграфы: Domain Ports, Application Services, DQ Analyzers, Anomaly Detection. Показательные узлы для быстрого чтения: DQMonitorPort, BronzeDQAnalyzerPort, SilverDQAnalyzerPort, GoldDQAnalyzerPort, DQReportWriterPort, DataQualityService evaluate(context, executor).</w:t>
+      </w:r>
+    </w:p>
+    <w:bookmarkEnd w:id="92"/>
+    <w:bookmarkStart w:id="96" w:name="метаданные-16"/>
     <w:p>
       <w:pPr>
         <w:pStyle w:val="Heading3"/>
@@ -4053,15 +4070,15 @@
         <w:br w:type="page"/>
       </w:r>
     </w:p>
-    <w:bookmarkEnd w:id="110"/>
-    <w:bookmarkEnd w:id="111"/>
-    <w:bookmarkStart w:id="117" w:name="b-dq-pipeline-dq-pipeline-integration"/>
-    <w:p>
-      <w:pPr>
-        <w:pStyle w:val="Heading2"/>
-      </w:pPr>
-      <w:r>
-        <w:t xml:space="preserve">07b-dq-pipeline — DQ Pipeline Integration</w:t>
+    <w:p>
+      <w:pPr>
+        <w:pStyle w:val="FirstParagraph"/>
+      </w:pPr>
+      <w:r>
+        <w:t xml:space="preserve"> </w:t>
+      </w:r>
+      <w:r>
+        <w:t xml:space="preserve">## 07b-dq-pipeline — DQ Pipeline Integration</w:t>
       </w:r>
     </w:p>
     <w:p>
@@ -4073,18 +4090,18 @@
           <wp:inline>
             <wp:extent cx="5334000" cy="1778000"/>
             <wp:effectExtent b="0" l="0" r="0" t="0"/>
-            <wp:docPr descr="07b-dq-pipeline" title="" id="113" name="Picture"/>
+            <wp:docPr descr="07b-dq-pipeline" title="" id="94" name="Picture"/>
             <a:graphic>
               <a:graphicData uri="http://schemas.openxmlformats.org/drawingml/2006/picture">
                 <pic:pic>
                   <pic:nvPicPr>
-                    <pic:cNvPr descr="../architecture/png/07b-dq-pipeline.png" id="114" name="Picture"/>
+                    <pic:cNvPr descr="file:///E:/g-drive/05_AI/github/BioactivityDataAcquisition2/docs/02-architecture/diagrams/architecture/png/07b-dq-pipeline.png" id="95" name="Picture"/>
                     <pic:cNvPicPr>
                       <a:picLocks noChangeArrowheads="1" noChangeAspect="1"/>
                     </pic:cNvPicPr>
                   </pic:nvPicPr>
                   <pic:blipFill>
-                    <a:blip r:embed="rId112"/>
+                    <a:blip r:embed="rId93"/>
                     <a:stretch>
                       <a:fillRect/>
                     </a:stretch>
@@ -4119,7 +4136,8 @@
         <w:t xml:space="preserve">07b-dq-pipeline</w:t>
       </w:r>
     </w:p>
-    <w:bookmarkStart w:id="115" w:name="описание-17"/>
+    <w:bookmarkEnd w:id="96"/>
+    <w:bookmarkStart w:id="97" w:name="описание-17"/>
     <w:p>
       <w:pPr>
         <w:pStyle w:val="Heading3"/>
@@ -4133,11 +4151,11 @@
         <w:pStyle w:val="FirstParagraph"/>
       </w:pPr>
       <w:r>
-        <w:t xml:space="preserve">Диаграмма «DQ Pipeline Integration» из architecture-набора детализирует конкретный архитектурный компонент или подсистему BioETL. Она представлена в формате блок-схема потоков (flowchart) и служит ориентиром на уровне детализации «System / Component». В комментариях исходника зафиксирован фокус диаграммы: Pipeline DQ checks, domain value objects, and infrastructure config/report writers.. На схеме отражено примерно 10 узлов и 4 связей, поэтому её удобно использовать для проверки влияния изменений, согласования интерфейсов и подготовки рефакторинга. Ключевые блоки/подграфы: Pipeline Integration, Domain Value Objects, Infrastructure Implementations. Показательные узлы для быстрого чтения: BatchTransformer _check_dq_thresholds(), QuarantineManager quarantines failed records, ErrorClassifier recoverable vs fatal, DQMetrics null_rate / duplicate_rate, DQResult passed / error_rate, DQReport layer / table_name / results.</w:t>
-      </w:r>
-    </w:p>
-    <w:bookmarkEnd w:id="115"/>
-    <w:bookmarkStart w:id="116" w:name="метаданные-17"/>
+        <w:t xml:space="preserve">Диаграмма «DQ Pipeline Integration» из architecture-набора детализирует конкретный архитектурный компонент или подсистему BioETL. Она представлена в формате блок-схема потоков (flowchart) и служит ориентиром на уровне детализации «System / Component». В комментариях исходника зафиксирован фокус диаграммы: Pipeline DQ checks, domain value objects, and infrastructure config/report writers.. Схема имеет плотность порядка 10 узлов и 4 связей; её удобно использовать как обзорный архитектурный срез для проверки влияния изменений, согласования интерфейсов и подготовки рефакторинга, но не как исчерпывающий каталог текущей кодовой поверхности. Ключевые блоки/подграфы: Pipeline Integration, Domain Value Objects, Infrastructure Implementations. Показательные узлы для быстрого чтения: BatchTransformer _check_dq_thresholds(), QuarantineManager quarantines failed records, ErrorClassifier recoverable vs fatal, DQMetrics null_rate / duplicate_rate, DQResult passed / error_rate, DQReport layer / table_name / results.</w:t>
+      </w:r>
+    </w:p>
+    <w:bookmarkEnd w:id="97"/>
+    <w:bookmarkStart w:id="101" w:name="метаданные-17"/>
     <w:p>
       <w:pPr>
         <w:pStyle w:val="Heading3"/>
@@ -4235,15 +4253,15 @@
         <w:br w:type="page"/>
       </w:r>
     </w:p>
-    <w:bookmarkEnd w:id="116"/>
-    <w:bookmarkEnd w:id="117"/>
-    <w:bookmarkStart w:id="123" w:name="X5fb48ff5c690b77151dbf1ac0dc0d20b428ceee"/>
-    <w:p>
-      <w:pPr>
-        <w:pStyle w:val="Heading2"/>
-      </w:pPr>
-      <w:r>
-        <w:t xml:space="preserve">08-composite-pipeline — Composite Pipeline Architecture</w:t>
+    <w:p>
+      <w:pPr>
+        <w:pStyle w:val="FirstParagraph"/>
+      </w:pPr>
+      <w:r>
+        <w:t xml:space="preserve"> </w:t>
+      </w:r>
+      <w:r>
+        <w:t xml:space="preserve">## 08-composite-pipeline — Composite Pipeline Architecture</w:t>
       </w:r>
     </w:p>
     <w:p>
@@ -4253,20 +4271,20 @@
       <w:r>
         <w:drawing>
           <wp:inline>
-            <wp:extent cx="5334000" cy="3802455"/>
+            <wp:extent cx="5334000" cy="3817574"/>
             <wp:effectExtent b="0" l="0" r="0" t="0"/>
-            <wp:docPr descr="08-composite-pipeline" title="" id="119" name="Picture"/>
+            <wp:docPr descr="08-composite-pipeline" title="" id="99" name="Picture"/>
             <a:graphic>
               <a:graphicData uri="http://schemas.openxmlformats.org/drawingml/2006/picture">
                 <pic:pic>
                   <pic:nvPicPr>
-                    <pic:cNvPr descr="../architecture/png/08-composite-pipeline.png" id="120" name="Picture"/>
+                    <pic:cNvPr descr="file:///E:/g-drive/05_AI/github/BioactivityDataAcquisition2/docs/02-architecture/diagrams/architecture/png/08-composite-pipeline.png" id="100" name="Picture"/>
                     <pic:cNvPicPr>
                       <a:picLocks noChangeArrowheads="1" noChangeAspect="1"/>
                     </pic:cNvPicPr>
                   </pic:nvPicPr>
                   <pic:blipFill>
-                    <a:blip r:embed="rId118"/>
+                    <a:blip r:embed="rId98"/>
                     <a:stretch>
                       <a:fillRect/>
                     </a:stretch>
@@ -4274,7 +4292,7 @@
                   <pic:spPr bwMode="auto">
                     <a:xfrm>
                       <a:off x="0" y="0"/>
-                      <a:ext cx="5334000" cy="3802455"/>
+                      <a:ext cx="5334000" cy="3817574"/>
                     </a:xfrm>
                     <a:prstGeom prst="rect">
                       <a:avLst/>
@@ -4301,7 +4319,8 @@
         <w:t xml:space="preserve">08-composite-pipeline</w:t>
       </w:r>
     </w:p>
-    <w:bookmarkStart w:id="121" w:name="описание-18"/>
+    <w:bookmarkEnd w:id="101"/>
+    <w:bookmarkStart w:id="102" w:name="описание-18"/>
     <w:p>
       <w:pPr>
         <w:pStyle w:val="Heading3"/>
@@ -4315,11 +4334,11 @@
         <w:pStyle w:val="FirstParagraph"/>
       </w:pPr>
       <w:r>
-        <w:t xml:space="preserve">Диаграмма «Composite Pipeline Architecture» из architecture-набора детализирует конкретный архитектурный компонент или подсистему BioETL. Она представлена в формате блок-схема потоков (flowchart) и служит ориентиром на уровне детализации «System / Component». В комментариях исходника зафиксирован фокус диаграммы: seed → dependencies → enrichers (parallel) → merge flow.. На схеме отражено примерно 33 узлов и 34 связей, поэтому её удобно использовать для проверки влияния изменений, согласования интерфейсов и подготовки рефакторинга. Ключевые блоки/подграфы: Composite Configuration, CompositePipelineRunner, State Machine, Execution Components, Dependencies (Sequential), Enrichers (Parallel Fan-Out). Показательные узлы для быстрого чтения: CompositeConfig, SeedConfig, DependencyConfig, EnricherConfig, MergeConfig, Config overview seed + dependencies enrichers + merge. Примечание: Decomposed into 08a-composite-config, 08b-composite-execution.</w:t>
-      </w:r>
-    </w:p>
-    <w:bookmarkEnd w:id="121"/>
-    <w:bookmarkStart w:id="122" w:name="метаданные-18"/>
+        <w:t xml:space="preserve">Диаграмма «Composite Pipeline Architecture» из architecture-набора детализирует конкретный архитектурный компонент или подсистему BioETL. Она представлена в формате блок-схема потоков (flowchart) и служит ориентиром на уровне детализации «System / Component». В комментариях исходника зафиксирован фокус диаграммы: seed → dependencies → enrichers (parallel) → merge flow.. Схема имеет плотность порядка 33 узлов и 34 связей; её удобно использовать как обзорный архитектурный срез для проверки влияния изменений, согласования интерфейсов и подготовки рефакторинга, но не как исчерпывающий каталог текущей кодовой поверхности. Ключевые блоки/подграфы: Composite Configuration, CompositePipelineRunner, State Machine, Execution Components, Dependencies (Sequential), Enrichers (Parallel Fan-Out). Показательные узлы для быстрого чтения: CompositeConfig, SeedConfig, DependencyConfig, EnricherConfig, MergeConfig, Config overview seed + dependencies enrichers + merge. Примечание: Decomposed into 08a-composite-config, 08b-composite-execution.</w:t>
+      </w:r>
+    </w:p>
+    <w:bookmarkEnd w:id="102"/>
+    <w:bookmarkStart w:id="106" w:name="метаданные-18"/>
     <w:p>
       <w:pPr>
         <w:pStyle w:val="Heading3"/>
@@ -4417,15 +4436,15 @@
         <w:br w:type="page"/>
       </w:r>
     </w:p>
-    <w:bookmarkEnd w:id="122"/>
-    <w:bookmarkEnd w:id="123"/>
-    <w:bookmarkStart w:id="129" w:name="X8b29ebd349e225c8550a9aa95581a5058f2b2ff"/>
-    <w:p>
-      <w:pPr>
-        <w:pStyle w:val="Heading2"/>
-      </w:pPr>
-      <w:r>
-        <w:t xml:space="preserve">08a-composite-config — Composite Pipeline Configuration &amp; FSM</w:t>
+    <w:p>
+      <w:pPr>
+        <w:pStyle w:val="FirstParagraph"/>
+      </w:pPr>
+      <w:r>
+        <w:t xml:space="preserve"> </w:t>
+      </w:r>
+      <w:r>
+        <w:t xml:space="preserve">## 08a-composite-config — Composite Pipeline Configuration &amp; FSM</w:t>
       </w:r>
     </w:p>
     <w:p>
@@ -4437,18 +4456,18 @@
           <wp:inline>
             <wp:extent cx="5334000" cy="2028078"/>
             <wp:effectExtent b="0" l="0" r="0" t="0"/>
-            <wp:docPr descr="08a-composite-config" title="" id="125" name="Picture"/>
+            <wp:docPr descr="08a-composite-config" title="" id="104" name="Picture"/>
             <a:graphic>
               <a:graphicData uri="http://schemas.openxmlformats.org/drawingml/2006/picture">
                 <pic:pic>
                   <pic:nvPicPr>
-                    <pic:cNvPr descr="../architecture/png/08a-composite-config.png" id="126" name="Picture"/>
+                    <pic:cNvPr descr="file:///E:/g-drive/05_AI/github/BioactivityDataAcquisition2/docs/02-architecture/diagrams/architecture/png/08a-composite-config.png" id="105" name="Picture"/>
                     <pic:cNvPicPr>
                       <a:picLocks noChangeArrowheads="1" noChangeAspect="1"/>
                     </pic:cNvPicPr>
                   </pic:nvPicPr>
                   <pic:blipFill>
-                    <a:blip r:embed="rId124"/>
+                    <a:blip r:embed="rId103"/>
                     <a:stretch>
                       <a:fillRect/>
                     </a:stretch>
@@ -4483,7 +4502,8 @@
         <w:t xml:space="preserve">08a-composite-config</w:t>
       </w:r>
     </w:p>
-    <w:bookmarkStart w:id="127" w:name="описание-19"/>
+    <w:bookmarkEnd w:id="106"/>
+    <w:bookmarkStart w:id="107" w:name="описание-19"/>
     <w:p>
       <w:pPr>
         <w:pStyle w:val="Heading3"/>
@@ -4497,11 +4517,11 @@
         <w:pStyle w:val="FirstParagraph"/>
       </w:pPr>
       <w:r>
-        <w:t xml:space="preserve">Диаграмма «Composite Pipeline Configuration &amp; FSM» из architecture-набора детализирует конкретный архитектурный компонент или подсистему BioETL. Она представлена в формате блок-схема потоков (flowchart) и служит ориентиром на уровне детализации «System / Component». В комментариях исходника зафиксирован фокус диаграммы: Config hierarchy (CompositeConfig → sub-configs) and execution state machine.. На схеме отражено примерно 13 узлов и 13 связей, поэтому её удобно использовать для проверки влияния изменений, согласования интерфейсов и подготовки рефакторинга. Ключевые блоки/подграфы: Composite Configuration, State Machine. Показательные узлы для быстрого чтения: CompositeConfig name / seed / deps / enrichers / merge, SeedConfig, DependencyConfig, EnricherConfig, MergeConfig, Config Details: seed → deps → enrichers → merge.</w:t>
-      </w:r>
-    </w:p>
-    <w:bookmarkEnd w:id="127"/>
-    <w:bookmarkStart w:id="128" w:name="метаданные-19"/>
+        <w:t xml:space="preserve">Диаграмма «Composite Pipeline Configuration &amp; FSM» из architecture-набора детализирует конкретный архитектурный компонент или подсистему BioETL. Она представлена в формате блок-схема потоков (flowchart) и служит ориентиром на уровне детализации «System / Component». В комментариях исходника зафиксирован фокус диаграммы: Config hierarchy (CompositeConfig → sub-configs) and execution state machine.. Схема имеет плотность порядка 13 узлов и 13 связей; её удобно использовать как обзорный архитектурный срез для проверки влияния изменений, согласования интерфейсов и подготовки рефакторинга, но не как исчерпывающий каталог текущей кодовой поверхности. Ключевые блоки/подграфы: Composite Configuration, State Machine. Показательные узлы для быстрого чтения: CompositeConfig name / seed / deps / enrichers / merge, SeedConfig, DependencyConfig, EnricherConfig, MergeConfig, Config Details: seed → deps → enrichers → merge.</w:t>
+      </w:r>
+    </w:p>
+    <w:bookmarkEnd w:id="107"/>
+    <w:bookmarkStart w:id="111" w:name="метаданные-19"/>
     <w:p>
       <w:pPr>
         <w:pStyle w:val="Heading3"/>
@@ -4599,15 +4619,15 @@
         <w:br w:type="page"/>
       </w:r>
     </w:p>
-    <w:bookmarkEnd w:id="128"/>
-    <w:bookmarkEnd w:id="129"/>
-    <w:bookmarkStart w:id="135" w:name="X808e4bbe0f862536c09e7c402e05ea91501d1d7"/>
-    <w:p>
-      <w:pPr>
-        <w:pStyle w:val="Heading2"/>
-      </w:pPr>
-      <w:r>
-        <w:t xml:space="preserve">08b-composite-execution — Composite Pipeline Execution</w:t>
+    <w:p>
+      <w:pPr>
+        <w:pStyle w:val="FirstParagraph"/>
+      </w:pPr>
+      <w:r>
+        <w:t xml:space="preserve"> </w:t>
+      </w:r>
+      <w:r>
+        <w:t xml:space="preserve">## 08b-composite-execution — Composite Pipeline Execution</w:t>
       </w:r>
     </w:p>
     <w:p>
@@ -4617,20 +4637,20 @@
       <w:r>
         <w:drawing>
           <wp:inline>
-            <wp:extent cx="5334000" cy="4136571"/>
+            <wp:extent cx="5334000" cy="3989151"/>
             <wp:effectExtent b="0" l="0" r="0" t="0"/>
-            <wp:docPr descr="08b-composite-execution" title="" id="131" name="Picture"/>
+            <wp:docPr descr="08b-composite-execution" title="" id="109" name="Picture"/>
             <a:graphic>
               <a:graphicData uri="http://schemas.openxmlformats.org/drawingml/2006/picture">
                 <pic:pic>
                   <pic:nvPicPr>
-                    <pic:cNvPr descr="../architecture/png/08b-composite-execution.png" id="132" name="Picture"/>
+                    <pic:cNvPr descr="file:///E:/g-drive/05_AI/github/BioactivityDataAcquisition2/docs/02-architecture/diagrams/architecture/png/08b-composite-execution.png" id="110" name="Picture"/>
                     <pic:cNvPicPr>
                       <a:picLocks noChangeArrowheads="1" noChangeAspect="1"/>
                     </pic:cNvPicPr>
                   </pic:nvPicPr>
                   <pic:blipFill>
-                    <a:blip r:embed="rId130"/>
+                    <a:blip r:embed="rId108"/>
                     <a:stretch>
                       <a:fillRect/>
                     </a:stretch>
@@ -4638,7 +4658,7 @@
                   <pic:spPr bwMode="auto">
                     <a:xfrm>
                       <a:off x="0" y="0"/>
-                      <a:ext cx="5334000" cy="4136571"/>
+                      <a:ext cx="5334000" cy="3989151"/>
                     </a:xfrm>
                     <a:prstGeom prst="rect">
                       <a:avLst/>
@@ -4665,7 +4685,8 @@
         <w:t xml:space="preserve">08b-composite-execution</w:t>
       </w:r>
     </w:p>
-    <w:bookmarkStart w:id="133" w:name="описание-20"/>
+    <w:bookmarkEnd w:id="111"/>
+    <w:bookmarkStart w:id="112" w:name="описание-20"/>
     <w:p>
       <w:pPr>
         <w:pStyle w:val="Heading3"/>
@@ -4679,11 +4700,11 @@
         <w:pStyle w:val="FirstParagraph"/>
       </w:pPr>
       <w:r>
-        <w:t xml:space="preserve">Диаграмма «Composite Pipeline Execution» из architecture-набора детализирует конкретный архитектурный компонент или подсистему BioETL. Она представлена в формате блок-схема потоков (flowchart) и служит ориентиром на уровне детализации «System / Component». В комментариях исходника зафиксирован фокус диаграммы: Runner orchestration: seed → deps → enrichers (parallel) → merge, with checkpointing and cross-validation.. На схеме отражено примерно 20 узлов и 20 связей, поэтому её удобно использовать для проверки влияния изменений, согласования интерфейсов и подготовки рефакторинга. Ключевые блоки/подграфы: CompositePipelineRunner, Preflight, Execution Components, Dependencies (Sequential), Enrichers (Parallel Fan-Out), Merge Phase. Показательные узлы для быстрого чтения: CompositePipelineRunner orchestrates full execution, PreflightValidator, Seed Pipeline, DependencyCoordinator, Dependency 1, EnrichmentCoordinator.</w:t>
-      </w:r>
-    </w:p>
-    <w:bookmarkEnd w:id="133"/>
-    <w:bookmarkStart w:id="134" w:name="метаданные-20"/>
+        <w:t xml:space="preserve">Диаграмма «Composite Pipeline Execution» из architecture-набора детализирует конкретный архитектурный компонент или подсистему BioETL. Она представлена в формате блок-схема потоков (flowchart) и служит ориентиром на уровне детализации «System / Component». В комментариях исходника зафиксирован фокус диаграммы: Runner orchestration: seed → deps → enrichers (parallel) → merge, with checkpointing and cross-validation.. Схема имеет плотность порядка 20 узлов и 20 связей; её удобно использовать как обзорный архитектурный срез для проверки влияния изменений, согласования интерфейсов и подготовки рефакторинга, но не как исчерпывающий каталог текущей кодовой поверхности. Ключевые блоки/подграфы: CompositePipelineRunner, Preflight, Execution Components, Dependencies (Sequential), Enrichers (Parallel Fan-Out), Merge Phase. Показательные узлы для быстрого чтения: CompositePipelineRunner orchestrates full execution, PreflightValidator, Seed Pipeline, DependencyCoordinator, Dependency 1, EnrichmentCoordinator.</w:t>
+      </w:r>
+    </w:p>
+    <w:bookmarkEnd w:id="112"/>
+    <w:bookmarkStart w:id="116" w:name="метаданные-20"/>
     <w:p>
       <w:pPr>
         <w:pStyle w:val="Heading3"/>
@@ -4781,15 +4802,15 @@
         <w:br w:type="page"/>
       </w:r>
     </w:p>
-    <w:bookmarkEnd w:id="134"/>
-    <w:bookmarkEnd w:id="135"/>
-    <w:bookmarkStart w:id="141" w:name="observability-stack-observability-stack"/>
-    <w:p>
-      <w:pPr>
-        <w:pStyle w:val="Heading2"/>
-      </w:pPr>
-      <w:r>
-        <w:t xml:space="preserve">09-observability-stack — Observability Stack</w:t>
+    <w:p>
+      <w:pPr>
+        <w:pStyle w:val="FirstParagraph"/>
+      </w:pPr>
+      <w:r>
+        <w:t xml:space="preserve"> </w:t>
+      </w:r>
+      <w:r>
+        <w:t xml:space="preserve">## 09-observability-stack — Observability Stack</w:t>
       </w:r>
     </w:p>
     <w:p>
@@ -4801,18 +4822,18 @@
           <wp:inline>
             <wp:extent cx="5334000" cy="3594272"/>
             <wp:effectExtent b="0" l="0" r="0" t="0"/>
-            <wp:docPr descr="09-observability-stack" title="" id="137" name="Picture"/>
+            <wp:docPr descr="09-observability-stack" title="" id="114" name="Picture"/>
             <a:graphic>
               <a:graphicData uri="http://schemas.openxmlformats.org/drawingml/2006/picture">
                 <pic:pic>
                   <pic:nvPicPr>
-                    <pic:cNvPr descr="../architecture/png/09-observability-stack.png" id="138" name="Picture"/>
+                    <pic:cNvPr descr="file:///E:/g-drive/05_AI/github/BioactivityDataAcquisition2/docs/02-architecture/diagrams/architecture/png/09-observability-stack.png" id="115" name="Picture"/>
                     <pic:cNvPicPr>
                       <a:picLocks noChangeArrowheads="1" noChangeAspect="1"/>
                     </pic:cNvPicPr>
                   </pic:nvPicPr>
                   <pic:blipFill>
-                    <a:blip r:embed="rId136"/>
+                    <a:blip r:embed="rId113"/>
                     <a:stretch>
                       <a:fillRect/>
                     </a:stretch>
@@ -4847,7 +4868,8 @@
         <w:t xml:space="preserve">09-observability-stack</w:t>
       </w:r>
     </w:p>
-    <w:bookmarkStart w:id="139" w:name="описание-21"/>
+    <w:bookmarkEnd w:id="116"/>
+    <w:bookmarkStart w:id="117" w:name="описание-21"/>
     <w:p>
       <w:pPr>
         <w:pStyle w:val="Heading3"/>
@@ -4861,11 +4883,11 @@
         <w:pStyle w:val="FirstParagraph"/>
       </w:pPr>
       <w:r>
-        <w:t xml:space="preserve">Диаграмма «Observability Stack» из architecture-набора детализирует конкретный архитектурный компонент или подсистему BioETL. Она представлена в формате блок-схема потоков (flowchart) и служит ориентиром на уровне детализации «System / Component». В комментариях исходника зафиксирован фокус диаграммы: Logging, Metrics, Tracing architecture.. На схеме отражено примерно 24 узлов и 14 связей, поэтому её удобно использовать для проверки влияния изменений, согласования интерфейсов и подготовки рефакторинга. Ключевые блоки/подграфы: Domain Ports, Application Observability, Infrastructure: Logging, Infrastructure: Metrics, Infrastructure: Tracing, Infrastructure: Anomaly Detection. Показательные узлы для быстрого чтения: LoggerPort (Protocol) bind + info/warn/error/debug/exception, MetricsPort (Protocol) observe_histogram + increment_counter set_gauge + close, TracingPort (Protocol) get_tracer + close, DQMonitorPort (Protocol) add_metric + check_quality update_baseline, PipelineObserver logger + metrics + tracing hooks, BatchMetricsRecorder track size/processed/error/quarantine. Примечание: Decomposed into 09a-observability-app, 09b-observability-infra.</w:t>
-      </w:r>
-    </w:p>
-    <w:bookmarkEnd w:id="139"/>
-    <w:bookmarkStart w:id="140" w:name="метаданные-21"/>
+        <w:t xml:space="preserve">Диаграмма «Observability Stack» из architecture-набора детализирует конкретный архитектурный компонент или подсистему BioETL. Она представлена в формате блок-схема потоков (flowchart) и служит ориентиром на уровне детализации «System / Component». В комментариях исходника зафиксирован фокус диаграммы: Logging, Metrics, Tracing architecture.. Схема имеет плотность порядка 24 узлов и 14 связей; её удобно использовать как обзорный архитектурный срез для проверки влияния изменений, согласования интерфейсов и подготовки рефакторинга, но не как исчерпывающий каталог текущей кодовой поверхности. Ключевые блоки/подграфы: Domain Ports, Application Observability, Infrastructure: Logging, Infrastructure: Metrics, Infrastructure: Tracing, Infrastructure: Anomaly Detection. Показательные узлы для быстрого чтения: LoggerPort (Protocol) bind + info/warn/error/debug/exception, MetricsPort (Protocol) observe_histogram + increment_counter set_gauge + close, TracingPort (Protocol) get_tracer + close, DQMonitorPort (Protocol) add_metric + check_quality update_baseline, PipelineObserver logger + metrics + tracing hooks, BatchMetricsRecorderService track size/processed/error/quarantine. Примечание: Decomposed into 09a-observability-app, 09b-observability-infra.</w:t>
+      </w:r>
+    </w:p>
+    <w:bookmarkEnd w:id="117"/>
+    <w:bookmarkStart w:id="121" w:name="метаданные-21"/>
     <w:p>
       <w:pPr>
         <w:pStyle w:val="Heading3"/>
@@ -4963,15 +4985,15 @@
         <w:br w:type="page"/>
       </w:r>
     </w:p>
-    <w:bookmarkEnd w:id="140"/>
-    <w:bookmarkEnd w:id="141"/>
-    <w:bookmarkStart w:id="147" w:name="Xece37773b7bb386e7dfba688ddafc5affb46940"/>
-    <w:p>
-      <w:pPr>
-        <w:pStyle w:val="Heading2"/>
-      </w:pPr>
-      <w:r>
-        <w:t xml:space="preserve">09a-observability-app — Observability: Application Layer</w:t>
+    <w:p>
+      <w:pPr>
+        <w:pStyle w:val="FirstParagraph"/>
+      </w:pPr>
+      <w:r>
+        <w:t xml:space="preserve"> </w:t>
+      </w:r>
+      <w:r>
+        <w:t xml:space="preserve">## 09a-observability-app — Observability: Application Layer</w:t>
       </w:r>
     </w:p>
     <w:p>
@@ -4981,20 +5003,20 @@
       <w:r>
         <w:drawing>
           <wp:inline>
-            <wp:extent cx="5334000" cy="1787663"/>
+            <wp:extent cx="5334000" cy="1629710"/>
             <wp:effectExtent b="0" l="0" r="0" t="0"/>
-            <wp:docPr descr="09a-observability-app" title="" id="143" name="Picture"/>
+            <wp:docPr descr="09a-observability-app" title="" id="119" name="Picture"/>
             <a:graphic>
               <a:graphicData uri="http://schemas.openxmlformats.org/drawingml/2006/picture">
                 <pic:pic>
                   <pic:nvPicPr>
-                    <pic:cNvPr descr="../architecture/png/09a-observability-app.png" id="144" name="Picture"/>
+                    <pic:cNvPr descr="file:///E:/g-drive/05_AI/github/BioactivityDataAcquisition2/docs/02-architecture/diagrams/architecture/png/09a-observability-app.png" id="120" name="Picture"/>
                     <pic:cNvPicPr>
                       <a:picLocks noChangeArrowheads="1" noChangeAspect="1"/>
                     </pic:cNvPicPr>
                   </pic:nvPicPr>
                   <pic:blipFill>
-                    <a:blip r:embed="rId142"/>
+                    <a:blip r:embed="rId118"/>
                     <a:stretch>
                       <a:fillRect/>
                     </a:stretch>
@@ -5002,7 +5024,7 @@
                   <pic:spPr bwMode="auto">
                     <a:xfrm>
                       <a:off x="0" y="0"/>
-                      <a:ext cx="5334000" cy="1787663"/>
+                      <a:ext cx="5334000" cy="1629710"/>
                     </a:xfrm>
                     <a:prstGeom prst="rect">
                       <a:avLst/>
@@ -5029,7 +5051,8 @@
         <w:t xml:space="preserve">09a-observability-app</w:t>
       </w:r>
     </w:p>
-    <w:bookmarkStart w:id="145" w:name="описание-22"/>
+    <w:bookmarkEnd w:id="121"/>
+    <w:bookmarkStart w:id="122" w:name="описание-22"/>
     <w:p>
       <w:pPr>
         <w:pStyle w:val="Heading3"/>
@@ -5043,11 +5066,11 @@
         <w:pStyle w:val="FirstParagraph"/>
       </w:pPr>
       <w:r>
-        <w:t xml:space="preserve">Диаграмма «Observability: Application Layer» из architecture-набора детализирует конкретный архитектурный компонент или подсистему BioETL. Она представлена в формате блок-схема потоков (flowchart) и служит ориентиром на уровне детализации «System / Component». В комментариях исходника зафиксирован фокус диаграммы: Application-level observability: ports, pipeline observer, batch metrics, adapter metrics.. На схеме отражено примерно 8 узлов и 4 связей, поэтому её удобно использовать для проверки влияния изменений, согласования интерфейсов и подготовки рефакторинга. Ключевые блоки/подграфы: Domain Ports, Application Observability, Adapter-Level Metrics. Показательные узлы для быстрого чтения: LoggerPort (Protocol), MetricsPort (Protocol), TracingPort (Protocol), DQMonitorPort (Protocol), PipelineObserver, BatchMetricsRecorder.</w:t>
-      </w:r>
-    </w:p>
-    <w:bookmarkEnd w:id="145"/>
-    <w:bookmarkStart w:id="146" w:name="метаданные-22"/>
+        <w:t xml:space="preserve">Диаграмма «Observability: Application Layer» из architecture-набора детализирует конкретный архитектурный компонент или подсистему BioETL. Она представлена в формате блок-схема потоков (flowchart) и служит ориентиром на уровне детализации «System / Component». В комментариях исходника зафиксирован фокус диаграммы: Application-level observability: ports, pipeline observer, batch metrics, adapter metrics.. Схема имеет плотность порядка 8 узлов и 4 связей; её удобно использовать как обзорный архитектурный срез для проверки влияния изменений, согласования интерфейсов и подготовки рефакторинга, но не как исчерпывающий каталог текущей кодовой поверхности. Ключевые блоки/подграфы: Domain Ports, Application Observability, Adapter-Level Metrics. Показательные узлы для быстрого чтения: LoggerPort (Protocol), MetricsPort (Protocol), TracingPort (Protocol), DQMonitorPort (Protocol), PipelineObserver, BatchMetricsRecorderService.</w:t>
+      </w:r>
+    </w:p>
+    <w:bookmarkEnd w:id="122"/>
+    <w:bookmarkStart w:id="126" w:name="метаданные-22"/>
     <w:p>
       <w:pPr>
         <w:pStyle w:val="Heading3"/>
@@ -5145,15 +5168,15 @@
         <w:br w:type="page"/>
       </w:r>
     </w:p>
-    <w:bookmarkEnd w:id="146"/>
-    <w:bookmarkEnd w:id="147"/>
-    <w:bookmarkStart w:id="153" w:name="Xbefc09d46696935e3c819f1bce71883ee4e3aab"/>
-    <w:p>
-      <w:pPr>
-        <w:pStyle w:val="Heading2"/>
-      </w:pPr>
-      <w:r>
-        <w:t xml:space="preserve">09b-observability-infra — Observability: Infrastructure Layer</w:t>
+    <w:p>
+      <w:pPr>
+        <w:pStyle w:val="FirstParagraph"/>
+      </w:pPr>
+      <w:r>
+        <w:t xml:space="preserve"> </w:t>
+      </w:r>
+      <w:r>
+        <w:t xml:space="preserve">## 09b-observability-infra — Observability: Infrastructure Layer</w:t>
       </w:r>
     </w:p>
     <w:p>
@@ -5165,18 +5188,18 @@
           <wp:inline>
             <wp:extent cx="5334000" cy="1990725"/>
             <wp:effectExtent b="0" l="0" r="0" t="0"/>
-            <wp:docPr descr="09b-observability-infra" title="" id="149" name="Picture"/>
+            <wp:docPr descr="09b-observability-infra" title="" id="124" name="Picture"/>
             <a:graphic>
               <a:graphicData uri="http://schemas.openxmlformats.org/drawingml/2006/picture">
                 <pic:pic>
                   <pic:nvPicPr>
-                    <pic:cNvPr descr="../architecture/png/09b-observability-infra.png" id="150" name="Picture"/>
+                    <pic:cNvPr descr="file:///E:/g-drive/05_AI/github/BioactivityDataAcquisition2/docs/02-architecture/diagrams/architecture/png/09b-observability-infra.png" id="125" name="Picture"/>
                     <pic:cNvPicPr>
                       <a:picLocks noChangeArrowheads="1" noChangeAspect="1"/>
                     </pic:cNvPicPr>
                   </pic:nvPicPr>
                   <pic:blipFill>
-                    <a:blip r:embed="rId148"/>
+                    <a:blip r:embed="rId123"/>
                     <a:stretch>
                       <a:fillRect/>
                     </a:stretch>
@@ -5211,7 +5234,8 @@
         <w:t xml:space="preserve">09b-observability-infra</w:t>
       </w:r>
     </w:p>
-    <w:bookmarkStart w:id="151" w:name="описание-23"/>
+    <w:bookmarkEnd w:id="126"/>
+    <w:bookmarkStart w:id="127" w:name="описание-23"/>
     <w:p>
       <w:pPr>
         <w:pStyle w:val="Heading3"/>
@@ -5225,11 +5249,11 @@
         <w:pStyle w:val="FirstParagraph"/>
       </w:pPr>
       <w:r>
-        <w:t xml:space="preserve">Диаграмма «Observability: Infrastructure Layer» из architecture-набора детализирует конкретный архитектурный компонент или подсистему BioETL. Она представлена в формате блок-схема потоков (flowchart) и служит ориентиром на уровне детализации «System / Component». В комментариях исходника зафиксирован фокус диаграммы: Infrastructure implementations: logging, metrics, tracing, anomaly detection, external systems.. На схеме отражено примерно 13 узлов и 7 связей, поэтому её удобно использовать для проверки влияния изменений, согласования интерфейсов и подготовки рефакторинга. Ключевые блоки/подграфы: Infrastructure: Logging, Infrastructure: Metrics, Infrastructure: Tracing, Infrastructure: Anomaly Detection, External Systems. Показательные узлы для быстрого чтения: UnifiedLogger (impl LoggerPort), MetricsCollector (impl MetricsPort), PrometheusMetrics (impl MetricsPort), MetricsServerAdapter, NoOpMetrics, OpenTelemetryTracer (impl TracingPort).</w:t>
-      </w:r>
-    </w:p>
-    <w:bookmarkEnd w:id="151"/>
-    <w:bookmarkStart w:id="152" w:name="метаданные-23"/>
+        <w:t xml:space="preserve">Диаграмма «Observability: Infrastructure Layer» из architecture-набора детализирует конкретный архитектурный компонент или подсистему BioETL. Она представлена в формате блок-схема потоков (flowchart) и служит ориентиром на уровне детализации «System / Component». В комментариях исходника зафиксирован фокус диаграммы: Infrastructure implementations: logging, metrics, tracing, anomaly detection, external systems.. Схема имеет плотность порядка 13 узлов и 7 связей; её удобно использовать как обзорный архитектурный срез для проверки влияния изменений, согласования интерфейсов и подготовки рефакторинга, но не как исчерпывающий каталог текущей кодовой поверхности. Ключевые блоки/подграфы: Infrastructure: Logging, Infrastructure: Metrics, Infrastructure: Tracing, Infrastructure: Anomaly Detection, External Systems. Показательные узлы для быстрого чтения: UnifiedLogger (impl LoggerPort), MetricsCollector (impl MetricsPort), PrometheusMetrics (impl MetricsPort), MetricsServerAdapter, NoOpMetrics, OpenTelemetryTracer (impl TracingPort).</w:t>
+      </w:r>
+    </w:p>
+    <w:bookmarkEnd w:id="127"/>
+    <w:bookmarkStart w:id="131" w:name="метаданные-23"/>
     <w:p>
       <w:pPr>
         <w:pStyle w:val="Heading3"/>
@@ -5327,15 +5351,15 @@
         <w:br w:type="page"/>
       </w:r>
     </w:p>
-    <w:bookmarkEnd w:id="152"/>
-    <w:bookmarkEnd w:id="153"/>
-    <w:bookmarkStart w:id="159" w:name="resilience-patterns-resilience-patterns"/>
-    <w:p>
-      <w:pPr>
-        <w:pStyle w:val="Heading2"/>
-      </w:pPr>
-      <w:r>
-        <w:t xml:space="preserve">10-resilience-patterns — Resilience Patterns</w:t>
+    <w:p>
+      <w:pPr>
+        <w:pStyle w:val="FirstParagraph"/>
+      </w:pPr>
+      <w:r>
+        <w:t xml:space="preserve"> </w:t>
+      </w:r>
+      <w:r>
+        <w:t xml:space="preserve">## 10-resilience-patterns — Resilience Patterns</w:t>
       </w:r>
     </w:p>
     <w:p>
@@ -5347,18 +5371,18 @@
           <wp:inline>
             <wp:extent cx="5334000" cy="2527340"/>
             <wp:effectExtent b="0" l="0" r="0" t="0"/>
-            <wp:docPr descr="10-resilience-patterns" title="" id="155" name="Picture"/>
+            <wp:docPr descr="10-resilience-patterns" title="" id="129" name="Picture"/>
             <a:graphic>
               <a:graphicData uri="http://schemas.openxmlformats.org/drawingml/2006/picture">
                 <pic:pic>
                   <pic:nvPicPr>
-                    <pic:cNvPr descr="../architecture/png/10-resilience-patterns.png" id="156" name="Picture"/>
+                    <pic:cNvPr descr="file:///E:/g-drive/05_AI/github/BioactivityDataAcquisition2/docs/02-architecture/diagrams/architecture/png/10-resilience-patterns.png" id="130" name="Picture"/>
                     <pic:cNvPicPr>
                       <a:picLocks noChangeArrowheads="1" noChangeAspect="1"/>
                     </pic:cNvPicPr>
                   </pic:nvPicPr>
                   <pic:blipFill>
-                    <a:blip r:embed="rId154"/>
+                    <a:blip r:embed="rId128"/>
                     <a:stretch>
                       <a:fillRect/>
                     </a:stretch>
@@ -5393,7 +5417,8 @@
         <w:t xml:space="preserve">10-resilience-patterns</w:t>
       </w:r>
     </w:p>
-    <w:bookmarkStart w:id="157" w:name="описание-24"/>
+    <w:bookmarkEnd w:id="131"/>
+    <w:bookmarkStart w:id="132" w:name="описание-24"/>
     <w:p>
       <w:pPr>
         <w:pStyle w:val="Heading3"/>
@@ -5407,11 +5432,11 @@
         <w:pStyle w:val="FirstParagraph"/>
       </w:pPr>
       <w:r>
-        <w:t xml:space="preserve">Диаграмма «Resilience Patterns» из architecture-набора детализирует конкретный архитектурный компонент или подсистему BioETL. Она представлена в формате блок-схема потоков (flowchart) и служит ориентиром на уровне детализации «System / Component». В комментариях исходника зафиксирован фокус диаграммы: Circuit Breaker, Rate Limiter, Retry, Health Check patterns.. На схеме отражено примерно 15 узлов и 13 связей, поэтому её удобно использовать для проверки влияния изменений, согласования интерфейсов и подготовки рефакторинга. Ключевые блоки/подграфы: Domain Ports, Circuit Breaker Pattern, State Machine, Rate Limiter (Token Bucket), Provider Rate Limits, Retry Logic. Показательные узлы для быстрого чтения: CircuitBreakerPort (Protocol) ——– + get_state() + call(fn), RateLimiterPort (Protocol) ——– + acquire(tokens) + try_acquire(), HealthCheckPort (Protocol) ——– + check_health(), CircuitBreaker ——– provider failure_threshold recovery_timeout, CLOSED (normal operation), OPEN (fail fast).</w:t>
-      </w:r>
-    </w:p>
-    <w:bookmarkEnd w:id="157"/>
-    <w:bookmarkStart w:id="158" w:name="метаданные-24"/>
+        <w:t xml:space="preserve">Диаграмма «Resilience Patterns» из architecture-набора детализирует конкретный архитектурный компонент или подсистему BioETL. Она представлена в формате блок-схема потоков (flowchart) и служит ориентиром на уровне детализации «System / Component». В комментариях исходника зафиксирован фокус диаграммы: Circuit Breaker, Rate Limiter, Retry, Health Check patterns.. Схема имеет плотность порядка 15 узлов и 13 связей; её удобно использовать как обзорный архитектурный срез для проверки влияния изменений, согласования интерфейсов и подготовки рефакторинга, но не как исчерпывающий каталог текущей кодовой поверхности. Ключевые блоки/подграфы: Domain Ports, Circuit Breaker Pattern, State Machine, Rate Limiter (Token Bucket), Provider Rate Limits, Retry Logic. Показательные узлы для быстрого чтения: CircuitBreakerPort (Protocol) ——– + get_state() + call(fn), RateLimiterPort (Protocol) ——– + acquire(tokens) + try_acquire(), HealthCheckPort (Protocol) ——– + check_health(), CircuitBreaker ——– provider failure_threshold recovery_timeout, CLOSED (normal operation), OPEN (fail fast).</w:t>
+      </w:r>
+    </w:p>
+    <w:bookmarkEnd w:id="132"/>
+    <w:bookmarkStart w:id="136" w:name="метаданные-24"/>
     <w:p>
       <w:pPr>
         <w:pStyle w:val="Heading3"/>
@@ -5509,15 +5534,15 @@
         <w:br w:type="page"/>
       </w:r>
     </w:p>
-    <w:bookmarkEnd w:id="158"/>
-    <w:bookmarkEnd w:id="159"/>
-    <w:bookmarkStart w:id="165" w:name="X67a510d742824c16eff686144e742dbf2d1c0bd"/>
-    <w:p>
-      <w:pPr>
-        <w:pStyle w:val="Heading2"/>
-      </w:pPr>
-      <w:r>
-        <w:t xml:space="preserve">11-configuration-system — Configuration System</w:t>
+    <w:p>
+      <w:pPr>
+        <w:pStyle w:val="FirstParagraph"/>
+      </w:pPr>
+      <w:r>
+        <w:t xml:space="preserve"> </w:t>
+      </w:r>
+      <w:r>
+        <w:t xml:space="preserve">## 11-configuration-system — Configuration System</w:t>
       </w:r>
     </w:p>
     <w:p>
@@ -5529,18 +5554,18 @@
           <wp:inline>
             <wp:extent cx="5334000" cy="2169468"/>
             <wp:effectExtent b="0" l="0" r="0" t="0"/>
-            <wp:docPr descr="11-configuration-system" title="" id="161" name="Picture"/>
+            <wp:docPr descr="11-configuration-system" title="" id="134" name="Picture"/>
             <a:graphic>
               <a:graphicData uri="http://schemas.openxmlformats.org/drawingml/2006/picture">
                 <pic:pic>
                   <pic:nvPicPr>
-                    <pic:cNvPr descr="../architecture/png/11-configuration-system.png" id="162" name="Picture"/>
+                    <pic:cNvPr descr="file:///E:/g-drive/05_AI/github/BioactivityDataAcquisition2/docs/02-architecture/diagrams/architecture/png/11-configuration-system.png" id="135" name="Picture"/>
                     <pic:cNvPicPr>
                       <a:picLocks noChangeArrowheads="1" noChangeAspect="1"/>
                     </pic:cNvPicPr>
                   </pic:nvPicPr>
                   <pic:blipFill>
-                    <a:blip r:embed="rId160"/>
+                    <a:blip r:embed="rId133"/>
                     <a:stretch>
                       <a:fillRect/>
                     </a:stretch>
@@ -5575,7 +5600,8 @@
         <w:t xml:space="preserve">11-configuration-system</w:t>
       </w:r>
     </w:p>
-    <w:bookmarkStart w:id="163" w:name="описание-25"/>
+    <w:bookmarkEnd w:id="136"/>
+    <w:bookmarkStart w:id="137" w:name="описание-25"/>
     <w:p>
       <w:pPr>
         <w:pStyle w:val="Heading3"/>
@@ -5589,7 +5615,7 @@
         <w:pStyle w:val="FirstParagraph"/>
       </w:pPr>
       <w:r>
-        <w:t xml:space="preserve">Диаграмма «Configuration System» из architecture-набора детализирует конкретный архитектурный компонент или подсистему BioETL. Она представлена в формате блок-схема потоков (flowchart) и служит ориентиром на уровне детализации «System / Component». В комментариях исходника зафиксирован фокус диаграммы: how YAML configs are loaded, validated, and used across the system.. На схеме отражено примерно 27 узлов и 25 связей, поэтому её удобно использовать для проверки влияния изменений, согласования интерфейсов и подготовки рефакторинга. Ключевые блоки/подграфы: YAML Config Files, Infrastructure Config Loaders, Infrastructure Schemas (Pydantic), Domain Configuration, Composite Domain Config, Application Config. Показательные узлы для быстрого чтения: configs/base/</w:t>
+        <w:t xml:space="preserve">Диаграмма «Configuration System» из architecture-набора детализирует конкретный архитектурный компонент или подсистему BioETL. Она представлена в формате блок-схема потоков (flowchart) и служит ориентиром на уровне детализации «System / Component». В комментариях исходника зафиксирован фокус диаграммы: how YAML configs are loaded, validated, and used across the system.. Схема имеет плотность порядка 27 узлов и 25 связей; её удобно использовать как обзорный архитектурный срез для проверки влияния изменений, согласования интерфейсов и подготовки рефакторинга, но не как исчерпывающий каталог текущей кодовой поверхности. Ключевые блоки/подграфы: YAML Config Files, Infrastructure Config Loaders, Infrastructure Schemas (Pydantic), Domain Configuration, Composite Domain Config, Application Config. Показательные узлы для быстрого чтения: configs/base/</w:t>
       </w:r>
       <w:r>
         <w:rPr>
@@ -5612,8 +5638,8 @@
         <w:t xml:space="preserve">.yaml unified entity configs, configs/composites/*.yaml composite configs, PipelineConfigLoader load(path) -&gt; PipelineConfig, DQConfigLoader load(path) -&gt; DQConfig. Примечание: Decomposed into 11a-config-loading, 11b-config-domain.</w:t>
       </w:r>
     </w:p>
-    <w:bookmarkEnd w:id="163"/>
-    <w:bookmarkStart w:id="164" w:name="метаданные-25"/>
+    <w:bookmarkEnd w:id="137"/>
+    <w:bookmarkStart w:id="141" w:name="метаданные-25"/>
     <w:p>
       <w:pPr>
         <w:pStyle w:val="Heading3"/>
@@ -5711,15 +5737,15 @@
         <w:br w:type="page"/>
       </w:r>
     </w:p>
-    <w:bookmarkEnd w:id="164"/>
-    <w:bookmarkEnd w:id="165"/>
-    <w:bookmarkStart w:id="171" w:name="X3f75a169d3c8606d1a03f672b517ccd3bf0fe05"/>
-    <w:p>
-      <w:pPr>
-        <w:pStyle w:val="Heading2"/>
-      </w:pPr>
-      <w:r>
-        <w:t xml:space="preserve">11a-config-loading — Configuration: Loading Pipeline</w:t>
+    <w:p>
+      <w:pPr>
+        <w:pStyle w:val="FirstParagraph"/>
+      </w:pPr>
+      <w:r>
+        <w:t xml:space="preserve"> </w:t>
+      </w:r>
+      <w:r>
+        <w:t xml:space="preserve">## 11a-config-loading — Configuration: Loading Pipeline</w:t>
       </w:r>
     </w:p>
     <w:p>
@@ -5731,18 +5757,18 @@
           <wp:inline>
             <wp:extent cx="5334000" cy="1809399"/>
             <wp:effectExtent b="0" l="0" r="0" t="0"/>
-            <wp:docPr descr="11a-config-loading" title="" id="167" name="Picture"/>
+            <wp:docPr descr="11a-config-loading" title="" id="139" name="Picture"/>
             <a:graphic>
               <a:graphicData uri="http://schemas.openxmlformats.org/drawingml/2006/picture">
                 <pic:pic>
                   <pic:nvPicPr>
-                    <pic:cNvPr descr="../architecture/png/11a-config-loading.png" id="168" name="Picture"/>
+                    <pic:cNvPr descr="file:///E:/g-drive/05_AI/github/BioactivityDataAcquisition2/docs/02-architecture/diagrams/architecture/png/11a-config-loading.png" id="140" name="Picture"/>
                     <pic:cNvPicPr>
                       <a:picLocks noChangeArrowheads="1" noChangeAspect="1"/>
                     </pic:cNvPicPr>
                   </pic:nvPicPr>
                   <pic:blipFill>
-                    <a:blip r:embed="rId166"/>
+                    <a:blip r:embed="rId138"/>
                     <a:stretch>
                       <a:fillRect/>
                     </a:stretch>
@@ -5777,7 +5803,8 @@
         <w:t xml:space="preserve">11a-config-loading</w:t>
       </w:r>
     </w:p>
-    <w:bookmarkStart w:id="169" w:name="описание-26"/>
+    <w:bookmarkEnd w:id="141"/>
+    <w:bookmarkStart w:id="142" w:name="описание-26"/>
     <w:p>
       <w:pPr>
         <w:pStyle w:val="Heading3"/>
@@ -5791,7 +5818,7 @@
         <w:pStyle w:val="FirstParagraph"/>
       </w:pPr>
       <w:r>
-        <w:t xml:space="preserve">Диаграмма «Configuration: Loading Pipeline» из architecture-набора детализирует конкретный архитектурный компонент или подсистему BioETL. Она представлена в формате блок-схема потоков (flowchart) и служит ориентиром на уровне детализации «System / Component». В комментариях исходника зафиксирован фокус диаграммы: YAML files, config loaders, and infrastructure schemas (Pydantic validation).. На схеме отражено примерно 11 узлов и 16 связей, поэтому её удобно использовать для проверки влияния изменений, согласования интерфейсов и подготовки рефакторинга. Ключевые блоки/подграфы: YAML Config Files, Infrastructure Config Loaders, Infrastructure Schemas (Pydantic). Показательные узлы для быстрого чтения: configs/base/</w:t>
+        <w:t xml:space="preserve">Диаграмма «Configuration: Loading Pipeline» из architecture-набора детализирует конкретный архитектурный компонент или подсистему BioETL. Она представлена в формате блок-схема потоков (flowchart) и служит ориентиром на уровне детализации «System / Component». В комментариях исходника зафиксирован фокус диаграммы: YAML files, config loaders, and infrastructure schemas (Pydantic validation).. Схема имеет плотность порядка 11 узлов и 16 связей; её удобно использовать как обзорный архитектурный срез для проверки влияния изменений, согласования интерфейсов и подготовки рефакторинга, но не как исчерпывающий каталог текущей кодовой поверхности. Ключевые блоки/подграфы: YAML Config Files, Infrastructure Config Loaders, Infrastructure Schemas (Pydantic). Показательные узлы для быстрого чтения: configs/base/</w:t>
       </w:r>
       <w:r>
         <w:rPr>
@@ -5814,8 +5841,8 @@
         <w:t xml:space="preserve">.yaml, configs/composites/*.yaml, BaseConfigLoader, PipelineConfigLoader.</w:t>
       </w:r>
     </w:p>
-    <w:bookmarkEnd w:id="169"/>
-    <w:bookmarkStart w:id="170" w:name="метаданные-26"/>
+    <w:bookmarkEnd w:id="142"/>
+    <w:bookmarkStart w:id="146" w:name="метаданные-26"/>
     <w:p>
       <w:pPr>
         <w:pStyle w:val="Heading3"/>
@@ -5913,15 +5940,15 @@
         <w:br w:type="page"/>
       </w:r>
     </w:p>
-    <w:bookmarkEnd w:id="170"/>
-    <w:bookmarkEnd w:id="171"/>
-    <w:bookmarkStart w:id="177" w:name="X83e17afbc9f2f7538a50b9d35b0ec02c649106b"/>
-    <w:p>
-      <w:pPr>
-        <w:pStyle w:val="Heading2"/>
-      </w:pPr>
-      <w:r>
-        <w:t xml:space="preserve">11b-config-domain — Configuration: Domain &amp; Application Config</w:t>
+    <w:p>
+      <w:pPr>
+        <w:pStyle w:val="FirstParagraph"/>
+      </w:pPr>
+      <w:r>
+        <w:t xml:space="preserve"> </w:t>
+      </w:r>
+      <w:r>
+        <w:t xml:space="preserve">## 11b-config-domain — Configuration: Domain &amp; Application Config</w:t>
       </w:r>
     </w:p>
     <w:p>
@@ -5933,18 +5960,18 @@
           <wp:inline>
             <wp:extent cx="5334000" cy="461170"/>
             <wp:effectExtent b="0" l="0" r="0" t="0"/>
-            <wp:docPr descr="11b-config-domain" title="" id="173" name="Picture"/>
+            <wp:docPr descr="11b-config-domain" title="" id="144" name="Picture"/>
             <a:graphic>
               <a:graphicData uri="http://schemas.openxmlformats.org/drawingml/2006/picture">
                 <pic:pic>
                   <pic:nvPicPr>
-                    <pic:cNvPr descr="../architecture/png/11b-config-domain.png" id="174" name="Picture"/>
+                    <pic:cNvPr descr="file:///E:/g-drive/05_AI/github/BioactivityDataAcquisition2/docs/02-architecture/diagrams/architecture/png/11b-config-domain.png" id="145" name="Picture"/>
                     <pic:cNvPicPr>
                       <a:picLocks noChangeArrowheads="1" noChangeAspect="1"/>
                     </pic:cNvPicPr>
                   </pic:nvPicPr>
                   <pic:blipFill>
-                    <a:blip r:embed="rId172"/>
+                    <a:blip r:embed="rId143"/>
                     <a:stretch>
                       <a:fillRect/>
                     </a:stretch>
@@ -5979,7 +6006,8 @@
         <w:t xml:space="preserve">11b-config-domain</w:t>
       </w:r>
     </w:p>
-    <w:bookmarkStart w:id="175" w:name="описание-27"/>
+    <w:bookmarkEnd w:id="146"/>
+    <w:bookmarkStart w:id="147" w:name="описание-27"/>
     <w:p>
       <w:pPr>
         <w:pStyle w:val="Heading3"/>
@@ -5993,11 +6021,11 @@
         <w:pStyle w:val="FirstParagraph"/>
       </w:pPr>
       <w:r>
-        <w:t xml:space="preserve">Диаграмма «Configuration: Domain &amp; Application Config» из architecture-набора детализирует конкретный архитектурный компонент или подсистему BioETL. Она представлена в формате блок-схема потоков (flowchart) и служит ориентиром на уровне детализации «System / Component». В комментариях исходника зафиксирован фокус диаграммы: Domain config objects, composite config, application config, and infrastructure settings.. На схеме отражено примерно 16 узлов и 6 связей, поэтому её удобно использовать для проверки влияния изменений, согласования интерфейсов и подготовки рефакторинга. Ключевые блоки/подграфы: Infrastructure Schemas, Domain Configuration, Composite Domain Config, Application Config, Infrastructure Settings. Показательные узлы для быстрого чтения: ApiConfig, SourceConfig, CircuitBreakerConfig, PipelineContractPolicy, PipelineConfig, TableConfig.</w:t>
-      </w:r>
-    </w:p>
-    <w:bookmarkEnd w:id="175"/>
-    <w:bookmarkStart w:id="176" w:name="метаданные-27"/>
+        <w:t xml:space="preserve">Диаграмма «Configuration: Domain &amp; Application Config» из architecture-набора детализирует конкретный архитектурный компонент или подсистему BioETL. Она представлена в формате блок-схема потоков (flowchart) и служит ориентиром на уровне детализации «System / Component». В комментариях исходника зафиксирован фокус диаграммы: Domain config objects, composite config, application config, and infrastructure settings.. Схема имеет плотность порядка 16 узлов и 6 связей; её удобно использовать как обзорный архитектурный срез для проверки влияния изменений, согласования интерфейсов и подготовки рефакторинга, но не как исчерпывающий каталог текущей кодовой поверхности. Ключевые блоки/подграфы: Infrastructure Schemas, Domain Configuration, Composite Domain Config, Application Config, Infrastructure Settings. Показательные узлы для быстрого чтения: ApiConfig, SourceConfig, CircuitBreakerConfig, PipelineContractPolicy, PipelineConfig, TableConfig.</w:t>
+      </w:r>
+    </w:p>
+    <w:bookmarkEnd w:id="147"/>
+    <w:bookmarkStart w:id="151" w:name="метаданные-27"/>
     <w:p>
       <w:pPr>
         <w:pStyle w:val="Heading3"/>
@@ -6095,15 +6123,15 @@
         <w:br w:type="page"/>
       </w:r>
     </w:p>
-    <w:bookmarkEnd w:id="176"/>
-    <w:bookmarkEnd w:id="177"/>
-    <w:bookmarkStart w:id="183" w:name="Xe6818001898add9a4a7d1a5ecf554112c8f7a53"/>
-    <w:p>
-      <w:pPr>
-        <w:pStyle w:val="Heading2"/>
-      </w:pPr>
-      <w:r>
-        <w:t xml:space="preserve">12-bootstrap-di-container — Bootstrap / DI Container (Composition Root)</w:t>
+    <w:p>
+      <w:pPr>
+        <w:pStyle w:val="FirstParagraph"/>
+      </w:pPr>
+      <w:r>
+        <w:t xml:space="preserve"> </w:t>
+      </w:r>
+      <w:r>
+        <w:t xml:space="preserve">## 12-bootstrap-di-container — Bootstrap / DI Container (Composition Root)</w:t>
       </w:r>
     </w:p>
     <w:p>
@@ -6115,18 +6143,18 @@
           <wp:inline>
             <wp:extent cx="5334000" cy="5877786"/>
             <wp:effectExtent b="0" l="0" r="0" t="0"/>
-            <wp:docPr descr="12-bootstrap-di-container" title="" id="179" name="Picture"/>
+            <wp:docPr descr="12-bootstrap-di-container" title="" id="149" name="Picture"/>
             <a:graphic>
               <a:graphicData uri="http://schemas.openxmlformats.org/drawingml/2006/picture">
                 <pic:pic>
                   <pic:nvPicPr>
-                    <pic:cNvPr descr="../architecture/png/12-bootstrap-di-container.png" id="180" name="Picture"/>
+                    <pic:cNvPr descr="file:///E:/g-drive/05_AI/github/BioactivityDataAcquisition2/docs/02-architecture/diagrams/architecture/png/12-bootstrap-di-container.png" id="150" name="Picture"/>
                     <pic:cNvPicPr>
                       <a:picLocks noChangeArrowheads="1" noChangeAspect="1"/>
                     </pic:cNvPicPr>
                   </pic:nvPicPr>
                   <pic:blipFill>
-                    <a:blip r:embed="rId178"/>
+                    <a:blip r:embed="rId148"/>
                     <a:stretch>
                       <a:fillRect/>
                     </a:stretch>
@@ -6161,7 +6189,8 @@
         <w:t xml:space="preserve">12-bootstrap-di-container</w:t>
       </w:r>
     </w:p>
-    <w:bookmarkStart w:id="181" w:name="описание-28"/>
+    <w:bookmarkEnd w:id="151"/>
+    <w:bookmarkStart w:id="152" w:name="описание-28"/>
     <w:p>
       <w:pPr>
         <w:pStyle w:val="Heading3"/>
@@ -6175,11 +6204,11 @@
         <w:pStyle w:val="FirstParagraph"/>
       </w:pPr>
       <w:r>
-        <w:t xml:space="preserve">Диаграмма «Bootstrap / DI Container (Composition Root)» из architecture-набора детализирует конкретный архитектурный компонент или подсистему BioETL. Она представлена в формате блок-схема потоков (flowchart) и служит ориентиром на уровне детализации «System / Component». В комментариях исходника зафиксирован фокус диаграммы: the current narrow public APIs plus retained broad seam used to assemble runtime and admin services.. На схеме отражено примерно 20 узлов и 31 связей, поэтому её удобно использовать для проверки влияния изменений, согласования интерфейсов и подготовки рефакторинга. Ключевые блоки/подграфы: Public composition seams, Internal composition modules, Registries + factories, Runtime bootstrap, CLI/bootstrap services, Created collaborators. Показательные узлы для быстрого чтения: Entry callers CLI + tests/scripts + future API, composition.execution_api preferred execution seam, composition.services_api preferred services seam, composition.resources_api preferred resource seam, composition.entrypoints retained broad facade, composition.bootstrap runtime / cli / assembly. Примечание: Decomposed into 12a, 12b sub-diagrams.</w:t>
-      </w:r>
-    </w:p>
-    <w:bookmarkEnd w:id="181"/>
-    <w:bookmarkStart w:id="182" w:name="метаданные-28"/>
+        <w:t xml:space="preserve">Диаграмма «Bootstrap / DI Container (Composition Root)» из architecture-набора детализирует конкретный архитектурный компонент или подсистему BioETL. Она представлена в формате блок-схема потоков (flowchart) и служит ориентиром на уровне детализации «System / Component». В комментариях исходника зафиксирован фокус диаграммы: the current narrow public APIs plus retained broad seam used to assemble runtime and admin services.. Схема имеет плотность порядка 20 узлов и 31 связей; её удобно использовать как обзорный архитектурный срез для проверки влияния изменений, согласования интерфейсов и подготовки рефакторинга, но не как исчерпывающий каталог текущей кодовой поверхности. Ключевые блоки/подграфы: Public composition seams, Internal composition modules, Registries + factories, Runtime bootstrap, CLI/bootstrap services, Created collaborators. Показательные узлы для быстрого чтения: Entry callers CLI + tests/scripts + future API, composition.execution_api preferred execution seam, composition.services_api preferred services seam, composition.resources_api preferred resource seam, composition.entrypoints retained broad facade, composition.bootstrap runtime / cli / assembly. Примечание: Decomposed into 12a, 12b sub-diagrams.</w:t>
+      </w:r>
+    </w:p>
+    <w:bookmarkEnd w:id="152"/>
+    <w:bookmarkStart w:id="156" w:name="метаданные-28"/>
     <w:p>
       <w:pPr>
         <w:pStyle w:val="Heading3"/>
@@ -6277,15 +6306,15 @@
         <w:br w:type="page"/>
       </w:r>
     </w:p>
-    <w:bookmarkEnd w:id="182"/>
-    <w:bookmarkEnd w:id="183"/>
-    <w:bookmarkStart w:id="189" w:name="X4e42804fcbdea14f0e51e0f6baae61c6de72e9c"/>
-    <w:p>
-      <w:pPr>
-        <w:pStyle w:val="Heading2"/>
-      </w:pPr>
-      <w:r>
-        <w:t xml:space="preserve">12a-bootstrap-factories — Bootstrap: Registries, Public APIs, and Factory Seams</w:t>
+    <w:p>
+      <w:pPr>
+        <w:pStyle w:val="FirstParagraph"/>
+      </w:pPr>
+      <w:r>
+        <w:t xml:space="preserve"> </w:t>
+      </w:r>
+      <w:r>
+        <w:t xml:space="preserve">## 12a-bootstrap-factories — Bootstrap: Registries, Public APIs, and Factory Seams</w:t>
       </w:r>
     </w:p>
     <w:p>
@@ -6297,18 +6326,18 @@
           <wp:inline>
             <wp:extent cx="5334000" cy="2611348"/>
             <wp:effectExtent b="0" l="0" r="0" t="0"/>
-            <wp:docPr descr="12a-bootstrap-factories" title="" id="185" name="Picture"/>
+            <wp:docPr descr="12a-bootstrap-factories" title="" id="154" name="Picture"/>
             <a:graphic>
               <a:graphicData uri="http://schemas.openxmlformats.org/drawingml/2006/picture">
                 <pic:pic>
                   <pic:nvPicPr>
-                    <pic:cNvPr descr="../architecture/png/12a-bootstrap-factories.png" id="186" name="Picture"/>
+                    <pic:cNvPr descr="file:///E:/g-drive/05_AI/github/BioactivityDataAcquisition2/docs/02-architecture/diagrams/architecture/png/12a-bootstrap-factories.png" id="155" name="Picture"/>
                     <pic:cNvPicPr>
                       <a:picLocks noChangeArrowheads="1" noChangeAspect="1"/>
                     </pic:cNvPicPr>
                   </pic:nvPicPr>
                   <pic:blipFill>
-                    <a:blip r:embed="rId184"/>
+                    <a:blip r:embed="rId153"/>
                     <a:stretch>
                       <a:fillRect/>
                     </a:stretch>
@@ -6343,7 +6372,8 @@
         <w:t xml:space="preserve">12a-bootstrap-factories</w:t>
       </w:r>
     </w:p>
-    <w:bookmarkStart w:id="187" w:name="описание-29"/>
+    <w:bookmarkEnd w:id="156"/>
+    <w:bookmarkStart w:id="157" w:name="описание-29"/>
     <w:p>
       <w:pPr>
         <w:pStyle w:val="Heading3"/>
@@ -6357,11 +6387,11 @@
         <w:pStyle w:val="FirstParagraph"/>
       </w:pPr>
       <w:r>
-        <w:t xml:space="preserve">Диаграмма «Bootstrap: Registries, Public APIs, and Factory Seams» из architecture-набора детализирует конкретный архитектурный компонент или подсистему BioETL. Она представлена в формате блок-схема потоков (flowchart) и служит ориентиром на уровне детализации «System / Component». В комментариях исходника зафиксирован фокус диаграммы: Focuses on current public composition APIs, registries, provider wiring, and canonical factory seams.. На схеме отражено примерно 11 узлов и 12 связей, поэтому её удобно использовать для проверки влияния изменений, согласования интерфейсов и подготовки рефакторинга. Ключевые блоки/подграфы: Registries + factories. Показательные узлы для быстрого чтения: composition.execution_api, composition.services_api, composition.resources_api, composition.entrypoints retained broad seam, composition.bootstrap, ProviderRegistry.</w:t>
-      </w:r>
-    </w:p>
-    <w:bookmarkEnd w:id="187"/>
-    <w:bookmarkStart w:id="188" w:name="метаданные-29"/>
+        <w:t xml:space="preserve">Диаграмма «Bootstrap: Registries, Public APIs, and Factory Seams» из architecture-набора детализирует конкретный архитектурный компонент или подсистему BioETL. Она представлена в формате блок-схема потоков (flowchart) и служит ориентиром на уровне детализации «System / Component». В комментариях исходника зафиксирован фокус диаграммы: Focuses on current public composition APIs, registries, provider wiring, and canonical factory seams.. Схема имеет плотность порядка 11 узлов и 12 связей; её удобно использовать как обзорный архитектурный срез для проверки влияния изменений, согласования интерфейсов и подготовки рефакторинга, но не как исчерпывающий каталог текущей кодовой поверхности. Ключевые блоки/подграфы: Registries + factories. Показательные узлы для быстрого чтения: composition.execution_api, composition.services_api, composition.resources_api, composition.entrypoints retained broad seam, composition.bootstrap, ProviderRegistry.</w:t>
+      </w:r>
+    </w:p>
+    <w:bookmarkEnd w:id="157"/>
+    <w:bookmarkStart w:id="161" w:name="метаданные-29"/>
     <w:p>
       <w:pPr>
         <w:pStyle w:val="Heading3"/>
@@ -6459,15 +6489,15 @@
         <w:br w:type="page"/>
       </w:r>
     </w:p>
-    <w:bookmarkEnd w:id="188"/>
-    <w:bookmarkEnd w:id="189"/>
-    <w:bookmarkStart w:id="195" w:name="X50ca97d6eb5afda6f57037a65c706057fd88597"/>
-    <w:p>
-      <w:pPr>
-        <w:pStyle w:val="Heading2"/>
-      </w:pPr>
-      <w:r>
-        <w:t xml:space="preserve">12b-bootstrap-wiring — Bootstrap: Runtime and Admin Wiring</w:t>
+    <w:p>
+      <w:pPr>
+        <w:pStyle w:val="FirstParagraph"/>
+      </w:pPr>
+      <w:r>
+        <w:t xml:space="preserve"> </w:t>
+      </w:r>
+      <w:r>
+        <w:t xml:space="preserve">## 12b-bootstrap-wiring — Bootstrap: Runtime and Admin Wiring</w:t>
       </w:r>
     </w:p>
     <w:p>
@@ -6479,18 +6509,18 @@
           <wp:inline>
             <wp:extent cx="5334000" cy="4223051"/>
             <wp:effectExtent b="0" l="0" r="0" t="0"/>
-            <wp:docPr descr="12b-bootstrap-wiring" title="" id="191" name="Picture"/>
+            <wp:docPr descr="12b-bootstrap-wiring" title="" id="159" name="Picture"/>
             <a:graphic>
               <a:graphicData uri="http://schemas.openxmlformats.org/drawingml/2006/picture">
                 <pic:pic>
                   <pic:nvPicPr>
-                    <pic:cNvPr descr="../architecture/png/12b-bootstrap-wiring.png" id="192" name="Picture"/>
+                    <pic:cNvPr descr="file:///E:/g-drive/05_AI/github/BioactivityDataAcquisition2/docs/02-architecture/diagrams/architecture/png/12b-bootstrap-wiring.png" id="160" name="Picture"/>
                     <pic:cNvPicPr>
                       <a:picLocks noChangeArrowheads="1" noChangeAspect="1"/>
                     </pic:cNvPicPr>
                   </pic:nvPicPr>
                   <pic:blipFill>
-                    <a:blip r:embed="rId190"/>
+                    <a:blip r:embed="rId158"/>
                     <a:stretch>
                       <a:fillRect/>
                     </a:stretch>
@@ -6525,7 +6555,8 @@
         <w:t xml:space="preserve">12b-bootstrap-wiring</w:t>
       </w:r>
     </w:p>
-    <w:bookmarkStart w:id="193" w:name="описание-30"/>
+    <w:bookmarkEnd w:id="161"/>
+    <w:bookmarkStart w:id="162" w:name="описание-30"/>
     <w:p>
       <w:pPr>
         <w:pStyle w:val="Heading3"/>
@@ -6539,11 +6570,11 @@
         <w:pStyle w:val="FirstParagraph"/>
       </w:pPr>
       <w:r>
-        <w:t xml:space="preserve">Диаграмма «Bootstrap: Runtime and Admin Wiring» из architecture-набора детализирует конкретный архитектурный компонент или подсистему BioETL. Она представлена в формате блок-схема потоков (flowchart) и служит ориентиром на уровне детализации «System / Component». В комментариях исходника зафиксирован фокус диаграммы: Covers how narrow public composition APIs and the retained broad seam expose runtime/admin assembly outputs.. На схеме отражено примерно 19 узлов и 24 связей, поэтому её удобно использовать для проверки влияния изменений, согласования интерфейсов и подготовки рефакторинга. Ключевые блоки/подграфы: Public composition APIs, Composition bootstrap, Infrastructure collaborators, Created services. Показательные узлы для быстрого чтения: execution_api, services_api, resources_api, entrypoints retained broad seam, bootstrap.runtime, bootstrap.cli.</w:t>
-      </w:r>
-    </w:p>
-    <w:bookmarkEnd w:id="193"/>
-    <w:bookmarkStart w:id="194" w:name="метаданные-30"/>
+        <w:t xml:space="preserve">Диаграмма «Bootstrap: Runtime and Admin Wiring» из architecture-набора детализирует конкретный архитектурный компонент или подсистему BioETL. Она представлена в формате блок-схема потоков (flowchart) и служит ориентиром на уровне детализации «System / Component». В комментариях исходника зафиксирован фокус диаграммы: Covers how narrow public composition APIs and the retained broad seam expose runtime/admin assembly outputs.. Схема имеет плотность порядка 19 узлов и 24 связей; её удобно использовать как обзорный архитектурный срез для проверки влияния изменений, согласования интерфейсов и подготовки рефакторинга, но не как исчерпывающий каталог текущей кодовой поверхности. Ключевые блоки/подграфы: Public composition APIs, Composition bootstrap, Infrastructure collaborators, Created services. Показательные узлы для быстрого чтения: execution_api, services_api, resources_api, entrypoints retained broad seam, bootstrap.runtime, bootstrap.cli.</w:t>
+      </w:r>
+    </w:p>
+    <w:bookmarkEnd w:id="162"/>
+    <w:bookmarkStart w:id="166" w:name="метаданные-30"/>
     <w:p>
       <w:pPr>
         <w:pStyle w:val="Heading3"/>
@@ -6641,15 +6672,15 @@
         <w:br w:type="page"/>
       </w:r>
     </w:p>
-    <w:bookmarkEnd w:id="194"/>
-    <w:bookmarkEnd w:id="195"/>
-    <w:bookmarkStart w:id="201" w:name="Xc71fa32a5a239c21cc2015e1d3c058b5a5b0e50"/>
-    <w:p>
-      <w:pPr>
-        <w:pStyle w:val="Heading2"/>
-      </w:pPr>
-      <w:r>
-        <w:t xml:space="preserve">13-port-protocol-contracts — Port/Protocol Contracts (Full Map)</w:t>
+    <w:p>
+      <w:pPr>
+        <w:pStyle w:val="FirstParagraph"/>
+      </w:pPr>
+      <w:r>
+        <w:t xml:space="preserve"> </w:t>
+      </w:r>
+      <w:r>
+        <w:t xml:space="preserve">## 13-port-protocol-contracts — Port/Protocol Contracts (Full Map)</w:t>
       </w:r>
     </w:p>
     <w:p>
@@ -6661,18 +6692,18 @@
           <wp:inline>
             <wp:extent cx="5334000" cy="23247900"/>
             <wp:effectExtent b="0" l="0" r="0" t="0"/>
-            <wp:docPr descr="13-port-protocol-contracts" title="" id="197" name="Picture"/>
+            <wp:docPr descr="13-port-protocol-contracts" title="" id="164" name="Picture"/>
             <a:graphic>
               <a:graphicData uri="http://schemas.openxmlformats.org/drawingml/2006/picture">
                 <pic:pic>
                   <pic:nvPicPr>
-                    <pic:cNvPr descr="../architecture/png/13-port-protocol-contracts.png" id="198" name="Picture"/>
+                    <pic:cNvPr descr="file:///E:/g-drive/05_AI/github/BioactivityDataAcquisition2/docs/02-architecture/diagrams/architecture/png/13-port-protocol-contracts.png" id="165" name="Picture"/>
                     <pic:cNvPicPr>
                       <a:picLocks noChangeArrowheads="1" noChangeAspect="1"/>
                     </pic:cNvPicPr>
                   </pic:nvPicPr>
                   <pic:blipFill>
-                    <a:blip r:embed="rId196"/>
+                    <a:blip r:embed="rId163"/>
                     <a:stretch>
                       <a:fillRect/>
                     </a:stretch>
@@ -6707,7 +6738,8 @@
         <w:t xml:space="preserve">13-port-protocol-contracts</w:t>
       </w:r>
     </w:p>
-    <w:bookmarkStart w:id="199" w:name="описание-31"/>
+    <w:bookmarkEnd w:id="166"/>
+    <w:bookmarkStart w:id="167" w:name="описание-31"/>
     <w:p>
       <w:pPr>
         <w:pStyle w:val="Heading3"/>
@@ -6721,11 +6753,11 @@
         <w:pStyle w:val="FirstParagraph"/>
       </w:pPr>
       <w:r>
-        <w:t xml:space="preserve">Диаграмма «Port/Protocol Contracts (Full Map)» из architecture-набора детализирует конкретный архитектурный компонент или подсистему BioETL. Она представлена в формате блок-схема потоков (flowchart) и служит ориентиром на уровне детализации «System / Component». В комментариях исходника зафиксирован фокус диаграммы: All domain Ports and their infrastructure implementations.. На схеме отражено примерно 68 узлов, поэтому её удобно использовать для проверки влияния изменений, согласования интерфейсов и подготовки рефакторинга. Ключевые блоки/подграфы: Domain Ports (Protocols), Infrastructure Implementations, Application Implementations. Показательные узлы для быстрого чтения: DataSourcePort, FilterableDataSourcePort, StoragePort, LockPort, CheckpointPort, QuarantinePort. Примечание: Decomposed into 13a, 13b, 13c, 13d sub-diagrams.</w:t>
-      </w:r>
-    </w:p>
-    <w:bookmarkEnd w:id="199"/>
-    <w:bookmarkStart w:id="200" w:name="метаданные-31"/>
+        <w:t xml:space="preserve">Диаграмма «Port/Protocol Contracts (Full Map)» из architecture-набора детализирует конкретный архитектурный компонент или подсистему BioETL. Она представлена в формате блок-схема потоков (flowchart) и служит ориентиром на уровне детализации «System / Component». В комментариях исходника зафиксирован фокус диаграммы: All domain Ports and their infrastructure implementations.. Схема имеет плотность порядка 68 узлов; её удобно использовать как обзорный архитектурный срез для проверки влияния изменений, согласования интерфейсов и подготовки рефакторинга, но не как исчерпывающий каталог текущей кодовой поверхности. Ключевые блоки/подграфы: Domain Ports (Protocols), Infrastructure Implementations, Application Implementations. Показательные узлы для быстрого чтения: DataSourcePort, FilterableDataSourcePort, StoragePort, LockPort, CheckpointPort, QuarantinePort. Примечание: Decomposed into 13a, 13b, 13c, 13d sub-diagrams.</w:t>
+      </w:r>
+    </w:p>
+    <w:bookmarkEnd w:id="167"/>
+    <w:bookmarkStart w:id="171" w:name="метаданные-31"/>
     <w:p>
       <w:pPr>
         <w:pStyle w:val="Heading3"/>
@@ -6823,15 +6855,15 @@
         <w:br w:type="page"/>
       </w:r>
     </w:p>
-    <w:bookmarkEnd w:id="200"/>
-    <w:bookmarkEnd w:id="201"/>
-    <w:bookmarkStart w:id="207" w:name="X6c540fdd7dfaf30859368c71ded70a0b10983cc"/>
-    <w:p>
-      <w:pPr>
-        <w:pStyle w:val="Heading2"/>
-      </w:pPr>
-      <w:r>
-        <w:t xml:space="preserve">13a-data-storage-ports — DataSource and Storage Ports</w:t>
+    <w:p>
+      <w:pPr>
+        <w:pStyle w:val="FirstParagraph"/>
+      </w:pPr>
+      <w:r>
+        <w:t xml:space="preserve"> </w:t>
+      </w:r>
+      <w:r>
+        <w:t xml:space="preserve">## 13a-data-storage-ports — DataSource and Storage Ports</w:t>
       </w:r>
     </w:p>
     <w:p>
@@ -6843,18 +6875,18 @@
           <wp:inline>
             <wp:extent cx="5334000" cy="6991321"/>
             <wp:effectExtent b="0" l="0" r="0" t="0"/>
-            <wp:docPr descr="13a-data-storage-ports" title="" id="203" name="Picture"/>
+            <wp:docPr descr="13a-data-storage-ports" title="" id="169" name="Picture"/>
             <a:graphic>
               <a:graphicData uri="http://schemas.openxmlformats.org/drawingml/2006/picture">
                 <pic:pic>
                   <pic:nvPicPr>
-                    <pic:cNvPr descr="../architecture/png/13a-data-storage-ports.png" id="204" name="Picture"/>
+                    <pic:cNvPr descr="file:///E:/g-drive/05_AI/github/BioactivityDataAcquisition2/docs/02-architecture/diagrams/architecture/png/13a-data-storage-ports.png" id="170" name="Picture"/>
                     <pic:cNvPicPr>
                       <a:picLocks noChangeArrowheads="1" noChangeAspect="1"/>
                     </pic:cNvPicPr>
                   </pic:nvPicPr>
                   <pic:blipFill>
-                    <a:blip r:embed="rId202"/>
+                    <a:blip r:embed="rId168"/>
                     <a:stretch>
                       <a:fillRect/>
                     </a:stretch>
@@ -6889,7 +6921,8 @@
         <w:t xml:space="preserve">13a-data-storage-ports</w:t>
       </w:r>
     </w:p>
-    <w:bookmarkStart w:id="205" w:name="описание-32"/>
+    <w:bookmarkEnd w:id="171"/>
+    <w:bookmarkStart w:id="172" w:name="описание-32"/>
     <w:p>
       <w:pPr>
         <w:pStyle w:val="Heading3"/>
@@ -6903,11 +6936,11 @@
         <w:pStyle w:val="FirstParagraph"/>
       </w:pPr>
       <w:r>
-        <w:t xml:space="preserve">Диаграмма «DataSource and Storage Ports» из architecture-набора детализирует конкретный архитектурный компонент или подсистему BioETL. Она представлена в формате блок-схема потоков (flowchart) и служит ориентиром на уровне детализации «System / Component». В комментариях исходника зафиксирован фокус диаграммы: All data acquisition and storage ports.. На схеме отражено примерно 20 узлов, поэтому её удобно использовать для проверки влияния изменений, согласования интерфейсов и подготовки рефакторинга. Ключевые блоки/подграфы: Domain Ports, Implementations. Показательные узлы для быстрого чтения: fa:fa-plug DataSourcePort, fa:fa-filter FilterableDataSourcePort, fa:fa-database StoragePort, fa:fa-book-open DeltaReaderPort, fa:fa-file-import InputFilterPort, ChemblAdapter.</w:t>
-      </w:r>
-    </w:p>
-    <w:bookmarkEnd w:id="205"/>
-    <w:bookmarkStart w:id="206" w:name="метаданные-32"/>
+        <w:t xml:space="preserve">Диаграмма «DataSource and Storage Ports» из architecture-набора детализирует конкретный архитектурный компонент или подсистему BioETL. Она представлена в формате блок-схема потоков (flowchart) и служит ориентиром на уровне детализации «System / Component». В комментариях исходника зафиксирован фокус диаграммы: All data acquisition and storage ports.. Схема имеет плотность порядка 20 узлов; её удобно использовать как обзорный архитектурный срез для проверки влияния изменений, согласования интерфейсов и подготовки рефакторинга, но не как исчерпывающий каталог текущей кодовой поверхности. Ключевые блоки/подграфы: Domain Ports, Implementations. Показательные узлы для быстрого чтения: fa:fa-plug DataSourcePort, fa:fa-filter FilterableDataSourcePort, fa:fa-database StoragePort, fa:fa-book-open DeltaReaderPort, fa:fa-file-import InputFilterPort, ChemblAdapter.</w:t>
+      </w:r>
+    </w:p>
+    <w:bookmarkEnd w:id="172"/>
+    <w:bookmarkStart w:id="176" w:name="метаданные-32"/>
     <w:p>
       <w:pPr>
         <w:pStyle w:val="Heading3"/>
@@ -7005,15 +7038,15 @@
         <w:br w:type="page"/>
       </w:r>
     </w:p>
-    <w:bookmarkEnd w:id="206"/>
-    <w:bookmarkEnd w:id="207"/>
-    <w:bookmarkStart w:id="213" w:name="X2460e6c6ff6ff7a56695708933223c08523ccba"/>
-    <w:p>
-      <w:pPr>
-        <w:pStyle w:val="Heading2"/>
-      </w:pPr>
-      <w:r>
-        <w:t xml:space="preserve">13a-port-contracts-data-sources — Port Contracts: Data Sources</w:t>
+    <w:p>
+      <w:pPr>
+        <w:pStyle w:val="FirstParagraph"/>
+      </w:pPr>
+      <w:r>
+        <w:t xml:space="preserve"> </w:t>
+      </w:r>
+      <w:r>
+        <w:t xml:space="preserve">## 13a-port-contracts-data-sources — Port Contracts: Data Sources</w:t>
       </w:r>
     </w:p>
     <w:p>
@@ -7025,18 +7058,18 @@
           <wp:inline>
             <wp:extent cx="5334000" cy="6935070"/>
             <wp:effectExtent b="0" l="0" r="0" t="0"/>
-            <wp:docPr descr="13a-port-contracts-data-sources" title="" id="209" name="Picture"/>
+            <wp:docPr descr="13a-port-contracts-data-sources" title="" id="174" name="Picture"/>
             <a:graphic>
               <a:graphicData uri="http://schemas.openxmlformats.org/drawingml/2006/picture">
                 <pic:pic>
                   <pic:nvPicPr>
-                    <pic:cNvPr descr="../architecture/png/13a-port-contracts-data-sources.png" id="210" name="Picture"/>
+                    <pic:cNvPr descr="file:///E:/g-drive/05_AI/github/BioactivityDataAcquisition2/docs/02-architecture/diagrams/architecture/png/13a-port-contracts-data-sources.png" id="175" name="Picture"/>
                     <pic:cNvPicPr>
                       <a:picLocks noChangeArrowheads="1" noChangeAspect="1"/>
                     </pic:cNvPicPr>
                   </pic:nvPicPr>
                   <pic:blipFill>
-                    <a:blip r:embed="rId208"/>
+                    <a:blip r:embed="rId173"/>
                     <a:stretch>
                       <a:fillRect/>
                     </a:stretch>
@@ -7071,7 +7104,8 @@
         <w:t xml:space="preserve">13a-port-contracts-data-sources</w:t>
       </w:r>
     </w:p>
-    <w:bookmarkStart w:id="211" w:name="описание-33"/>
+    <w:bookmarkEnd w:id="176"/>
+    <w:bookmarkStart w:id="177" w:name="описание-33"/>
     <w:p>
       <w:pPr>
         <w:pStyle w:val="Heading3"/>
@@ -7085,11 +7119,11 @@
         <w:pStyle w:val="FirstParagraph"/>
       </w:pPr>
       <w:r>
-        <w:t xml:space="preserve">Диаграмма «Port Contracts: Data Sources» из architecture-набора детализирует конкретный архитектурный компонент или подсистему BioETL. Она представлена в формате блок-схема потоков (flowchart) и служит ориентиром на уровне детализации «System / Component». В комментариях исходника зафиксирован фокус диаграммы: Covers DataSourcePort and FilterableDataSourcePort implementations per provider.. На схеме отражено примерно 9 узлов, поэтому её удобно использовать для проверки влияния изменений, согласования интерфейсов и подготовки рефакторинга. Ключевые блоки/подграфы: Domain Layer, Infrastructure Layer. Показательные узлы для быстрого чтения: DataSourcePort, FilterableDataSourcePort, ChemblAdapter.</w:t>
-      </w:r>
-    </w:p>
-    <w:bookmarkEnd w:id="211"/>
-    <w:bookmarkStart w:id="212" w:name="метаданные-33"/>
+        <w:t xml:space="preserve">Диаграмма «Port Contracts: Data Sources» из architecture-набора детализирует конкретный архитектурный компонент или подсистему BioETL. Она представлена в формате блок-схема потоков (flowchart) и служит ориентиром на уровне детализации «System / Component». В комментариях исходника зафиксирован фокус диаграммы: Covers DataSourcePort and FilterableDataSourcePort implementations per provider.. Схема имеет плотность порядка 9 узлов; её удобно использовать как обзорный архитектурный срез для проверки влияния изменений, согласования интерфейсов и подготовки рефакторинга, но не как исчерпывающий каталог текущей кодовой поверхности. Ключевые блоки/подграфы: Domain Layer, Infrastructure Layer. Показательные узлы для быстрого чтения: DataSourcePort, FilterableDataSourcePort, ChemblAdapter.</w:t>
+      </w:r>
+    </w:p>
+    <w:bookmarkEnd w:id="177"/>
+    <w:bookmarkStart w:id="181" w:name="метаданные-33"/>
     <w:p>
       <w:pPr>
         <w:pStyle w:val="Heading3"/>
@@ -7187,15 +7221,15 @@
         <w:br w:type="page"/>
       </w:r>
     </w:p>
-    <w:bookmarkEnd w:id="212"/>
-    <w:bookmarkEnd w:id="213"/>
-    <w:bookmarkStart w:id="219" w:name="Xdd6117aa48f510aca935aae25f9db145c556b1c"/>
-    <w:p>
-      <w:pPr>
-        <w:pStyle w:val="Heading2"/>
-      </w:pPr>
-      <w:r>
-        <w:t xml:space="preserve">13b-operational-ports — Operational and Observability Ports</w:t>
+    <w:p>
+      <w:pPr>
+        <w:pStyle w:val="FirstParagraph"/>
+      </w:pPr>
+      <w:r>
+        <w:t xml:space="preserve"> </w:t>
+      </w:r>
+      <w:r>
+        <w:t xml:space="preserve">## 13b-operational-ports — Operational and Observability Ports</w:t>
       </w:r>
     </w:p>
     <w:p>
@@ -7207,18 +7241,18 @@
           <wp:inline>
             <wp:extent cx="5334000" cy="7276681"/>
             <wp:effectExtent b="0" l="0" r="0" t="0"/>
-            <wp:docPr descr="13b-operational-ports" title="" id="215" name="Picture"/>
+            <wp:docPr descr="13b-operational-ports" title="" id="179" name="Picture"/>
             <a:graphic>
               <a:graphicData uri="http://schemas.openxmlformats.org/drawingml/2006/picture">
                 <pic:pic>
                   <pic:nvPicPr>
-                    <pic:cNvPr descr="../architecture/png/13b-operational-ports.png" id="216" name="Picture"/>
+                    <pic:cNvPr descr="file:///E:/g-drive/05_AI/github/BioactivityDataAcquisition2/docs/02-architecture/diagrams/architecture/png/13b-operational-ports.png" id="180" name="Picture"/>
                     <pic:cNvPicPr>
                       <a:picLocks noChangeArrowheads="1" noChangeAspect="1"/>
                     </pic:cNvPicPr>
                   </pic:nvPicPr>
                   <pic:blipFill>
-                    <a:blip r:embed="rId214"/>
+                    <a:blip r:embed="rId178"/>
                     <a:stretch>
                       <a:fillRect/>
                     </a:stretch>
@@ -7253,7 +7287,8 @@
         <w:t xml:space="preserve">13b-operational-ports</w:t>
       </w:r>
     </w:p>
-    <w:bookmarkStart w:id="217" w:name="описание-34"/>
+    <w:bookmarkEnd w:id="181"/>
+    <w:bookmarkStart w:id="182" w:name="описание-34"/>
     <w:p>
       <w:pPr>
         <w:pStyle w:val="Heading3"/>
@@ -7267,11 +7302,11 @@
         <w:pStyle w:val="FirstParagraph"/>
       </w:pPr>
       <w:r>
-        <w:t xml:space="preserve">Диаграмма «Operational and Observability Ports» из architecture-набора детализирует конкретный архитектурный компонент или подсистему BioETL. Она представлена в формате блок-схема потоков (flowchart) и служит ориентиром на уровне детализации «System / Component». В комментариях исходника зафиксирован фокус диаграммы: Monitoring, logging, and operational control ports.. На схеме отражено примерно 25 узлов, поэтому её удобно использовать для проверки влияния изменений, согласования интерфейсов и подготовки рефакторинга. Ключевые блоки/подграфы: Domain Ports, Implementations. Показательные узлы для быстрого чтения: fa:fa-lock LockPort, fa:fa-flag CheckpointPort, fa:fa-list LoggerPort, fa:fa-chart-line MetricsPort, fa:fa-wave-square TracingPort, fa:fa-bolt CircuitBreakerPort. Примечание: Decomposed into 13e-operational-ports-domain, 13f-operational-ports-infra.</w:t>
-      </w:r>
-    </w:p>
-    <w:bookmarkEnd w:id="217"/>
-    <w:bookmarkStart w:id="218" w:name="метаданные-34"/>
+        <w:t xml:space="preserve">Диаграмма «Operational and Observability Ports» из architecture-набора детализирует конкретный архитектурный компонент или подсистему BioETL. Она представлена в формате блок-схема потоков (flowchart) и служит ориентиром на уровне детализации «System / Component». В комментариях исходника зафиксирован фокус диаграммы: Monitoring, logging, and operational control ports.. Схема имеет плотность порядка 25 узлов; её удобно использовать как обзорный архитектурный срез для проверки влияния изменений, согласования интерфейсов и подготовки рефакторинга, но не как исчерпывающий каталог текущей кодовой поверхности. Ключевые блоки/подграфы: Domain Ports, Implementations. Показательные узлы для быстрого чтения: fa:fa-lock LockPort, fa:fa-flag CheckpointPort, fa:fa-list LoggerPort, fa:fa-chart-line MetricsPort, fa:fa-wave-square TracingPort, fa:fa-bolt CircuitBreakerPort. Примечание: Decomposed into 13e-operational-ports-domain, 13f-operational-ports-infra.</w:t>
+      </w:r>
+    </w:p>
+    <w:bookmarkEnd w:id="182"/>
+    <w:bookmarkStart w:id="186" w:name="метаданные-34"/>
     <w:p>
       <w:pPr>
         <w:pStyle w:val="Heading3"/>
@@ -7369,15 +7404,15 @@
         <w:br w:type="page"/>
       </w:r>
     </w:p>
-    <w:bookmarkEnd w:id="218"/>
-    <w:bookmarkEnd w:id="219"/>
-    <w:bookmarkStart w:id="225" w:name="X88b0407e79bb7f1ff4f233da728bdc85e698842"/>
-    <w:p>
-      <w:pPr>
-        <w:pStyle w:val="Heading2"/>
-      </w:pPr>
-      <w:r>
-        <w:t xml:space="preserve">13b-port-contracts-storage — Port Contracts: Storage</w:t>
+    <w:p>
+      <w:pPr>
+        <w:pStyle w:val="FirstParagraph"/>
+      </w:pPr>
+      <w:r>
+        <w:t xml:space="preserve"> </w:t>
+      </w:r>
+      <w:r>
+        <w:t xml:space="preserve">## 13b-port-contracts-storage — Port Contracts: Storage</w:t>
       </w:r>
     </w:p>
     <w:p>
@@ -7389,18 +7424,18 @@
           <wp:inline>
             <wp:extent cx="5334000" cy="4928000"/>
             <wp:effectExtent b="0" l="0" r="0" t="0"/>
-            <wp:docPr descr="13b-port-contracts-storage" title="" id="221" name="Picture"/>
+            <wp:docPr descr="13b-port-contracts-storage" title="" id="184" name="Picture"/>
             <a:graphic>
               <a:graphicData uri="http://schemas.openxmlformats.org/drawingml/2006/picture">
                 <pic:pic>
                   <pic:nvPicPr>
-                    <pic:cNvPr descr="../architecture/png/13b-port-contracts-storage.png" id="222" name="Picture"/>
+                    <pic:cNvPr descr="file:///E:/g-drive/05_AI/github/BioactivityDataAcquisition2/docs/02-architecture/diagrams/architecture/png/13b-port-contracts-storage.png" id="185" name="Picture"/>
                     <pic:cNvPicPr>
                       <a:picLocks noChangeArrowheads="1" noChangeAspect="1"/>
                     </pic:cNvPicPr>
                   </pic:nvPicPr>
                   <pic:blipFill>
-                    <a:blip r:embed="rId220"/>
+                    <a:blip r:embed="rId183"/>
                     <a:stretch>
                       <a:fillRect/>
                     </a:stretch>
@@ -7435,7 +7470,8 @@
         <w:t xml:space="preserve">13b-port-contracts-storage</w:t>
       </w:r>
     </w:p>
-    <w:bookmarkStart w:id="223" w:name="описание-35"/>
+    <w:bookmarkEnd w:id="186"/>
+    <w:bookmarkStart w:id="187" w:name="описание-35"/>
     <w:p>
       <w:pPr>
         <w:pStyle w:val="Heading3"/>
@@ -7449,11 +7485,11 @@
         <w:pStyle w:val="FirstParagraph"/>
       </w:pPr>
       <w:r>
-        <w:t xml:space="preserve">Диаграмма «Port Contracts: Storage» из architecture-набора детализирует конкретный архитектурный компонент или подсистему BioETL. Она представлена в формате блок-схема потоков (flowchart) и служит ориентиром на уровне детализации «System / Component». В комментариях исходника зафиксирован фокус диаграммы: Covers StoragePort, DeltaReaderPort, and layer-specific MetadataWriterPort implementations.. На схеме отражено примерно 9 узлов, поэтому её удобно использовать для проверки влияния изменений, согласования интерфейсов и подготовки рефакторинга. Ключевые блоки/подграфы: Domain Layer, Infrastructure Layer. Показательные узлы для быстрого чтения: StoragePort, DeltaReaderPort, MetadataWriterPort write_bronze / write_silver / write_gold, BronzeWriter, DeltaReader, MetadataWriter atomic metadata sidecars.</w:t>
-      </w:r>
-    </w:p>
-    <w:bookmarkEnd w:id="223"/>
-    <w:bookmarkStart w:id="224" w:name="метаданные-35"/>
+        <w:t xml:space="preserve">Диаграмма «Port Contracts: Storage» из architecture-набора детализирует конкретный архитектурный компонент или подсистему BioETL. Она представлена в формате блок-схема потоков (flowchart) и служит ориентиром на уровне детализации «System / Component». В комментариях исходника зафиксирован фокус диаграммы: Covers StoragePort, DeltaReaderPort, and layer-specific MetadataWriterPort implementations.. Схема имеет плотность порядка 9 узлов; её удобно использовать как обзорный архитектурный срез для проверки влияния изменений, согласования интерфейсов и подготовки рефакторинга, но не как исчерпывающий каталог текущей кодовой поверхности. Ключевые блоки/подграфы: Domain Layer, Infrastructure Layer. Показательные узлы для быстрого чтения: StoragePort, DeltaReaderPort, MetadataWriterPort write_bronze / write_silver / write_gold, BronzeWriter, DeltaReader, MetadataWriter atomic metadata sidecars.</w:t>
+      </w:r>
+    </w:p>
+    <w:bookmarkEnd w:id="187"/>
+    <w:bookmarkStart w:id="191" w:name="метаданные-35"/>
     <w:p>
       <w:pPr>
         <w:pStyle w:val="Heading3"/>
@@ -7551,15 +7587,15 @@
         <w:br w:type="page"/>
       </w:r>
     </w:p>
-    <w:bookmarkEnd w:id="224"/>
-    <w:bookmarkEnd w:id="225"/>
-    <w:bookmarkStart w:id="231" w:name="Xa77f65ad9cb54478fcf453948371edc309fbdf4"/>
-    <w:p>
-      <w:pPr>
-        <w:pStyle w:val="Heading2"/>
-      </w:pPr>
-      <w:r>
-        <w:t xml:space="preserve">13c-port-contracts-observability — Port Contracts: Observability and Resilience</w:t>
+    <w:p>
+      <w:pPr>
+        <w:pStyle w:val="FirstParagraph"/>
+      </w:pPr>
+      <w:r>
+        <w:t xml:space="preserve"> </w:t>
+      </w:r>
+      <w:r>
+        <w:t xml:space="preserve">## 13c-port-contracts-observability — Port Contracts: Observability and Resilience</w:t>
       </w:r>
     </w:p>
     <w:p>
@@ -7571,18 +7607,18 @@
           <wp:inline>
             <wp:extent cx="5334000" cy="9122635"/>
             <wp:effectExtent b="0" l="0" r="0" t="0"/>
-            <wp:docPr descr="13c-port-contracts-observability" title="" id="227" name="Picture"/>
+            <wp:docPr descr="13c-port-contracts-observability" title="" id="189" name="Picture"/>
             <a:graphic>
               <a:graphicData uri="http://schemas.openxmlformats.org/drawingml/2006/picture">
                 <pic:pic>
                   <pic:nvPicPr>
-                    <pic:cNvPr descr="../architecture/png/13c-port-contracts-observability.png" id="228" name="Picture"/>
+                    <pic:cNvPr descr="file:///E:/g-drive/05_AI/github/BioactivityDataAcquisition2/docs/02-architecture/diagrams/architecture/png/13c-port-contracts-observability.png" id="190" name="Picture"/>
                     <pic:cNvPicPr>
                       <a:picLocks noChangeArrowheads="1" noChangeAspect="1"/>
                     </pic:cNvPicPr>
                   </pic:nvPicPr>
                   <pic:blipFill>
-                    <a:blip r:embed="rId226"/>
+                    <a:blip r:embed="rId188"/>
                     <a:stretch>
                       <a:fillRect/>
                     </a:stretch>
@@ -7617,7 +7653,8 @@
         <w:t xml:space="preserve">13c-port-contracts-observability</w:t>
       </w:r>
     </w:p>
-    <w:bookmarkStart w:id="229" w:name="описание-36"/>
+    <w:bookmarkEnd w:id="191"/>
+    <w:bookmarkStart w:id="192" w:name="описание-36"/>
     <w:p>
       <w:pPr>
         <w:pStyle w:val="Heading3"/>
@@ -7631,11 +7668,11 @@
         <w:pStyle w:val="FirstParagraph"/>
       </w:pPr>
       <w:r>
-        <w:t xml:space="preserve">Диаграмма «Port Contracts: Observability and Resilience» из architecture-набора детализирует конкретный архитектурный компонент или подсистему BioETL. Она представлена в формате блок-схема потоков (flowchart) и служит ориентиром на уровне детализации «System / Component». В комментариях исходника зафиксирован фокус диаграммы: Covers Logger/Metrics/Tracing ports plus resilience control ports.. На схеме отражено примерно 15 узлов, поэтому её удобно использовать для проверки влияния изменений, согласования интерфейсов и подготовки рефакторинга. Ключевые блоки/подграфы: Domain Layer, Infrastructure Layer. Показательные узлы для быстрого чтения: LoggerPort, MetricsPort, TracingPort, CircuitBreakerPort, RateLimiterPort, UnifiedLogger.</w:t>
-      </w:r>
-    </w:p>
-    <w:bookmarkEnd w:id="229"/>
-    <w:bookmarkStart w:id="230" w:name="метаданные-36"/>
+        <w:t xml:space="preserve">Диаграмма «Port Contracts: Observability and Resilience» из architecture-набора детализирует конкретный архитектурный компонент или подсистему BioETL. Она представлена в формате блок-схема потоков (flowchart) и служит ориентиром на уровне детализации «System / Component». В комментариях исходника зафиксирован фокус диаграммы: Covers Logger/Metrics/Tracing ports plus resilience control ports.. Схема имеет плотность порядка 15 узлов; её удобно использовать как обзорный архитектурный срез для проверки влияния изменений, согласования интерфейсов и подготовки рефакторинга, но не как исчерпывающий каталог текущей кодовой поверхности. Ключевые блоки/подграфы: Domain Layer, Infrastructure Layer. Показательные узлы для быстрого чтения: LoggerPort, MetricsPort, TracingPort, CircuitBreakerPort, RateLimiterPort, UnifiedLogger.</w:t>
+      </w:r>
+    </w:p>
+    <w:bookmarkEnd w:id="192"/>
+    <w:bookmarkStart w:id="196" w:name="метаданные-36"/>
     <w:p>
       <w:pPr>
         <w:pStyle w:val="Heading3"/>
@@ -7733,15 +7770,15 @@
         <w:br w:type="page"/>
       </w:r>
     </w:p>
-    <w:bookmarkEnd w:id="230"/>
-    <w:bookmarkEnd w:id="231"/>
-    <w:bookmarkStart w:id="237" w:name="X6dabd7ce3332fa7a78db384339052902c002dfd"/>
-    <w:p>
-      <w:pPr>
-        <w:pStyle w:val="Heading2"/>
-      </w:pPr>
-      <w:r>
-        <w:t xml:space="preserve">13c-validation-dq-ports — Validation and Data Quality Ports</w:t>
+    <w:p>
+      <w:pPr>
+        <w:pStyle w:val="FirstParagraph"/>
+      </w:pPr>
+      <w:r>
+        <w:t xml:space="preserve"> </w:t>
+      </w:r>
+      <w:r>
+        <w:t xml:space="preserve">## 13c-validation-dq-ports — Validation and Data Quality Ports</w:t>
       </w:r>
     </w:p>
     <w:p>
@@ -7753,18 +7790,18 @@
           <wp:inline>
             <wp:extent cx="5334000" cy="7126156"/>
             <wp:effectExtent b="0" l="0" r="0" t="0"/>
-            <wp:docPr descr="13c-validation-dq-ports" title="" id="233" name="Picture"/>
+            <wp:docPr descr="13c-validation-dq-ports" title="" id="194" name="Picture"/>
             <a:graphic>
               <a:graphicData uri="http://schemas.openxmlformats.org/drawingml/2006/picture">
                 <pic:pic>
                   <pic:nvPicPr>
-                    <pic:cNvPr descr="../architecture/png/13c-validation-dq-ports.png" id="234" name="Picture"/>
+                    <pic:cNvPr descr="file:///E:/g-drive/05_AI/github/BioactivityDataAcquisition2/docs/02-architecture/diagrams/architecture/png/13c-validation-dq-ports.png" id="195" name="Picture"/>
                     <pic:cNvPicPr>
                       <a:picLocks noChangeArrowheads="1" noChangeAspect="1"/>
                     </pic:cNvPicPr>
                   </pic:nvPicPr>
                   <pic:blipFill>
-                    <a:blip r:embed="rId232"/>
+                    <a:blip r:embed="rId193"/>
                     <a:stretch>
                       <a:fillRect/>
                     </a:stretch>
@@ -7799,7 +7836,8 @@
         <w:t xml:space="preserve">13c-validation-dq-ports</w:t>
       </w:r>
     </w:p>
-    <w:bookmarkStart w:id="235" w:name="описание-37"/>
+    <w:bookmarkEnd w:id="196"/>
+    <w:bookmarkStart w:id="197" w:name="описание-37"/>
     <w:p>
       <w:pPr>
         <w:pStyle w:val="Heading3"/>
@@ -7813,11 +7851,11 @@
         <w:pStyle w:val="FirstParagraph"/>
       </w:pPr>
       <w:r>
-        <w:t xml:space="preserve">Диаграмма «Validation and Data Quality Ports» из architecture-набора детализирует конкретный архитектурный компонент или подсистему BioETL. Она представлена в формате блок-схема потоков (flowchart) и служит ориентиром на уровне детализации «System / Component». В комментариях исходника зафиксирован фокус диаграммы: Ports for ensuring data correctness and quality reporting.. На схеме отражено примерно 20 узлов, поэтому её удобно использовать для проверки влияния изменений, согласования интерфейсов и подготовки рефакторинга. Ключевые блоки/подграфы: Domain Ports, Infrastructure, Application. Показательные узлы для быстрого чтения: SilverValidatorPort, GoldValidatorPort, BronzeDQ AnalyzerPort, SilverDQ AnalyzerPort, GoldDQ AnalyzerPort, DQReportWriterPort.</w:t>
-      </w:r>
-    </w:p>
-    <w:bookmarkEnd w:id="235"/>
-    <w:bookmarkStart w:id="236" w:name="метаданные-37"/>
+        <w:t xml:space="preserve">Диаграмма «Validation and Data Quality Ports» из architecture-набора детализирует конкретный архитектурный компонент или подсистему BioETL. Она представлена в формате блок-схема потоков (flowchart) и служит ориентиром на уровне детализации «System / Component». В комментариях исходника зафиксирован фокус диаграммы: Ports for ensuring data correctness and quality reporting.. Схема имеет плотность порядка 20 узлов; её удобно использовать как обзорный архитектурный срез для проверки влияния изменений, согласования интерфейсов и подготовки рефакторинга, но не как исчерпывающий каталог текущей кодовой поверхности. Ключевые блоки/подграфы: Domain Ports, Infrastructure, Application. Показательные узлы для быстрого чтения: SilverValidatorPort, GoldValidatorPort, BronzeDQ AnalyzerPort, SilverDQ AnalyzerPort, GoldDQ AnalyzerPort, DQReportWriterPort.</w:t>
+      </w:r>
+    </w:p>
+    <w:bookmarkEnd w:id="197"/>
+    <w:bookmarkStart w:id="201" w:name="метаданные-37"/>
     <w:p>
       <w:pPr>
         <w:pStyle w:val="Heading3"/>
@@ -7915,15 +7953,15 @@
         <w:br w:type="page"/>
       </w:r>
     </w:p>
-    <w:bookmarkEnd w:id="236"/>
-    <w:bookmarkEnd w:id="237"/>
-    <w:bookmarkStart w:id="243" w:name="X1ccfab4e6713dce86855c577b979bf0f78c3d12"/>
-    <w:p>
-      <w:pPr>
-        <w:pStyle w:val="Heading2"/>
-      </w:pPr>
-      <w:r>
-        <w:t xml:space="preserve">13d-port-contracts-services — Port Contracts: Services and Controls</w:t>
+    <w:p>
+      <w:pPr>
+        <w:pStyle w:val="FirstParagraph"/>
+      </w:pPr>
+      <w:r>
+        <w:t xml:space="preserve"> </w:t>
+      </w:r>
+      <w:r>
+        <w:t xml:space="preserve">## 13d-port-contracts-services — Port Contracts: Services and Controls</w:t>
       </w:r>
     </w:p>
     <w:p>
@@ -7935,18 +7973,18 @@
           <wp:inline>
             <wp:extent cx="5334000" cy="6537782"/>
             <wp:effectExtent b="0" l="0" r="0" t="0"/>
-            <wp:docPr descr="13d-port-contracts-services" title="" id="239" name="Picture"/>
+            <wp:docPr descr="13d-port-contracts-services" title="" id="199" name="Picture"/>
             <a:graphic>
               <a:graphicData uri="http://schemas.openxmlformats.org/drawingml/2006/picture">
                 <pic:pic>
                   <pic:nvPicPr>
-                    <pic:cNvPr descr="../architecture/png/13d-port-contracts-services.png" id="240" name="Picture"/>
+                    <pic:cNvPr descr="file:///E:/g-drive/05_AI/github/BioactivityDataAcquisition2/docs/02-architecture/diagrams/architecture/png/13d-port-contracts-services.png" id="200" name="Picture"/>
                     <pic:cNvPicPr>
                       <a:picLocks noChangeArrowheads="1" noChangeAspect="1"/>
                     </pic:cNvPicPr>
                   </pic:nvPicPr>
                   <pic:blipFill>
-                    <a:blip r:embed="rId238"/>
+                    <a:blip r:embed="rId198"/>
                     <a:stretch>
                       <a:fillRect/>
                     </a:stretch>
@@ -7981,7 +8019,8 @@
         <w:t xml:space="preserve">13d-port-contracts-services</w:t>
       </w:r>
     </w:p>
-    <w:bookmarkStart w:id="241" w:name="описание-38"/>
+    <w:bookmarkEnd w:id="201"/>
+    <w:bookmarkStart w:id="202" w:name="описание-38"/>
     <w:p>
       <w:pPr>
         <w:pStyle w:val="Heading3"/>
@@ -7995,11 +8034,11 @@
         <w:pStyle w:val="FirstParagraph"/>
       </w:pPr>
       <w:r>
-        <w:t xml:space="preserve">Диаграмма «Port Contracts: Services and Controls» из architecture-набора детализирует конкретный архитектурный компонент или подсистему BioETL. Она представлена в формате блок-схема потоков (flowchart) и служит ориентиром на уровне детализации «System / Component». В комментариях исходника зафиксирован фокус диаграммы: Covers control ports, data quality service ports, and related implementations.. На схеме отражено примерно 20 узлов и 2 связей, поэтому её удобно использовать для проверки влияния изменений, согласования интерфейсов и подготовки рефакторинга. Ключевые блоки/подграфы: Domain Layer, Infrastructure Layer, Application Layer, NoOp Implementations (fallback defaults). Показательные узлы для быстрого чтения: LockPort, CheckpointPort, QuarantinePort, AuditPort, PiiHasherPort, InputFilterPort.</w:t>
-      </w:r>
-    </w:p>
-    <w:bookmarkEnd w:id="241"/>
-    <w:bookmarkStart w:id="242" w:name="метаданные-38"/>
+        <w:t xml:space="preserve">Диаграмма «Port Contracts: Services and Controls» из architecture-набора детализирует конкретный архитектурный компонент или подсистему BioETL. Она представлена в формате блок-схема потоков (flowchart) и служит ориентиром на уровне детализации «System / Component». В комментариях исходника зафиксирован фокус диаграммы: Covers control ports, data quality service ports, and related implementations.. Схема имеет плотность порядка 20 узлов и 2 связей; её удобно использовать как обзорный архитектурный срез для проверки влияния изменений, согласования интерфейсов и подготовки рефакторинга, но не как исчерпывающий каталог текущей кодовой поверхности. Ключевые блоки/подграфы: Domain Layer, Infrastructure Layer, Application Layer, NoOp Implementations (fallback defaults). Показательные узлы для быстрого чтения: LockPort, CheckpointPort, QuarantinePort, AuditPort, PiiHasherPort, InputFilterPort.</w:t>
+      </w:r>
+    </w:p>
+    <w:bookmarkEnd w:id="202"/>
+    <w:bookmarkStart w:id="206" w:name="метаданные-38"/>
     <w:p>
       <w:pPr>
         <w:pStyle w:val="Heading3"/>
@@ -8097,15 +8136,15 @@
         <w:br w:type="page"/>
       </w:r>
     </w:p>
-    <w:bookmarkEnd w:id="242"/>
-    <w:bookmarkEnd w:id="243"/>
-    <w:bookmarkStart w:id="249" w:name="Xec74d41e030d1bf7d2bed902fcae5c960269dea"/>
-    <w:p>
-      <w:pPr>
-        <w:pStyle w:val="Heading2"/>
-      </w:pPr>
-      <w:r>
-        <w:t xml:space="preserve">13e-operational-ports-domain — Domain Operational Ports</w:t>
+    <w:p>
+      <w:pPr>
+        <w:pStyle w:val="FirstParagraph"/>
+      </w:pPr>
+      <w:r>
+        <w:t xml:space="preserve"> </w:t>
+      </w:r>
+      <w:r>
+        <w:t xml:space="preserve">## 13e-operational-ports-domain — Domain Operational Ports</w:t>
       </w:r>
     </w:p>
     <w:p>
@@ -8117,18 +8156,18 @@
           <wp:inline>
             <wp:extent cx="5334000" cy="417139"/>
             <wp:effectExtent b="0" l="0" r="0" t="0"/>
-            <wp:docPr descr="13e-operational-ports-domain" title="" id="245" name="Picture"/>
+            <wp:docPr descr="13e-operational-ports-domain" title="" id="204" name="Picture"/>
             <a:graphic>
               <a:graphicData uri="http://schemas.openxmlformats.org/drawingml/2006/picture">
                 <pic:pic>
                   <pic:nvPicPr>
-                    <pic:cNvPr descr="../architecture/png/13e-operational-ports-domain.png" id="246" name="Picture"/>
+                    <pic:cNvPr descr="file:///E:/g-drive/05_AI/github/BioactivityDataAcquisition2/docs/02-architecture/diagrams/architecture/png/13e-operational-ports-domain.png" id="205" name="Picture"/>
                     <pic:cNvPicPr>
                       <a:picLocks noChangeArrowheads="1" noChangeAspect="1"/>
                     </pic:cNvPicPr>
                   </pic:nvPicPr>
                   <pic:blipFill>
-                    <a:blip r:embed="rId244"/>
+                    <a:blip r:embed="rId203"/>
                     <a:stretch>
                       <a:fillRect/>
                     </a:stretch>
@@ -8163,7 +8202,8 @@
         <w:t xml:space="preserve">13e-operational-ports-domain</w:t>
       </w:r>
     </w:p>
-    <w:bookmarkStart w:id="247" w:name="описание-39"/>
+    <w:bookmarkEnd w:id="206"/>
+    <w:bookmarkStart w:id="207" w:name="описание-39"/>
     <w:p>
       <w:pPr>
         <w:pStyle w:val="Heading3"/>
@@ -8177,11 +8217,11 @@
         <w:pStyle w:val="FirstParagraph"/>
       </w:pPr>
       <w:r>
-        <w:t xml:space="preserve">Диаграмма «Domain Operational Ports» из architecture-набора детализирует конкретный архитектурный компонент или подсистему BioETL. Она представлена в формате блок-схема потоков (flowchart) и служит ориентиром на уровне детализации «System / Component». В комментариях исходника зафиксирован фокус диаграммы: Independent protocol definitions for operational concerns (lock, checkpoint, observability, shutdown).. На схеме отражено примерно 8 узлов, поэтому её удобно использовать для проверки влияния изменений, согласования интерфейсов и подготовки рефакторинга. Ключевые блоки/подграфы: Domain Operational Ports. Показательные узлы для быстрого чтения: fa:fa-lock LockPort, fa:fa-flag CheckpointPort, fa:fa-list LoggerPort, fa:fa-chart-line MetricsPort, fa:fa-wave-square TracingPort, fa:fa-bolt CircuitBreakerPort.</w:t>
-      </w:r>
-    </w:p>
-    <w:bookmarkEnd w:id="247"/>
-    <w:bookmarkStart w:id="248" w:name="метаданные-39"/>
+        <w:t xml:space="preserve">Диаграмма «Domain Operational Ports» из architecture-набора детализирует конкретный архитектурный компонент или подсистему BioETL. Она представлена в формате блок-схема потоков (flowchart) и служит ориентиром на уровне детализации «System / Component». В комментариях исходника зафиксирован фокус диаграммы: Independent protocol definitions for operational concerns (lock, checkpoint, observability, shutdown).. Схема имеет плотность порядка 8 узлов; её удобно использовать как обзорный архитектурный срез для проверки влияния изменений, согласования интерфейсов и подготовки рефакторинга, но не как исчерпывающий каталог текущей кодовой поверхности. Ключевые блоки/подграфы: Domain Operational Ports. Показательные узлы для быстрого чтения: fa:fa-lock LockPort, fa:fa-flag CheckpointPort, fa:fa-list LoggerPort, fa:fa-chart-line MetricsPort, fa:fa-wave-square TracingPort, fa:fa-bolt CircuitBreakerPort.</w:t>
+      </w:r>
+    </w:p>
+    <w:bookmarkEnd w:id="207"/>
+    <w:bookmarkStart w:id="211" w:name="метаданные-39"/>
     <w:p>
       <w:pPr>
         <w:pStyle w:val="Heading3"/>
@@ -8279,15 +8319,15 @@
         <w:br w:type="page"/>
       </w:r>
     </w:p>
-    <w:bookmarkEnd w:id="248"/>
-    <w:bookmarkEnd w:id="249"/>
-    <w:bookmarkStart w:id="255" w:name="X67484124c46b3739998f33c6f95add404176c66"/>
-    <w:p>
-      <w:pPr>
-        <w:pStyle w:val="Heading2"/>
-      </w:pPr>
-      <w:r>
-        <w:t xml:space="preserve">13f-operational-ports-infra — Infrastructure Operational Implementations</w:t>
+    <w:p>
+      <w:pPr>
+        <w:pStyle w:val="FirstParagraph"/>
+      </w:pPr>
+      <w:r>
+        <w:t xml:space="preserve"> </w:t>
+      </w:r>
+      <w:r>
+        <w:t xml:space="preserve">## 13f-operational-ports-infra — Infrastructure Operational Implementations</w:t>
       </w:r>
     </w:p>
     <w:p>
@@ -8299,18 +8339,18 @@
           <wp:inline>
             <wp:extent cx="5334000" cy="486621"/>
             <wp:effectExtent b="0" l="0" r="0" t="0"/>
-            <wp:docPr descr="13f-operational-ports-infra" title="" id="251" name="Picture"/>
+            <wp:docPr descr="13f-operational-ports-infra" title="" id="209" name="Picture"/>
             <a:graphic>
               <a:graphicData uri="http://schemas.openxmlformats.org/drawingml/2006/picture">
                 <pic:pic>
                   <pic:nvPicPr>
-                    <pic:cNvPr descr="../architecture/png/13f-operational-ports-infra.png" id="252" name="Picture"/>
+                    <pic:cNvPr descr="file:///E:/g-drive/05_AI/github/BioactivityDataAcquisition2/docs/02-architecture/diagrams/architecture/png/13f-operational-ports-infra.png" id="210" name="Picture"/>
                     <pic:cNvPicPr>
                       <a:picLocks noChangeArrowheads="1" noChangeAspect="1"/>
                     </pic:cNvPicPr>
                   </pic:nvPicPr>
                   <pic:blipFill>
-                    <a:blip r:embed="rId250"/>
+                    <a:blip r:embed="rId208"/>
                     <a:stretch>
                       <a:fillRect/>
                     </a:stretch>
@@ -8345,7 +8385,8 @@
         <w:t xml:space="preserve">13f-operational-ports-infra</w:t>
       </w:r>
     </w:p>
-    <w:bookmarkStart w:id="253" w:name="описание-40"/>
+    <w:bookmarkEnd w:id="211"/>
+    <w:bookmarkStart w:id="212" w:name="описание-40"/>
     <w:p>
       <w:pPr>
         <w:pStyle w:val="Heading3"/>
@@ -8359,11 +8400,11 @@
         <w:pStyle w:val="FirstParagraph"/>
       </w:pPr>
       <w:r>
-        <w:t xml:space="preserve">Диаграмма «Infrastructure Operational Implementations» из architecture-набора детализирует конкретный архитектурный компонент или подсистему BioETL. Она представлена в формате блок-схема потоков (flowchart) и служит ориентиром на уровне детализации «System / Component». В комментариях исходника зафиксирован фокус диаграммы: Independent adapter implementations of operational ports.. На схеме отражено примерно 7 узлов, поэтому её удобно использовать для проверки влияния изменений, согласования интерфейсов и подготовки рефакторинга. Ключевые блоки/подграфы: Infrastructure Implementations. Показательные узлы для быстрого чтения: MemoryLock, LocalCheckpoint, UnifiedLogger, MetricsCollector, OpenTelemetryTracer, CircuitBreaker.</w:t>
-      </w:r>
-    </w:p>
-    <w:bookmarkEnd w:id="253"/>
-    <w:bookmarkStart w:id="254" w:name="метаданные-40"/>
+        <w:t xml:space="preserve">Диаграмма «Infrastructure Operational Implementations» из architecture-набора детализирует конкретный архитектурный компонент или подсистему BioETL. Она представлена в формате блок-схема потоков (flowchart) и служит ориентиром на уровне детализации «System / Component». В комментариях исходника зафиксирован фокус диаграммы: Independent adapter implementations of operational ports.. Схема имеет плотность порядка 7 узлов; её удобно использовать как обзорный архитектурный срез для проверки влияния изменений, согласования интерфейсов и подготовки рефакторинга, но не как исчерпывающий каталог текущей кодовой поверхности. Ключевые блоки/подграфы: Infrastructure Implementations. Показательные узлы для быстрого чтения: MemoryLock, LocalCheckpoint, UnifiedLogger, MetricsCollector, OpenTelemetryTracer, CircuitBreaker.</w:t>
+      </w:r>
+    </w:p>
+    <w:bookmarkEnd w:id="212"/>
+    <w:bookmarkStart w:id="216" w:name="метаданные-40"/>
     <w:p>
       <w:pPr>
         <w:pStyle w:val="Heading3"/>
@@ -8461,15 +8502,15 @@
         <w:br w:type="page"/>
       </w:r>
     </w:p>
-    <w:bookmarkEnd w:id="254"/>
-    <w:bookmarkEnd w:id="255"/>
-    <w:bookmarkStart w:id="261" w:name="cli-interface-layer-cli-interface-layer"/>
-    <w:p>
-      <w:pPr>
-        <w:pStyle w:val="Heading2"/>
-      </w:pPr>
-      <w:r>
-        <w:t xml:space="preserve">14-cli-interface-layer — CLI / Interface Layer</w:t>
+    <w:p>
+      <w:pPr>
+        <w:pStyle w:val="FirstParagraph"/>
+      </w:pPr>
+      <w:r>
+        <w:t xml:space="preserve"> </w:t>
+      </w:r>
+      <w:r>
+        <w:t xml:space="preserve">## 14-cli-interface-layer — CLI / Interface Layer</w:t>
       </w:r>
     </w:p>
     <w:p>
@@ -8481,18 +8522,18 @@
           <wp:inline>
             <wp:extent cx="5334000" cy="1805781"/>
             <wp:effectExtent b="0" l="0" r="0" t="0"/>
-            <wp:docPr descr="14-cli-interface-layer" title="" id="257" name="Picture"/>
+            <wp:docPr descr="14-cli-interface-layer" title="" id="214" name="Picture"/>
             <a:graphic>
               <a:graphicData uri="http://schemas.openxmlformats.org/drawingml/2006/picture">
                 <pic:pic>
                   <pic:nvPicPr>
-                    <pic:cNvPr descr="../architecture/png/14-cli-interface-layer.png" id="258" name="Picture"/>
+                    <pic:cNvPr descr="file:///E:/g-drive/05_AI/github/BioactivityDataAcquisition2/docs/02-architecture/diagrams/architecture/png/14-cli-interface-layer.png" id="215" name="Picture"/>
                     <pic:cNvPicPr>
                       <a:picLocks noChangeArrowheads="1" noChangeAspect="1"/>
                     </pic:cNvPicPr>
                   </pic:nvPicPr>
                   <pic:blipFill>
-                    <a:blip r:embed="rId256"/>
+                    <a:blip r:embed="rId213"/>
                     <a:stretch>
                       <a:fillRect/>
                     </a:stretch>
@@ -8527,7 +8568,8 @@
         <w:t xml:space="preserve">14-cli-interface-layer</w:t>
       </w:r>
     </w:p>
-    <w:bookmarkStart w:id="259" w:name="описание-41"/>
+    <w:bookmarkEnd w:id="216"/>
+    <w:bookmarkStart w:id="217" w:name="описание-41"/>
     <w:p>
       <w:pPr>
         <w:pStyle w:val="Heading3"/>
@@ -8541,11 +8583,11 @@
         <w:pStyle w:val="FirstParagraph"/>
       </w:pPr>
       <w:r>
-        <w:t xml:space="preserve">Диаграмма «CLI / Interface Layer» из architecture-набора детализирует конкретный архитектурный компонент или подсистему BioETL. Она представлена в формате блок-схема потоков (flowchart) и служит ориентиром на уровне детализации «System / Component». В комментариях исходника зафиксирован фокус диаграммы: current CLI routing through registry helpers, narrow composition APIs, and runtime/bootstrap services.. На схеме отражено примерно 17 узлов и 20 связей, поэтому её удобно использовать для проверки влияния изменений, согласования интерфейсов и подготовки рефакторинга. Ключевые блоки/подграфы: interfaces/cli, composition boundary, Created runtime services. Показательные узлы для быстрого чтения: Terminal user, cli.main Click group, registry_helpers fresh explicit PipelineRegistry, run / run-all, run-composite, health / export / quarantine / checkpoint config / lock / maintenance. Примечание: Decomposed into 14a-cli-commands, 14b-cli-routing.</w:t>
-      </w:r>
-    </w:p>
-    <w:bookmarkEnd w:id="259"/>
-    <w:bookmarkStart w:id="260" w:name="метаданные-41"/>
+        <w:t xml:space="preserve">Диаграмма «CLI / Interface Layer» из architecture-набора детализирует конкретный архитектурный компонент или подсистему BioETL. Она представлена в формате блок-схема потоков (flowchart) и служит ориентиром на уровне детализации «System / Component». В комментариях исходника зафиксирован фокус диаграммы: current CLI routing through registry helpers, narrow composition APIs, and runtime/bootstrap services.. Схема имеет плотность порядка 17 узлов и 20 связей; её удобно использовать как обзорный архитектурный срез для проверки влияния изменений, согласования интерфейсов и подготовки рефакторинга, но не как исчерпывающий каталог текущей кодовой поверхности. Ключевые блоки/подграфы: interfaces/cli, composition boundary, Created runtime services. Показательные узлы для быстрого чтения: Terminal user, cli.main Click group, registry_helpers fresh explicit PipelineRegistry, run / run-all, run-composite, health / export / quarantine / checkpoint config / lock / maintenance. Примечание: Decomposed into 14a-cli-commands, 14b-cli-routing.</w:t>
+      </w:r>
+    </w:p>
+    <w:bookmarkEnd w:id="217"/>
+    <w:bookmarkStart w:id="221" w:name="метаданные-41"/>
     <w:p>
       <w:pPr>
         <w:pStyle w:val="Heading3"/>
@@ -8643,15 +8685,15 @@
         <w:br w:type="page"/>
       </w:r>
     </w:p>
-    <w:bookmarkEnd w:id="260"/>
-    <w:bookmarkEnd w:id="261"/>
-    <w:bookmarkStart w:id="267" w:name="a-cli-commands-cli-command-structure"/>
-    <w:p>
-      <w:pPr>
-        <w:pStyle w:val="Heading2"/>
-      </w:pPr>
-      <w:r>
-        <w:t xml:space="preserve">14a-cli-commands — CLI: Command Structure</w:t>
+    <w:p>
+      <w:pPr>
+        <w:pStyle w:val="FirstParagraph"/>
+      </w:pPr>
+      <w:r>
+        <w:t xml:space="preserve"> </w:t>
+      </w:r>
+      <w:r>
+        <w:t xml:space="preserve">## 14a-cli-commands — CLI: Command Structure</w:t>
       </w:r>
     </w:p>
     <w:p>
@@ -8663,18 +8705,18 @@
           <wp:inline>
             <wp:extent cx="5334000" cy="2841355"/>
             <wp:effectExtent b="0" l="0" r="0" t="0"/>
-            <wp:docPr descr="14a-cli-commands" title="" id="263" name="Picture"/>
+            <wp:docPr descr="14a-cli-commands" title="" id="219" name="Picture"/>
             <a:graphic>
               <a:graphicData uri="http://schemas.openxmlformats.org/drawingml/2006/picture">
                 <pic:pic>
                   <pic:nvPicPr>
-                    <pic:cNvPr descr="../architecture/png/14a-cli-commands.png" id="264" name="Picture"/>
+                    <pic:cNvPr descr="file:///E:/g-drive/05_AI/github/BioactivityDataAcquisition2/docs/02-architecture/diagrams/architecture/png/14a-cli-commands.png" id="220" name="Picture"/>
                     <pic:cNvPicPr>
                       <a:picLocks noChangeArrowheads="1" noChangeAspect="1"/>
                     </pic:cNvPicPr>
                   </pic:nvPicPr>
                   <pic:blipFill>
-                    <a:blip r:embed="rId262"/>
+                    <a:blip r:embed="rId218"/>
                     <a:stretch>
                       <a:fillRect/>
                     </a:stretch>
@@ -8709,7 +8751,8 @@
         <w:t xml:space="preserve">14a-cli-commands</w:t>
       </w:r>
     </w:p>
-    <w:bookmarkStart w:id="265" w:name="описание-42"/>
+    <w:bookmarkEnd w:id="221"/>
+    <w:bookmarkStart w:id="222" w:name="описание-42"/>
     <w:p>
       <w:pPr>
         <w:pStyle w:val="Heading3"/>
@@ -8723,11 +8766,11 @@
         <w:pStyle w:val="FirstParagraph"/>
       </w:pPr>
       <w:r>
-        <w:t xml:space="preserve">Диаграмма «CLI: Command Structure» из architecture-набора детализирует конкретный архитектурный компонент или подсистему BioETL. Она представлена в формате блок-схема потоков (flowchart) и служит ориентиром на уровне детализации «System / Component». В комментариях исходника зафиксирован фокус диаграммы: Terminal entrypoint, main group, and the current command families registered in cli.main.. На схеме отражено примерно 12 узлов и 7 связей, поэтому её удобно использовать для проверки влияния изменений, согласования интерфейсов и подготовки рефакторинга. Ключевые блоки/подграфы: cli.main command groups. Показательные узлы для быстрого чтения: Terminal, bioetl group, run / run-all, run-composite, health / export / quarantine checkpoint / config / lock, maintenance vacuum / vacuum-all / archive bronze-cleanup / cleanup-preview.</w:t>
-      </w:r>
-    </w:p>
-    <w:bookmarkEnd w:id="265"/>
-    <w:bookmarkStart w:id="266" w:name="метаданные-42"/>
+        <w:t xml:space="preserve">Диаграмма «CLI: Command Structure» из architecture-набора детализирует конкретный архитектурный компонент или подсистему BioETL. Она представлена в формате блок-схема потоков (flowchart) и служит ориентиром на уровне детализации «System / Component». В комментариях исходника зафиксирован фокус диаграммы: Terminal entrypoint, main group, and the current command families registered in cli.main.. Схема имеет плотность порядка 12 узлов и 7 связей; её удобно использовать как обзорный архитектурный срез для проверки влияния изменений, согласования интерфейсов и подготовки рефакторинга, но не как исчерпывающий каталог текущей кодовой поверхности. Ключевые блоки/подграфы: cli.main command groups. Показательные узлы для быстрого чтения: Terminal, bioetl group, run / run-all, run-composite, health / export / quarantine checkpoint / config / lock, maintenance vacuum / vacuum-all / archive bronze-cleanup / cleanup-preview.</w:t>
+      </w:r>
+    </w:p>
+    <w:bookmarkEnd w:id="222"/>
+    <w:bookmarkStart w:id="226" w:name="метаданные-42"/>
     <w:p>
       <w:pPr>
         <w:pStyle w:val="Heading3"/>
@@ -8825,15 +8868,15 @@
         <w:br w:type="page"/>
       </w:r>
     </w:p>
-    <w:bookmarkEnd w:id="266"/>
-    <w:bookmarkEnd w:id="267"/>
-    <w:bookmarkStart w:id="273" w:name="Xe9a822886457739354820df17f520d5f6238bbb"/>
-    <w:p>
-      <w:pPr>
-        <w:pStyle w:val="Heading2"/>
-      </w:pPr>
-      <w:r>
-        <w:t xml:space="preserve">14b-cli-routing — CLI: Routing to Composition Boundary</w:t>
+    <w:p>
+      <w:pPr>
+        <w:pStyle w:val="FirstParagraph"/>
+      </w:pPr>
+      <w:r>
+        <w:t xml:space="preserve"> </w:t>
+      </w:r>
+      <w:r>
+        <w:t xml:space="preserve">## 14b-cli-routing — CLI: Routing to Composition Boundary</w:t>
       </w:r>
     </w:p>
     <w:p>
@@ -8845,18 +8888,18 @@
           <wp:inline>
             <wp:extent cx="5334000" cy="2458958"/>
             <wp:effectExtent b="0" l="0" r="0" t="0"/>
-            <wp:docPr descr="14b-cli-routing" title="" id="269" name="Picture"/>
+            <wp:docPr descr="14b-cli-routing" title="" id="224" name="Picture"/>
             <a:graphic>
               <a:graphicData uri="http://schemas.openxmlformats.org/drawingml/2006/picture">
                 <pic:pic>
                   <pic:nvPicPr>
-                    <pic:cNvPr descr="../architecture/png/14b-cli-routing.png" id="270" name="Picture"/>
+                    <pic:cNvPr descr="file:///E:/g-drive/05_AI/github/BioactivityDataAcquisition2/docs/02-architecture/diagrams/architecture/png/14b-cli-routing.png" id="225" name="Picture"/>
                     <pic:cNvPicPr>
                       <a:picLocks noChangeArrowheads="1" noChangeAspect="1"/>
                     </pic:cNvPicPr>
                   </pic:nvPicPr>
                   <pic:blipFill>
-                    <a:blip r:embed="rId268"/>
+                    <a:blip r:embed="rId223"/>
                     <a:stretch>
                       <a:fillRect/>
                     </a:stretch>
@@ -8891,7 +8934,8 @@
         <w:t xml:space="preserve">14b-cli-routing</w:t>
       </w:r>
     </w:p>
-    <w:bookmarkStart w:id="271" w:name="описание-43"/>
+    <w:bookmarkEnd w:id="226"/>
+    <w:bookmarkStart w:id="227" w:name="описание-43"/>
     <w:p>
       <w:pPr>
         <w:pStyle w:val="Heading3"/>
@@ -8905,11 +8949,11 @@
         <w:pStyle w:val="FirstParagraph"/>
       </w:pPr>
       <w:r>
-        <w:t xml:space="preserve">Диаграмма «CLI: Routing to Composition Boundary» из architecture-набора детализирует конкретный архитектурный компонент или подсистему BioETL. Она представлена в формате блок-схема потоков (flowchart) и служит ориентиром на уровне детализации «System / Component». В комментариях исходника зафиксирован фокус диаграммы: how command families route through registry helpers and narrow composition APIs, while entrypoints remains a retained broad seam.. На схеме отражено примерно 14 узлов и 15 связей, поэтому её удобно использовать для проверки влияния изменений, согласования интерфейсов и подготовки рефакторинга. Ключевые блоки/подграфы: interfaces/cli helpers, composition boundary, Runtime services. Показательные узлы для быстрого чтения: run / run-all, run-composite, health / export / quarantine checkpoint / config / lock / maintenance, registry_helpers, execution_api, services_api.</w:t>
-      </w:r>
-    </w:p>
-    <w:bookmarkEnd w:id="271"/>
-    <w:bookmarkStart w:id="272" w:name="метаданные-43"/>
+        <w:t xml:space="preserve">Диаграмма «CLI: Routing to Composition Boundary» из architecture-набора детализирует конкретный архитектурный компонент или подсистему BioETL. Она представлена в формате блок-схема потоков (flowchart) и служит ориентиром на уровне детализации «System / Component». В комментариях исходника зафиксирован фокус диаграммы: how command families route through registry helpers and narrow composition APIs, while entrypoints remains a retained broad seam.. Схема имеет плотность порядка 14 узлов и 15 связей; её удобно использовать как обзорный архитектурный срез для проверки влияния изменений, согласования интерфейсов и подготовки рефакторинга, но не как исчерпывающий каталог текущей кодовой поверхности. Ключевые блоки/подграфы: interfaces/cli helpers, composition boundary, Runtime services. Показательные узлы для быстрого чтения: run / run-all, run-composite, health / export / quarantine checkpoint / config / lock / maintenance, registry_helpers, execution_api, services_api.</w:t>
+      </w:r>
+    </w:p>
+    <w:bookmarkEnd w:id="227"/>
+    <w:bookmarkStart w:id="231" w:name="метаданные-43"/>
     <w:p>
       <w:pPr>
         <w:pStyle w:val="Heading3"/>
@@ -9007,15 +9051,15 @@
         <w:br w:type="page"/>
       </w:r>
     </w:p>
-    <w:bookmarkEnd w:id="272"/>
-    <w:bookmarkEnd w:id="273"/>
-    <w:bookmarkStart w:id="279" w:name="Xf90b9f4fdd01877b1383706557d8c1afaa7931c"/>
-    <w:p>
-      <w:pPr>
-        <w:pStyle w:val="Heading2"/>
-      </w:pPr>
-      <w:r>
-        <w:t xml:space="preserve">15-batch-executor-internals — BatchExecutor Internal Architecture</w:t>
+    <w:p>
+      <w:pPr>
+        <w:pStyle w:val="FirstParagraph"/>
+      </w:pPr>
+      <w:r>
+        <w:t xml:space="preserve"> </w:t>
+      </w:r>
+      <w:r>
+        <w:t xml:space="preserve">## 15-batch-executor-internals — BatchExecutor Internal Architecture</w:t>
       </w:r>
     </w:p>
     <w:p>
@@ -9025,20 +9069,20 @@
       <w:r>
         <w:drawing>
           <wp:inline>
-            <wp:extent cx="5334000" cy="3195726"/>
+            <wp:extent cx="5334000" cy="6008972"/>
             <wp:effectExtent b="0" l="0" r="0" t="0"/>
-            <wp:docPr descr="15-batch-executor-internals" title="" id="275" name="Picture"/>
+            <wp:docPr descr="15-batch-executor-internals" title="" id="229" name="Picture"/>
             <a:graphic>
               <a:graphicData uri="http://schemas.openxmlformats.org/drawingml/2006/picture">
                 <pic:pic>
                   <pic:nvPicPr>
-                    <pic:cNvPr descr="../architecture/png/15-batch-executor-internals.png" id="276" name="Picture"/>
+                    <pic:cNvPr descr="file:///E:/g-drive/05_AI/github/BioactivityDataAcquisition2/docs/02-architecture/diagrams/architecture/png/15-batch-executor-internals.png" id="230" name="Picture"/>
                     <pic:cNvPicPr>
                       <a:picLocks noChangeArrowheads="1" noChangeAspect="1"/>
                     </pic:cNvPicPr>
                   </pic:nvPicPr>
                   <pic:blipFill>
-                    <a:blip r:embed="rId274"/>
+                    <a:blip r:embed="rId228"/>
                     <a:stretch>
                       <a:fillRect/>
                     </a:stretch>
@@ -9046,7 +9090,7 @@
                   <pic:spPr bwMode="auto">
                     <a:xfrm>
                       <a:off x="0" y="0"/>
-                      <a:ext cx="5334000" cy="3195726"/>
+                      <a:ext cx="5334000" cy="6008972"/>
                     </a:xfrm>
                     <a:prstGeom prst="rect">
                       <a:avLst/>
@@ -9073,7 +9117,8 @@
         <w:t xml:space="preserve">15-batch-executor-internals</w:t>
       </w:r>
     </w:p>
-    <w:bookmarkStart w:id="277" w:name="описание-44"/>
+    <w:bookmarkEnd w:id="231"/>
+    <w:bookmarkStart w:id="232" w:name="описание-44"/>
     <w:p>
       <w:pPr>
         <w:pStyle w:val="Heading3"/>
@@ -9087,11 +9132,11 @@
         <w:pStyle w:val="FirstParagraph"/>
       </w:pPr>
       <w:r>
-        <w:t xml:space="preserve">Диаграмма «BatchExecutor Internal Architecture» из architecture-набора детализирует конкретный архитектурный компонент или подсистему BioETL. Она представлена в формате блок-схема потоков (flowchart) и служит ориентиром на уровне детализации «System / Component». В комментариях исходника зафиксирован фокус диаграммы: the composition of BatchExecutor and its helper components.. На схеме отражено примерно 15 узлов и 14 связей, поэтому её удобно использовать для проверки влияния изменений, согласования интерфейсов и подготовки рефакторинга. Ключевые блоки/подграфы: BatchExecutor, Composed Helper Components, Data Flow Through Batch, TransformResult, Error Classification. Показательные узлы для быстрого чтения: BatchTracingManager ——– execution spans + start_batch_span() + end_span(), QuarantineManager ——– quarantine failed records + quarantine_record(), CheckpointManager ——– offset checkpoints + load/save/delete, Raw API Records (dict[str, Any]), Silver Records (Delta Lake), TransformResult silver_records + gold_records quarantined_count + errors.</w:t>
-      </w:r>
-    </w:p>
-    <w:bookmarkEnd w:id="277"/>
-    <w:bookmarkStart w:id="278" w:name="метаданные-44"/>
+        <w:t xml:space="preserve">Диаграмма «BatchExecutor Internal Architecture» из architecture-набора детализирует конкретный архитектурный компонент или подсистему BioETL. Она представлена в формате блок-схема потоков (flowchart) и служит ориентиром на уровне детализации «System / Component». В комментариях исходника зафиксирован фокус диаграммы: the composition of BatchExecutor and its helper components.. Схема имеет плотность порядка 15 узлов и 14 связей; её удобно использовать как обзорный архитектурный срез для проверки влияния изменений, согласования интерфейсов и подготовки рефакторинга, но не как исчерпывающий каталог текущей кодовой поверхности. Ключевые блоки/подграфы: BatchExecutor, Composed Helper Components, Data Flow Through Batch, TransformResult, Error Classification. Показательные узлы для быстрого чтения: QuarantineManager ——– quarantine failed records + quarantine_record(), CheckpointManagerService ——– offset checkpoints + load/save/delete, Raw API Records (dict[str, Any]), Silver Records (Delta Lake), TransformResult silver_records + gold_records quarantined_count + errors, ErrorClassifier ——– QUARANTINE / RETRY / FATAL.</w:t>
+      </w:r>
+    </w:p>
+    <w:bookmarkEnd w:id="232"/>
+    <w:bookmarkStart w:id="236" w:name="метаданные-44"/>
     <w:p>
       <w:pPr>
         <w:pStyle w:val="Heading3"/>
@@ -9189,15 +9234,15 @@
         <w:br w:type="page"/>
       </w:r>
     </w:p>
-    <w:bookmarkEnd w:id="278"/>
-    <w:bookmarkEnd w:id="279"/>
-    <w:bookmarkStart w:id="285" w:name="X254ba430444de91dced38f8a9eca28e2178bd57"/>
-    <w:p>
-      <w:pPr>
-        <w:pStyle w:val="Heading2"/>
-      </w:pPr>
-      <w:r>
-        <w:t xml:space="preserve">16-transformer-hierarchy — Transformer Hierarchy</w:t>
+    <w:p>
+      <w:pPr>
+        <w:pStyle w:val="FirstParagraph"/>
+      </w:pPr>
+      <w:r>
+        <w:t xml:space="preserve"> </w:t>
+      </w:r>
+      <w:r>
+        <w:t xml:space="preserve">## 16-transformer-hierarchy — Transformer Hierarchy</w:t>
       </w:r>
     </w:p>
     <w:p>
@@ -9209,18 +9254,18 @@
           <wp:inline>
             <wp:extent cx="5334000" cy="1445768"/>
             <wp:effectExtent b="0" l="0" r="0" t="0"/>
-            <wp:docPr descr="16-transformer-hierarchy" title="" id="281" name="Picture"/>
+            <wp:docPr descr="16-transformer-hierarchy" title="" id="234" name="Picture"/>
             <a:graphic>
               <a:graphicData uri="http://schemas.openxmlformats.org/drawingml/2006/picture">
                 <pic:pic>
                   <pic:nvPicPr>
-                    <pic:cNvPr descr="../architecture/png/16-transformer-hierarchy.png" id="282" name="Picture"/>
+                    <pic:cNvPr descr="file:///E:/g-drive/05_AI/github/BioactivityDataAcquisition2/docs/02-architecture/diagrams/architecture/png/16-transformer-hierarchy.png" id="235" name="Picture"/>
                     <pic:cNvPicPr>
                       <a:picLocks noChangeArrowheads="1" noChangeAspect="1"/>
                     </pic:cNvPicPr>
                   </pic:nvPicPr>
                   <pic:blipFill>
-                    <a:blip r:embed="rId280"/>
+                    <a:blip r:embed="rId233"/>
                     <a:stretch>
                       <a:fillRect/>
                     </a:stretch>
@@ -9255,7 +9300,8 @@
         <w:t xml:space="preserve">16-transformer-hierarchy</w:t>
       </w:r>
     </w:p>
-    <w:bookmarkStart w:id="283" w:name="описание-45"/>
+    <w:bookmarkEnd w:id="236"/>
+    <w:bookmarkStart w:id="237" w:name="описание-45"/>
     <w:p>
       <w:pPr>
         <w:pStyle w:val="Heading3"/>
@@ -9269,11 +9315,11 @@
         <w:pStyle w:val="FirstParagraph"/>
       </w:pPr>
       <w:r>
-        <w:t xml:space="preserve">Диаграмма «Transformer Hierarchy» из architecture-набора детализирует конкретный архитектурный компонент или подсистему BioETL. Она представлена в формате блок-схема потоков (flowchart) и служит ориентиром на уровне детализации «System / Component». В комментариях исходника зафиксирован фокус диаграммы: the Template Method pattern, declarative publication blocks, and provider-specific helper seams.. На схеме отражено примерно 27 узлов и 10 связей, поэтому её удобно использовать для проверки влияния изменений, согласования интерфейсов и подготовки рефакторинга. Ключевые блоки/подграфы: Template Method Pattern, ChEMBL Transformers, Publication Transformers, UniProt Transformers, Other Transformers, Block + Helper Strategy. Показательные узлы для быстрого чтения: BaseChemblTransformer entity_class + primary_id_field _extract_business_data(), ActivityTransformer, PubMedPublicationTransformer cached XML root + extraction_blocks, UniProtProteinTransformer taxonomy/gene/feature extractors, IDMappingTransformer, PubChemCompoundTransformer. Примечание: Decomposed into 16a-transformer-base, 16b-transformer-pub-other.</w:t>
-      </w:r>
-    </w:p>
-    <w:bookmarkEnd w:id="283"/>
-    <w:bookmarkStart w:id="284" w:name="метаданные-45"/>
+        <w:t xml:space="preserve">Диаграмма «Transformer Hierarchy» из architecture-набора детализирует конкретный архитектурный компонент или подсистему BioETL. Она представлена в формате блок-схема потоков (flowchart) и служит ориентиром на уровне детализации «System / Component». В комментариях исходника зафиксирован фокус диаграммы: the Template Method pattern, declarative publication blocks, and provider-specific helper seams.. Схема имеет плотность порядка 27 узлов и 10 связей; её удобно использовать как обзорный архитектурный срез для проверки влияния изменений, согласования интерфейсов и подготовки рефакторинга, но не как исчерпывающий каталог текущей кодовой поверхности. Ключевые блоки/подграфы: Template Method Pattern, ChEMBL Transformers, Publication Transformers, UniProt Transformers, Other Transformers, Block + Helper Strategy. Показательные узлы для быстрого чтения: BaseChemblTransformer entity_class + primary_id_field _extract_business_data(), ActivityTransformer, PubMedPublicationTransformer cached XML root + extraction_blocks, UniProtProteinTransformer taxonomy/gene/feature extractors, IDMappingTransformer, PubChemCompoundTransformer. Примечание: Decomposed into 16a-transformer-base, 16b-transformer-pub-other.</w:t>
+      </w:r>
+    </w:p>
+    <w:bookmarkEnd w:id="237"/>
+    <w:bookmarkStart w:id="241" w:name="метаданные-45"/>
     <w:p>
       <w:pPr>
         <w:pStyle w:val="Heading3"/>
@@ -9371,15 +9417,15 @@
         <w:br w:type="page"/>
       </w:r>
     </w:p>
-    <w:bookmarkEnd w:id="284"/>
-    <w:bookmarkEnd w:id="285"/>
-    <w:bookmarkStart w:id="291" w:name="Xa947d203bd97754d112722e4cb0d0393ad3688a"/>
-    <w:p>
-      <w:pPr>
-        <w:pStyle w:val="Heading2"/>
-      </w:pPr>
-      <w:r>
-        <w:t xml:space="preserve">16a-transformer-base — Base Transformer and ChEMBL Transformers</w:t>
+    <w:p>
+      <w:pPr>
+        <w:pStyle w:val="FirstParagraph"/>
+      </w:pPr>
+      <w:r>
+        <w:t xml:space="preserve"> </w:t>
+      </w:r>
+      <w:r>
+        <w:t xml:space="preserve">## 16a-transformer-base — Base Transformer and ChEMBL Transformers</w:t>
       </w:r>
     </w:p>
     <w:p>
@@ -9391,18 +9437,18 @@
           <wp:inline>
             <wp:extent cx="5334000" cy="729047"/>
             <wp:effectExtent b="0" l="0" r="0" t="0"/>
-            <wp:docPr descr="16a-transformer-base" title="" id="287" name="Picture"/>
+            <wp:docPr descr="16a-transformer-base" title="" id="239" name="Picture"/>
             <a:graphic>
               <a:graphicData uri="http://schemas.openxmlformats.org/drawingml/2006/picture">
                 <pic:pic>
                   <pic:nvPicPr>
-                    <pic:cNvPr descr="../architecture/png/16a-transformer-base.png" id="288" name="Picture"/>
+                    <pic:cNvPr descr="file:///E:/g-drive/05_AI/github/BioactivityDataAcquisition2/docs/02-architecture/diagrams/architecture/png/16a-transformer-base.png" id="240" name="Picture"/>
                     <pic:cNvPicPr>
                       <a:picLocks noChangeArrowheads="1" noChangeAspect="1"/>
                     </pic:cNvPicPr>
                   </pic:nvPicPr>
                   <pic:blipFill>
-                    <a:blip r:embed="rId286"/>
+                    <a:blip r:embed="rId238"/>
                     <a:stretch>
                       <a:fillRect/>
                     </a:stretch>
@@ -9437,7 +9483,8 @@
         <w:t xml:space="preserve">16a-transformer-base</w:t>
       </w:r>
     </w:p>
-    <w:bookmarkStart w:id="289" w:name="описание-46"/>
+    <w:bookmarkEnd w:id="241"/>
+    <w:bookmarkStart w:id="242" w:name="описание-46"/>
     <w:p>
       <w:pPr>
         <w:pStyle w:val="Heading3"/>
@@ -9451,11 +9498,11 @@
         <w:pStyle w:val="FirstParagraph"/>
       </w:pPr>
       <w:r>
-        <w:t xml:space="preserve">Диаграмма «Base Transformer and ChEMBL Transformers» из architecture-набора детализирует конкретный архитектурный компонент или подсистему BioETL. Она представлена в формате блок-схема потоков (flowchart) и служит ориентиром на уровне детализации «System / Component». В комментариях исходника зафиксирован фокус диаграммы: Template Method base class, ChEMBL provider transformers, and extractor root.. На схеме отражено примерно 17 узлов и 2 связей, поэтому её удобно использовать для проверки влияния изменений, согласования интерфейсов и подготовки рефакторинга. Ключевые блоки/подграфы: Template Method Pattern, ChEMBL Transformers, Extractor Root. Показательные узлы для быстрого чтения: BaseTransformer ABC, BaseChemblTransformer, ActivityTransformer, AssayTransformer, ApprovedProductTransformer, MechanismTransformer.</w:t>
-      </w:r>
-    </w:p>
-    <w:bookmarkEnd w:id="289"/>
-    <w:bookmarkStart w:id="290" w:name="метаданные-46"/>
+        <w:t xml:space="preserve">Диаграмма «Base Transformer and ChEMBL Transformers» из architecture-набора детализирует конкретный архитектурный компонент или подсистему BioETL. Она представлена в формате блок-схема потоков (flowchart) и служит ориентиром на уровне детализации «System / Component». В комментариях исходника зафиксирован фокус диаграммы: Template Method base class, ChEMBL provider transformers, and extractor root.. Схема имеет плотность порядка 17 узлов и 2 связей; её удобно использовать как обзорный архитектурный срез для проверки влияния изменений, согласования интерфейсов и подготовки рефакторинга, но не как исчерпывающий каталог текущей кодовой поверхности. Ключевые блоки/подграфы: Template Method Pattern, ChEMBL Transformers, Extractor Root. Показательные узлы для быстрого чтения: BaseTransformer ABC, BaseChemblTransformer, ActivityTransformer, AssayTransformer, ApprovedProductTransformer, MechanismTransformer.</w:t>
+      </w:r>
+    </w:p>
+    <w:bookmarkEnd w:id="242"/>
+    <w:bookmarkStart w:id="246" w:name="метаданные-46"/>
     <w:p>
       <w:pPr>
         <w:pStyle w:val="Heading3"/>
@@ -9553,15 +9600,15 @@
         <w:br w:type="page"/>
       </w:r>
     </w:p>
-    <w:bookmarkEnd w:id="290"/>
-    <w:bookmarkEnd w:id="291"/>
-    <w:bookmarkStart w:id="297" w:name="Xa09305cff5535e5b7dc63cc9ec3c61fbaea00a4"/>
-    <w:p>
-      <w:pPr>
-        <w:pStyle w:val="Heading2"/>
-      </w:pPr>
-      <w:r>
-        <w:t xml:space="preserve">16b-transformer-pub-other — Publication, UniProt, Other Transformers and Blocks</w:t>
+    <w:p>
+      <w:pPr>
+        <w:pStyle w:val="FirstParagraph"/>
+      </w:pPr>
+      <w:r>
+        <w:t xml:space="preserve"> </w:t>
+      </w:r>
+      <w:r>
+        <w:t xml:space="preserve">## 16b-transformer-pub-other — Publication, UniProt, Other Transformers and Blocks</w:t>
       </w:r>
     </w:p>
     <w:p>
@@ -9573,18 +9620,18 @@
           <wp:inline>
             <wp:extent cx="5334000" cy="1676160"/>
             <wp:effectExtent b="0" l="0" r="0" t="0"/>
-            <wp:docPr descr="16b-transformer-pub-other" title="" id="293" name="Picture"/>
+            <wp:docPr descr="16b-transformer-pub-other" title="" id="244" name="Picture"/>
             <a:graphic>
               <a:graphicData uri="http://schemas.openxmlformats.org/drawingml/2006/picture">
                 <pic:pic>
                   <pic:nvPicPr>
-                    <pic:cNvPr descr="../architecture/png/16b-transformer-pub-other.png" id="294" name="Picture"/>
+                    <pic:cNvPr descr="file:///E:/g-drive/05_AI/github/BioactivityDataAcquisition2/docs/02-architecture/diagrams/architecture/png/16b-transformer-pub-other.png" id="245" name="Picture"/>
                     <pic:cNvPicPr>
                       <a:picLocks noChangeArrowheads="1" noChangeAspect="1"/>
                     </pic:cNvPicPr>
                   </pic:nvPicPr>
                   <pic:blipFill>
-                    <a:blip r:embed="rId292"/>
+                    <a:blip r:embed="rId243"/>
                     <a:stretch>
                       <a:fillRect/>
                     </a:stretch>
@@ -9619,7 +9666,8 @@
         <w:t xml:space="preserve">16b-transformer-pub-other</w:t>
       </w:r>
     </w:p>
-    <w:bookmarkStart w:id="295" w:name="описание-47"/>
+    <w:bookmarkEnd w:id="246"/>
+    <w:bookmarkStart w:id="247" w:name="описание-47"/>
     <w:p>
       <w:pPr>
         <w:pStyle w:val="Heading3"/>
@@ -9633,11 +9681,11 @@
         <w:pStyle w:val="FirstParagraph"/>
       </w:pPr>
       <w:r>
-        <w:t xml:space="preserve">Диаграмма «Publication, UniProt, Other Transformers and Blocks» из architecture-набора детализирует конкретный архитектурный компонент или подсистему BioETL. Она представлена в формате блок-схема потоков (flowchart) и служит ориентиром на уровне детализации «System / Component». В комментариях исходника зафиксирован фокус диаграммы: Provider-specific transformers, declarative PubMed blocks, and helper extractor seams.. На схеме отражено примерно 16 узлов и 5 связей, поэтому её удобно использовать для проверки влияния изменений, согласования интерфейсов и подготовки рефакторинга. Ключевые блоки/подграфы: Publication Transformers, UniProt Transformers, Other Transformers, Blocks + Helper Extractors. Показательные узлы для быстрого чтения: BasePublicationTransformer, PubMedPublicationTransformer, CrossRefPublicationTransformer, OpenAlexPublicationTransformer, SemanticScholarPublicationTransformer, UniProtProteinTransformer.</w:t>
-      </w:r>
-    </w:p>
-    <w:bookmarkEnd w:id="295"/>
-    <w:bookmarkStart w:id="296" w:name="метаданные-47"/>
+        <w:t xml:space="preserve">Диаграмма «Publication, UniProt, Other Transformers and Blocks» из architecture-набора детализирует конкретный архитектурный компонент или подсистему BioETL. Она представлена в формате блок-схема потоков (flowchart) и служит ориентиром на уровне детализации «System / Component». В комментариях исходника зафиксирован фокус диаграммы: Provider-specific transformers, declarative PubMed blocks, and helper extractor seams.. Схема имеет плотность порядка 16 узлов и 5 связей; её удобно использовать как обзорный архитектурный срез для проверки влияния изменений, согласования интерфейсов и подготовки рефакторинга, но не как исчерпывающий каталог текущей кодовой поверхности. Ключевые блоки/подграфы: Publication Transformers, UniProt Transformers, Other Transformers, Blocks + Helper Extractors. Показательные узлы для быстрого чтения: BasePublicationTransformer, PubMedPublicationTransformer, CrossRefPublicationTransformer, OpenAlexPublicationTransformer, SemanticScholarPublicationTransformer, UniProtProteinTransformer.</w:t>
+      </w:r>
+    </w:p>
+    <w:bookmarkEnd w:id="247"/>
+    <w:bookmarkStart w:id="251" w:name="метаданные-47"/>
     <w:p>
       <w:pPr>
         <w:pStyle w:val="Heading3"/>
@@ -9735,15 +9783,15 @@
         <w:br w:type="page"/>
       </w:r>
     </w:p>
-    <w:bookmarkEnd w:id="296"/>
-    <w:bookmarkEnd w:id="297"/>
-    <w:bookmarkStart w:id="303" w:name="X183358511d0ac4144e9b2255e0eb534981ec57e"/>
-    <w:p>
-      <w:pPr>
-        <w:pStyle w:val="Heading2"/>
-      </w:pPr>
-      <w:r>
-        <w:t xml:space="preserve">17-security-pii-audit — Security, PII Hashing, and Audit Trail</w:t>
+    <w:p>
+      <w:pPr>
+        <w:pStyle w:val="FirstParagraph"/>
+      </w:pPr>
+      <w:r>
+        <w:t xml:space="preserve"> </w:t>
+      </w:r>
+      <w:r>
+        <w:t xml:space="preserve">## 17-security-pii-audit — Security, PII Hashing, and Audit Trail</w:t>
       </w:r>
     </w:p>
     <w:p>
@@ -9755,18 +9803,18 @@
           <wp:inline>
             <wp:extent cx="5334000" cy="6426403"/>
             <wp:effectExtent b="0" l="0" r="0" t="0"/>
-            <wp:docPr descr="17-security-pii-audit" title="" id="299" name="Picture"/>
+            <wp:docPr descr="17-security-pii-audit" title="" id="249" name="Picture"/>
             <a:graphic>
               <a:graphicData uri="http://schemas.openxmlformats.org/drawingml/2006/picture">
                 <pic:pic>
                   <pic:nvPicPr>
-                    <pic:cNvPr descr="../architecture/png/17-security-pii-audit.png" id="300" name="Picture"/>
+                    <pic:cNvPr descr="file:///E:/g-drive/05_AI/github/BioactivityDataAcquisition2/docs/02-architecture/diagrams/architecture/png/17-security-pii-audit.png" id="250" name="Picture"/>
                     <pic:cNvPicPr>
                       <a:picLocks noChangeArrowheads="1" noChangeAspect="1"/>
                     </pic:cNvPicPr>
                   </pic:nvPicPr>
                   <pic:blipFill>
-                    <a:blip r:embed="rId298"/>
+                    <a:blip r:embed="rId248"/>
                     <a:stretch>
                       <a:fillRect/>
                     </a:stretch>
@@ -9801,7 +9849,8 @@
         <w:t xml:space="preserve">17-security-pii-audit</w:t>
       </w:r>
     </w:p>
-    <w:bookmarkStart w:id="301" w:name="описание-48"/>
+    <w:bookmarkEnd w:id="251"/>
+    <w:bookmarkStart w:id="252" w:name="описание-48"/>
     <w:p>
       <w:pPr>
         <w:pStyle w:val="Heading3"/>
@@ -9815,11 +9864,11 @@
         <w:pStyle w:val="FirstParagraph"/>
       </w:pPr>
       <w:r>
-        <w:t xml:space="preserve">Диаграмма «Security, PII Hashing, and Audit Trail» из architecture-набора детализирует конкретный архитектурный компонент или подсистему BioETL. Она представлена в формате блок-схема потоков (flowchart) и служит ориентиром на уровне детализации «System / Component». В комментариях исходника зафиксирован фокус диаграммы: how PII is handled and audit trail is maintained.. На схеме отражено примерно 16 узлов и 11 связей, поэтому её удобно использовать для проверки влияния изменений, согласования интерфейсов и подготовки рефакторинга. Ключевые блоки/подграфы: Domain Ports, Domain Types, PII Hashing Flow, Infrastructure: PII Hasher, Infrastructure: Audit, Usage in Transformers. Показательные узлы для быстрого чтения: PiiHasherPort (Protocol) ——– + hash(value: str) -&gt; str, AuditPort (Protocol) ——– + log_write(entry) + get_entries(filters), AuditLayer ——– BRONZE / SILVER / GOLD, AuditOperation ——– WRITE / MERGE / APPEND DELETE / OVERWRITE, Raw PII Data (names, emails, affiliations), SHA256(lowercase(value) + salt).</w:t>
-      </w:r>
-    </w:p>
-    <w:bookmarkEnd w:id="301"/>
-    <w:bookmarkStart w:id="302" w:name="метаданные-48"/>
+        <w:t xml:space="preserve">Диаграмма «Security, PII Hashing, and Audit Trail» из architecture-набора детализирует конкретный архитектурный компонент или подсистему BioETL. Она представлена в формате блок-схема потоков (flowchart) и служит ориентиром на уровне детализации «System / Component». В комментариях исходника зафиксирован фокус диаграммы: how PII is handled and audit trail is maintained.. Схема имеет плотность порядка 16 узлов и 11 связей; её удобно использовать как обзорный архитектурный срез для проверки влияния изменений, согласования интерфейсов и подготовки рефакторинга, но не как исчерпывающий каталог текущей кодовой поверхности. Ключевые блоки/подграфы: Domain Ports, Domain Types, PII Hashing Flow, Infrastructure: PII Hasher, Infrastructure: Audit, Usage in Transformers. Показательные узлы для быстрого чтения: PiiHasherPort (Protocol) ——– + hash(value: str) -&gt; str, AuditPort (Protocol) ——– + log_write(entry) + get_entries(filters), AuditLayer ——– BRONZE / SILVER / GOLD, AuditOperation ——– WRITE / MERGE / APPEND DELETE / OVERWRITE, Raw PII Data (names, emails, affiliations), SHA256(lowercase(value) + salt).</w:t>
+      </w:r>
+    </w:p>
+    <w:bookmarkEnd w:id="252"/>
+    <w:bookmarkStart w:id="256" w:name="метаданные-48"/>
     <w:p>
       <w:pPr>
         <w:pStyle w:val="Heading3"/>
@@ -9917,15 +9966,15 @@
         <w:br w:type="page"/>
       </w:r>
     </w:p>
-    <w:bookmarkEnd w:id="302"/>
-    <w:bookmarkEnd w:id="303"/>
-    <w:bookmarkStart w:id="309" w:name="X3db76cf1b79fa34f25910fe90cc73c597a078ec"/>
-    <w:p>
-      <w:pPr>
-        <w:pStyle w:val="Heading2"/>
-      </w:pPr>
-      <w:r>
-        <w:t xml:space="preserve">18-lock-checkpoint-shutdown — Locking, Checkpoint, and Graceful Shutdown</w:t>
+    <w:p>
+      <w:pPr>
+        <w:pStyle w:val="FirstParagraph"/>
+      </w:pPr>
+      <w:r>
+        <w:t xml:space="preserve"> </w:t>
+      </w:r>
+      <w:r>
+        <w:t xml:space="preserve">## 18-lock-checkpoint-shutdown — Locking, Checkpoint, and Graceful Shutdown</w:t>
       </w:r>
     </w:p>
     <w:p>
@@ -9937,18 +9986,18 @@
           <wp:inline>
             <wp:extent cx="5334000" cy="2862146"/>
             <wp:effectExtent b="0" l="0" r="0" t="0"/>
-            <wp:docPr descr="18-lock-checkpoint-shutdown" title="" id="305" name="Picture"/>
+            <wp:docPr descr="18-lock-checkpoint-shutdown" title="" id="254" name="Picture"/>
             <a:graphic>
               <a:graphicData uri="http://schemas.openxmlformats.org/drawingml/2006/picture">
                 <pic:pic>
                   <pic:nvPicPr>
-                    <pic:cNvPr descr="../architecture/png/18-lock-checkpoint-shutdown.png" id="306" name="Picture"/>
+                    <pic:cNvPr descr="file:///E:/g-drive/05_AI/github/BioactivityDataAcquisition2/docs/02-architecture/diagrams/architecture/png/18-lock-checkpoint-shutdown.png" id="255" name="Picture"/>
                     <pic:cNvPicPr>
                       <a:picLocks noChangeArrowheads="1" noChangeAspect="1"/>
                     </pic:cNvPicPr>
                   </pic:nvPicPr>
                   <pic:blipFill>
-                    <a:blip r:embed="rId304"/>
+                    <a:blip r:embed="rId253"/>
                     <a:stretch>
                       <a:fillRect/>
                     </a:stretch>
@@ -9983,7 +10032,8 @@
         <w:t xml:space="preserve">18-lock-checkpoint-shutdown</w:t>
       </w:r>
     </w:p>
-    <w:bookmarkStart w:id="307" w:name="описание-49"/>
+    <w:bookmarkEnd w:id="256"/>
+    <w:bookmarkStart w:id="257" w:name="описание-49"/>
     <w:p>
       <w:pPr>
         <w:pStyle w:val="Heading3"/>
@@ -9997,11 +10047,11 @@
         <w:pStyle w:val="FirstParagraph"/>
       </w:pPr>
       <w:r>
-        <w:t xml:space="preserve">Диаграмма «Locking, Checkpoint, and Graceful Shutdown» из architecture-набора детализирует конкретный архитектурный компонент или подсистему BioETL. Она представлена в формате блок-схема потоков (flowchart) и служит ориентиром на уровне детализации «System / Component». В комментариях исходника зафиксирован фокус диаграммы: Distinguishes general pipeline lifecycle from composite runtime specifics.. На схеме отражено примерно 20 узлов и 16 связей, поэтому её удобно использовать для проверки влияния изменений, согласования интерфейсов и подготовки рефакторинга. Ключевые блоки/подграфы: Domain Ports, Domain Lock Types, Application: LockCoordinator, Application: Checkpoint Services, Application: Shutdown, Infrastructure: MemoryLock. Показательные узлы для быстрого чтения: LockPort (Protocol) acquire/release/heartbeat validate_owner + validate_token, CheckpointPort (Protocol) save/load/list/delete, CompositeCheckpointPort (composite phase checkpoints), ShutdownPort (Protocol), FencingToken + LockNotHeldError, LockCoordinator lock + run_id + shutdown_signal acquire/release/validate. Примечание: Decomposed into 18a-lock-system, 18b-checkpoint-shutdown.</w:t>
-      </w:r>
-    </w:p>
-    <w:bookmarkEnd w:id="307"/>
-    <w:bookmarkStart w:id="308" w:name="метаданные-49"/>
+        <w:t xml:space="preserve">Диаграмма «Locking, Checkpoint, and Graceful Shutdown» из architecture-набора детализирует конкретный архитектурный компонент или подсистему BioETL. Она представлена в формате блок-схема потоков (flowchart) и служит ориентиром на уровне детализации «System / Component». В комментариях исходника зафиксирован фокус диаграммы: Distinguishes general pipeline lifecycle from composite runtime specifics.. Схема имеет плотность порядка 20 узлов и 16 связей; её удобно использовать как обзорный архитектурный срез для проверки влияния изменений, согласования интерфейсов и подготовки рефакторинга, но не как исчерпывающий каталог текущей кодовой поверхности. Ключевые блоки/подграфы: Domain Ports, Domain Lock Types, Application: LockCoordinator, Application: Checkpoint Services, Application: Shutdown, Infrastructure: MemoryLock. Показательные узлы для быстрого чтения: LockPort (Protocol) acquire/release/heartbeat validate_owner + validate_token, CheckpointPort (Protocol) save/load/list/delete, CompositeCheckpointPort (composite phase checkpoints), ShutdownPort (Protocol), FencingToken + LockNotHeldError, LockCoordinator lock + run_id + shutdown_signal acquire/release/validate. Примечание: Decomposed into 18a-lock-system, 18b-checkpoint-shutdown.</w:t>
+      </w:r>
+    </w:p>
+    <w:bookmarkEnd w:id="257"/>
+    <w:bookmarkStart w:id="261" w:name="метаданные-49"/>
     <w:p>
       <w:pPr>
         <w:pStyle w:val="Heading3"/>
@@ -10099,15 +10149,15 @@
         <w:br w:type="page"/>
       </w:r>
     </w:p>
-    <w:bookmarkEnd w:id="308"/>
-    <w:bookmarkEnd w:id="309"/>
-    <w:bookmarkStart w:id="315" w:name="a-lock-system-lock-system"/>
-    <w:p>
-      <w:pPr>
-        <w:pStyle w:val="Heading2"/>
-      </w:pPr>
-      <w:r>
-        <w:t xml:space="preserve">18a-lock-system — Lock System</w:t>
+    <w:p>
+      <w:pPr>
+        <w:pStyle w:val="FirstParagraph"/>
+      </w:pPr>
+      <w:r>
+        <w:t xml:space="preserve"> </w:t>
+      </w:r>
+      <w:r>
+        <w:t xml:space="preserve">## 18a-lock-system — Lock System</w:t>
       </w:r>
     </w:p>
     <w:p>
@@ -10119,18 +10169,18 @@
           <wp:inline>
             <wp:extent cx="5334000" cy="5469037"/>
             <wp:effectExtent b="0" l="0" r="0" t="0"/>
-            <wp:docPr descr="18a-lock-system" title="" id="311" name="Picture"/>
+            <wp:docPr descr="18a-lock-system" title="" id="259" name="Picture"/>
             <a:graphic>
               <a:graphicData uri="http://schemas.openxmlformats.org/drawingml/2006/picture">
                 <pic:pic>
                   <pic:nvPicPr>
-                    <pic:cNvPr descr="../architecture/png/18a-lock-system.png" id="312" name="Picture"/>
+                    <pic:cNvPr descr="file:///E:/g-drive/05_AI/github/BioactivityDataAcquisition2/docs/02-architecture/diagrams/architecture/png/18a-lock-system.png" id="260" name="Picture"/>
                     <pic:cNvPicPr>
                       <a:picLocks noChangeArrowheads="1" noChangeAspect="1"/>
                     </pic:cNvPicPr>
                   </pic:nvPicPr>
                   <pic:blipFill>
-                    <a:blip r:embed="rId310"/>
+                    <a:blip r:embed="rId258"/>
                     <a:stretch>
                       <a:fillRect/>
                     </a:stretch>
@@ -10165,7 +10215,8 @@
         <w:t xml:space="preserve">18a-lock-system</w:t>
       </w:r>
     </w:p>
-    <w:bookmarkStart w:id="313" w:name="описание-50"/>
+    <w:bookmarkEnd w:id="261"/>
+    <w:bookmarkStart w:id="262" w:name="описание-50"/>
     <w:p>
       <w:pPr>
         <w:pStyle w:val="Heading3"/>
@@ -10179,11 +10230,11 @@
         <w:pStyle w:val="FirstParagraph"/>
       </w:pPr>
       <w:r>
-        <w:t xml:space="preserve">Диаграмма «Lock System» из architecture-набора детализирует конкретный архитектурный компонент или подсистему BioETL. Она представлена в формате блок-схема потоков (flowchart) и служит ориентиром на уровне детализации «System / Component». В комментариях исходника зафиксирован фокус диаграммы: Distinguishes the general LockCoordinator path from the composite runner’s direct LockPort path.. На схеме отражено примерно 10 узлов и 7 связей, поэтому её удобно использовать для проверки влияния изменений, согласования интерфейсов и подготовки рефакторинга. Ключевые блоки/подграфы: Domain lock contracts, General pipeline lifecycle, Composite runtime path, Infrastructure. Показательные узлы для быстрого чтения: LockPort, FencingToken, LockNotHeldError, LockCoordinator, HeartbeatTask, CompositePipelineRunnerService.</w:t>
-      </w:r>
-    </w:p>
-    <w:bookmarkEnd w:id="313"/>
-    <w:bookmarkStart w:id="314" w:name="метаданные-50"/>
+        <w:t xml:space="preserve">Диаграмма «Lock System» из architecture-набора детализирует конкретный архитектурный компонент или подсистему BioETL. Она представлена в формате блок-схема потоков (flowchart) и служит ориентиром на уровне детализации «System / Component». В комментариях исходника зафиксирован фокус диаграммы: Distinguishes the general LockCoordinator path from the composite runner’s direct LockPort path.. Схема имеет плотность порядка 10 узлов и 7 связей; её удобно использовать как обзорный архитектурный срез для проверки влияния изменений, согласования интерфейсов и подготовки рефакторинга, но не как исчерпывающий каталог текущей кодовой поверхности. Ключевые блоки/подграфы: Domain lock contracts, General pipeline lifecycle, Composite runtime path, Infrastructure. Показательные узлы для быстрого чтения: LockPort, FencingToken, LockNotHeldError, LockCoordinator, HeartbeatTask, CompositePipelineRunnerService.</w:t>
+      </w:r>
+    </w:p>
+    <w:bookmarkEnd w:id="262"/>
+    <w:bookmarkStart w:id="266" w:name="метаданные-50"/>
     <w:p>
       <w:pPr>
         <w:pStyle w:val="Heading3"/>
@@ -10281,15 +10332,15 @@
         <w:br w:type="page"/>
       </w:r>
     </w:p>
-    <w:bookmarkEnd w:id="314"/>
-    <w:bookmarkEnd w:id="315"/>
-    <w:bookmarkStart w:id="321" w:name="X62fb0e34583a888c3b7b07aec89772e9690ffa0"/>
-    <w:p>
-      <w:pPr>
-        <w:pStyle w:val="Heading2"/>
-      </w:pPr>
-      <w:r>
-        <w:t xml:space="preserve">18b-checkpoint-shutdown — Checkpoint and Shutdown System</w:t>
+    <w:p>
+      <w:pPr>
+        <w:pStyle w:val="FirstParagraph"/>
+      </w:pPr>
+      <w:r>
+        <w:t xml:space="preserve"> </w:t>
+      </w:r>
+      <w:r>
+        <w:t xml:space="preserve">## 18b-checkpoint-shutdown — Checkpoint and Shutdown System</w:t>
       </w:r>
     </w:p>
     <w:p>
@@ -10301,18 +10352,18 @@
           <wp:inline>
             <wp:extent cx="5334000" cy="4307840"/>
             <wp:effectExtent b="0" l="0" r="0" t="0"/>
-            <wp:docPr descr="18b-checkpoint-shutdown" title="" id="317" name="Picture"/>
+            <wp:docPr descr="18b-checkpoint-shutdown" title="" id="264" name="Picture"/>
             <a:graphic>
               <a:graphicData uri="http://schemas.openxmlformats.org/drawingml/2006/picture">
                 <pic:pic>
                   <pic:nvPicPr>
-                    <pic:cNvPr descr="../architecture/png/18b-checkpoint-shutdown.png" id="318" name="Picture"/>
+                    <pic:cNvPr descr="file:///E:/g-drive/05_AI/github/BioactivityDataAcquisition2/docs/02-architecture/diagrams/architecture/png/18b-checkpoint-shutdown.png" id="265" name="Picture"/>
                     <pic:cNvPicPr>
                       <a:picLocks noChangeArrowheads="1" noChangeAspect="1"/>
                     </pic:cNvPicPr>
                   </pic:nvPicPr>
                   <pic:blipFill>
-                    <a:blip r:embed="rId316"/>
+                    <a:blip r:embed="rId263"/>
                     <a:stretch>
                       <a:fillRect/>
                     </a:stretch>
@@ -10347,7 +10398,8 @@
         <w:t xml:space="preserve">18b-checkpoint-shutdown</w:t>
       </w:r>
     </w:p>
-    <w:bookmarkStart w:id="319" w:name="описание-51"/>
+    <w:bookmarkEnd w:id="266"/>
+    <w:bookmarkStart w:id="267" w:name="описание-51"/>
     <w:p>
       <w:pPr>
         <w:pStyle w:val="Heading3"/>
@@ -10361,11 +10413,11 @@
         <w:pStyle w:val="FirstParagraph"/>
       </w:pPr>
       <w:r>
-        <w:t xml:space="preserve">Диаграмма «Checkpoint and Shutdown System» из architecture-набора детализирует конкретный архитектурный компонент или подсистему BioETL. Она представлена в формате блок-схема потоков (flowchart) и служит ориентиром на уровне детализации «System / Component». В комментариях исходника зафиксирован фокус диаграммы: Separates general checkpoint/shutdown services from the composite checkpoint path.. На схеме отражено примерно 12 узлов и 9 связей, поэтому её удобно использовать для проверки влияния изменений, согласования интерфейсов и подготовки рефакторинга. Ключевые блоки/подграфы: Domain ports, Application services, Infrastructure, Lifecycle integration. Показательные узлы для быстрого чтения: CheckpointPort, CompositeCheckpointPort, ShutdownPort, CheckpointManagerService, CompositeCheckpointService, ShutdownSignal / ShutdownReason.</w:t>
-      </w:r>
-    </w:p>
-    <w:bookmarkEnd w:id="319"/>
-    <w:bookmarkStart w:id="320" w:name="метаданные-51"/>
+        <w:t xml:space="preserve">Диаграмма «Checkpoint and Shutdown System» из architecture-набора детализирует конкретный архитектурный компонент или подсистему BioETL. Она представлена в формате блок-схема потоков (flowchart) и служит ориентиром на уровне детализации «System / Component». В комментариях исходника зафиксирован фокус диаграммы: Separates general checkpoint/shutdown services from the composite checkpoint path.. Схема имеет плотность порядка 12 узлов и 9 связей; её удобно использовать как обзорный архитектурный срез для проверки влияния изменений, согласования интерфейсов и подготовки рефакторинга, но не как исчерпывающий каталог текущей кодовой поверхности. Ключевые блоки/подграфы: Domain ports, Application services, Infrastructure, Lifecycle integration. Показательные узлы для быстрого чтения: CheckpointPort, CompositeCheckpointPort, ShutdownPort, CheckpointManagerService, CompositeCheckpointService, ShutdownSignal / ShutdownReason.</w:t>
+      </w:r>
+    </w:p>
+    <w:bookmarkEnd w:id="267"/>
+    <w:bookmarkStart w:id="268" w:name="метаданные-51"/>
     <w:p>
       <w:pPr>
         <w:pStyle w:val="Heading3"/>
@@ -10458,9 +10510,9 @@
         <w:t xml:space="preserve">12</w:t>
       </w:r>
     </w:p>
-    <w:bookmarkEnd w:id="320"/>
-    <w:bookmarkEnd w:id="321"/>
-    <w:bookmarkEnd w:id="322"/>
+    <w:bookmarkEnd w:id="268"/>
+    <w:bookmarkEnd w:id="269"/>
+    <w:bookmarkEnd w:id="270"/>
     <w:sectPr>
       <w:footnotePr>
         <w:numRestart w:val="eachSect"/>

</xml_diff>